<commit_message>
Remove personal notes and debug scratch from the repository
</commit_message>
<xml_diff>
--- a/paper/Fisher-Rao-Curvature-IEEE.docx
+++ b/paper/Fisher-Rao-Curvature-IEEE.docx
@@ -2171,7 +2171,7 @@
         <w:drawing>
           <wp:inline distT="0" distB="0" distL="0" distR="0">
             <wp:extent cx="3108960" cy="2139445"/>
-            <wp:docPr id="3054" name="fig1_curvature.png"/>
+            <wp:docPr id="3057" name="fig1_curvature.png"/>
             <a:graphic xmlns:a="http://schemas.openxmlformats.org/drawingml/2006/main">
               <a:graphicData uri="http://schemas.openxmlformats.org/drawingml/2006/picture">
                 <pic:pic xmlns:pic="http://schemas.openxmlformats.org/drawingml/2006/picture">
@@ -2272,7 +2272,7 @@
         <w:drawing>
           <wp:inline distT="0" distB="0" distL="0" distR="0">
             <wp:extent cx="3108960" cy="3902418"/>
-            <wp:docPr id="4177" name="fig2_split.png"/>
+            <wp:docPr id="825" name="fig2_split.png"/>
             <a:graphic xmlns:a="http://schemas.openxmlformats.org/drawingml/2006/main">
               <a:graphicData uri="http://schemas.openxmlformats.org/drawingml/2006/picture">
                 <pic:pic xmlns:pic="http://schemas.openxmlformats.org/drawingml/2006/picture">
@@ -2760,16 +2760,16 @@
         <w:tblLayout w:type="fixed"/>
       </w:tblPr>
       <w:tblGrid>
-        <w:gridCol w:w="489"/>
-        <w:gridCol w:w="489"/>
-        <w:gridCol w:w="489"/>
-        <w:gridCol w:w="489"/>
-        <w:gridCol w:w="489"/>
-        <w:gridCol w:w="489"/>
-        <w:gridCol w:w="489"/>
-        <w:gridCol w:w="489"/>
-        <w:gridCol w:w="489"/>
-        <w:gridCol w:w="489"/>
+        <w:gridCol w:w="961"/>
+        <w:gridCol w:w="437"/>
+        <w:gridCol w:w="437"/>
+        <w:gridCol w:w="437"/>
+        <w:gridCol w:w="437"/>
+        <w:gridCol w:w="437"/>
+        <w:gridCol w:w="437"/>
+        <w:gridCol w:w="437"/>
+        <w:gridCol w:w="437"/>
+        <w:gridCol w:w="437"/>
       </w:tblGrid>
       <w:tr>
         <w:trPr>
@@ -2778,7 +2778,7 @@
         </w:trPr>
         <w:tc>
           <w:tcPr>
-            <w:tcW w:w="489" w:type="dxa"/>
+            <w:tcW w:w="961" w:type="dxa"/>
             <w:vAlign w:val="center"/>
           </w:tcPr>
           <w:p>
@@ -2794,7 +2794,7 @@
         </w:tc>
         <w:tc>
           <w:tcPr>
-            <w:tcW w:w="489" w:type="dxa"/>
+            <w:tcW w:w="437" w:type="dxa"/>
             <w:vAlign w:val="center"/>
           </w:tcPr>
           <w:p>
@@ -2810,7 +2810,7 @@
         </w:tc>
         <w:tc>
           <w:tcPr>
-            <w:tcW w:w="489" w:type="dxa"/>
+            <w:tcW w:w="437" w:type="dxa"/>
             <w:vAlign w:val="center"/>
           </w:tcPr>
           <w:p>
@@ -2826,7 +2826,7 @@
         </w:tc>
         <w:tc>
           <w:tcPr>
-            <w:tcW w:w="489" w:type="dxa"/>
+            <w:tcW w:w="437" w:type="dxa"/>
             <w:vAlign w:val="center"/>
           </w:tcPr>
           <w:p>
@@ -2842,7 +2842,7 @@
         </w:tc>
         <w:tc>
           <w:tcPr>
-            <w:tcW w:w="489" w:type="dxa"/>
+            <w:tcW w:w="437" w:type="dxa"/>
             <w:vAlign w:val="center"/>
           </w:tcPr>
           <w:p>
@@ -2858,7 +2858,7 @@
         </w:tc>
         <w:tc>
           <w:tcPr>
-            <w:tcW w:w="489" w:type="dxa"/>
+            <w:tcW w:w="437" w:type="dxa"/>
             <w:vAlign w:val="center"/>
           </w:tcPr>
           <w:p>
@@ -2874,7 +2874,7 @@
         </w:tc>
         <w:tc>
           <w:tcPr>
-            <w:tcW w:w="489" w:type="dxa"/>
+            <w:tcW w:w="437" w:type="dxa"/>
             <w:vAlign w:val="center"/>
           </w:tcPr>
           <w:p>
@@ -2890,7 +2890,7 @@
         </w:tc>
         <w:tc>
           <w:tcPr>
-            <w:tcW w:w="489" w:type="dxa"/>
+            <w:tcW w:w="437" w:type="dxa"/>
             <w:vAlign w:val="center"/>
           </w:tcPr>
           <w:p>
@@ -2906,7 +2906,7 @@
         </w:tc>
         <w:tc>
           <w:tcPr>
-            <w:tcW w:w="489" w:type="dxa"/>
+            <w:tcW w:w="437" w:type="dxa"/>
             <w:vAlign w:val="center"/>
           </w:tcPr>
           <w:p>
@@ -2922,7 +2922,7 @@
         </w:tc>
         <w:tc>
           <w:tcPr>
-            <w:tcW w:w="489" w:type="dxa"/>
+            <w:tcW w:w="437" w:type="dxa"/>
             <w:vAlign w:val="center"/>
           </w:tcPr>
           <w:p>
@@ -2943,7 +2943,7 @@
         </w:trPr>
         <w:tc>
           <w:tcPr>
-            <w:tcW w:w="489" w:type="dxa"/>
+            <w:tcW w:w="961" w:type="dxa"/>
             <w:vAlign w:val="center"/>
           </w:tcPr>
           <w:p>
@@ -2959,7 +2959,7 @@
         </w:tc>
         <w:tc>
           <w:tcPr>
-            <w:tcW w:w="489" w:type="dxa"/>
+            <w:tcW w:w="437" w:type="dxa"/>
             <w:vAlign w:val="center"/>
           </w:tcPr>
           <w:p>
@@ -2975,7 +2975,7 @@
         </w:tc>
         <w:tc>
           <w:tcPr>
-            <w:tcW w:w="489" w:type="dxa"/>
+            <w:tcW w:w="437" w:type="dxa"/>
             <w:vAlign w:val="center"/>
           </w:tcPr>
           <w:p>
@@ -2991,7 +2991,7 @@
         </w:tc>
         <w:tc>
           <w:tcPr>
-            <w:tcW w:w="489" w:type="dxa"/>
+            <w:tcW w:w="437" w:type="dxa"/>
             <w:vAlign w:val="center"/>
           </w:tcPr>
           <w:p>
@@ -3010,7 +3010,7 @@
         </w:tc>
         <w:tc>
           <w:tcPr>
-            <w:tcW w:w="489" w:type="dxa"/>
+            <w:tcW w:w="437" w:type="dxa"/>
             <w:vAlign w:val="center"/>
           </w:tcPr>
           <w:p>
@@ -3026,7 +3026,7 @@
         </w:tc>
         <w:tc>
           <w:tcPr>
-            <w:tcW w:w="489" w:type="dxa"/>
+            <w:tcW w:w="437" w:type="dxa"/>
             <w:vAlign w:val="center"/>
           </w:tcPr>
           <w:p>
@@ -3042,7 +3042,7 @@
         </w:tc>
         <w:tc>
           <w:tcPr>
-            <w:tcW w:w="489" w:type="dxa"/>
+            <w:tcW w:w="437" w:type="dxa"/>
             <w:vAlign w:val="center"/>
           </w:tcPr>
           <w:p>
@@ -3058,7 +3058,7 @@
         </w:tc>
         <w:tc>
           <w:tcPr>
-            <w:tcW w:w="489" w:type="dxa"/>
+            <w:tcW w:w="437" w:type="dxa"/>
             <w:vAlign w:val="center"/>
           </w:tcPr>
           <w:p>
@@ -3074,7 +3074,7 @@
         </w:tc>
         <w:tc>
           <w:tcPr>
-            <w:tcW w:w="489" w:type="dxa"/>
+            <w:tcW w:w="437" w:type="dxa"/>
             <w:vAlign w:val="center"/>
           </w:tcPr>
           <w:p>
@@ -3090,7 +3090,7 @@
         </w:tc>
         <w:tc>
           <w:tcPr>
-            <w:tcW w:w="489" w:type="dxa"/>
+            <w:tcW w:w="437" w:type="dxa"/>
             <w:vAlign w:val="center"/>
           </w:tcPr>
           <w:p>
@@ -3111,7 +3111,7 @@
         </w:trPr>
         <w:tc>
           <w:tcPr>
-            <w:tcW w:w="489" w:type="dxa"/>
+            <w:tcW w:w="961" w:type="dxa"/>
             <w:vAlign w:val="center"/>
           </w:tcPr>
           <w:p>
@@ -3121,13 +3121,13 @@
               <w:spacing w:before="20" w:after="20"/>
             </w:pPr>
             <w:r>
-              <w:t xml:space="preserve">scrambled</w:t>
-            </w:r>
-          </w:p>
-        </w:tc>
-        <w:tc>
-          <w:tcPr>
-            <w:tcW w:w="489" w:type="dxa"/>
+              <w:t xml:space="preserve">scram.</w:t>
+            </w:r>
+          </w:p>
+        </w:tc>
+        <w:tc>
+          <w:tcPr>
+            <w:tcW w:w="437" w:type="dxa"/>
             <w:vAlign w:val="center"/>
           </w:tcPr>
           <w:p>
@@ -3143,7 +3143,7 @@
         </w:tc>
         <w:tc>
           <w:tcPr>
-            <w:tcW w:w="489" w:type="dxa"/>
+            <w:tcW w:w="437" w:type="dxa"/>
             <w:vAlign w:val="center"/>
           </w:tcPr>
           <w:p>
@@ -3159,7 +3159,7 @@
         </w:tc>
         <w:tc>
           <w:tcPr>
-            <w:tcW w:w="489" w:type="dxa"/>
+            <w:tcW w:w="437" w:type="dxa"/>
             <w:vAlign w:val="center"/>
           </w:tcPr>
           <w:p>
@@ -3178,7 +3178,7 @@
         </w:tc>
         <w:tc>
           <w:tcPr>
-            <w:tcW w:w="489" w:type="dxa"/>
+            <w:tcW w:w="437" w:type="dxa"/>
             <w:vAlign w:val="center"/>
           </w:tcPr>
           <w:p>
@@ -3194,7 +3194,7 @@
         </w:tc>
         <w:tc>
           <w:tcPr>
-            <w:tcW w:w="489" w:type="dxa"/>
+            <w:tcW w:w="437" w:type="dxa"/>
             <w:vAlign w:val="center"/>
           </w:tcPr>
           <w:p>
@@ -3210,7 +3210,7 @@
         </w:tc>
         <w:tc>
           <w:tcPr>
-            <w:tcW w:w="489" w:type="dxa"/>
+            <w:tcW w:w="437" w:type="dxa"/>
             <w:vAlign w:val="center"/>
           </w:tcPr>
           <w:p>
@@ -3226,7 +3226,7 @@
         </w:tc>
         <w:tc>
           <w:tcPr>
-            <w:tcW w:w="489" w:type="dxa"/>
+            <w:tcW w:w="437" w:type="dxa"/>
             <w:vAlign w:val="center"/>
           </w:tcPr>
           <w:p>
@@ -3242,7 +3242,7 @@
         </w:tc>
         <w:tc>
           <w:tcPr>
-            <w:tcW w:w="489" w:type="dxa"/>
+            <w:tcW w:w="437" w:type="dxa"/>
             <w:vAlign w:val="center"/>
           </w:tcPr>
           <w:p>
@@ -3258,7 +3258,7 @@
         </w:tc>
         <w:tc>
           <w:tcPr>
-            <w:tcW w:w="489" w:type="dxa"/>
+            <w:tcW w:w="437" w:type="dxa"/>
             <w:vAlign w:val="center"/>
           </w:tcPr>
           <w:p>
@@ -3359,16 +3359,16 @@
         <w:tblLayout w:type="fixed"/>
       </w:tblPr>
       <w:tblGrid>
-        <w:gridCol w:w="489"/>
-        <w:gridCol w:w="489"/>
-        <w:gridCol w:w="489"/>
-        <w:gridCol w:w="489"/>
-        <w:gridCol w:w="489"/>
-        <w:gridCol w:w="489"/>
-        <w:gridCol w:w="489"/>
-        <w:gridCol w:w="489"/>
-        <w:gridCol w:w="489"/>
-        <w:gridCol w:w="489"/>
+        <w:gridCol w:w="961"/>
+        <w:gridCol w:w="437"/>
+        <w:gridCol w:w="437"/>
+        <w:gridCol w:w="437"/>
+        <w:gridCol w:w="437"/>
+        <w:gridCol w:w="437"/>
+        <w:gridCol w:w="437"/>
+        <w:gridCol w:w="437"/>
+        <w:gridCol w:w="437"/>
+        <w:gridCol w:w="437"/>
       </w:tblGrid>
       <w:tr>
         <w:trPr>
@@ -3377,7 +3377,7 @@
         </w:trPr>
         <w:tc>
           <w:tcPr>
-            <w:tcW w:w="489" w:type="dxa"/>
+            <w:tcW w:w="961" w:type="dxa"/>
             <w:vAlign w:val="center"/>
           </w:tcPr>
           <w:p>
@@ -3393,7 +3393,7 @@
         </w:tc>
         <w:tc>
           <w:tcPr>
-            <w:tcW w:w="489" w:type="dxa"/>
+            <w:tcW w:w="437" w:type="dxa"/>
             <w:vAlign w:val="center"/>
           </w:tcPr>
           <w:p>
@@ -3409,7 +3409,7 @@
         </w:tc>
         <w:tc>
           <w:tcPr>
-            <w:tcW w:w="489" w:type="dxa"/>
+            <w:tcW w:w="437" w:type="dxa"/>
             <w:vAlign w:val="center"/>
           </w:tcPr>
           <w:p>
@@ -3425,7 +3425,7 @@
         </w:tc>
         <w:tc>
           <w:tcPr>
-            <w:tcW w:w="489" w:type="dxa"/>
+            <w:tcW w:w="437" w:type="dxa"/>
             <w:vAlign w:val="center"/>
           </w:tcPr>
           <w:p>
@@ -3441,7 +3441,7 @@
         </w:tc>
         <w:tc>
           <w:tcPr>
-            <w:tcW w:w="489" w:type="dxa"/>
+            <w:tcW w:w="437" w:type="dxa"/>
             <w:vAlign w:val="center"/>
           </w:tcPr>
           <w:p>
@@ -3457,7 +3457,7 @@
         </w:tc>
         <w:tc>
           <w:tcPr>
-            <w:tcW w:w="489" w:type="dxa"/>
+            <w:tcW w:w="437" w:type="dxa"/>
             <w:vAlign w:val="center"/>
           </w:tcPr>
           <w:p>
@@ -3473,7 +3473,7 @@
         </w:tc>
         <w:tc>
           <w:tcPr>
-            <w:tcW w:w="489" w:type="dxa"/>
+            <w:tcW w:w="437" w:type="dxa"/>
             <w:vAlign w:val="center"/>
           </w:tcPr>
           <w:p>
@@ -3489,7 +3489,7 @@
         </w:tc>
         <w:tc>
           <w:tcPr>
-            <w:tcW w:w="489" w:type="dxa"/>
+            <w:tcW w:w="437" w:type="dxa"/>
             <w:vAlign w:val="center"/>
           </w:tcPr>
           <w:p>
@@ -3505,7 +3505,7 @@
         </w:tc>
         <w:tc>
           <w:tcPr>
-            <w:tcW w:w="489" w:type="dxa"/>
+            <w:tcW w:w="437" w:type="dxa"/>
             <w:vAlign w:val="center"/>
           </w:tcPr>
           <w:p>
@@ -3521,7 +3521,7 @@
         </w:tc>
         <w:tc>
           <w:tcPr>
-            <w:tcW w:w="489" w:type="dxa"/>
+            <w:tcW w:w="437" w:type="dxa"/>
             <w:vAlign w:val="center"/>
           </w:tcPr>
           <w:p>
@@ -3542,7 +3542,7 @@
         </w:trPr>
         <w:tc>
           <w:tcPr>
-            <w:tcW w:w="489" w:type="dxa"/>
+            <w:tcW w:w="961" w:type="dxa"/>
             <w:vAlign w:val="center"/>
           </w:tcPr>
           <w:p>
@@ -3558,145 +3558,145 @@
         </w:tc>
         <w:tc>
           <w:tcPr>
-            <w:tcW w:w="489" w:type="dxa"/>
-            <w:vAlign w:val="center"/>
-          </w:tcPr>
-          <w:p>
-            <w:pPr>
-              <w:pStyle w:val="tablecopy"/>
-              <w:jc w:val="center"/>
-              <w:spacing w:before="20" w:after="20"/>
-            </w:pPr>
-            <w:r>
-              <w:t xml:space="preserve">2.3 %</w:t>
-            </w:r>
-          </w:p>
-        </w:tc>
-        <w:tc>
-          <w:tcPr>
-            <w:tcW w:w="489" w:type="dxa"/>
-            <w:vAlign w:val="center"/>
-          </w:tcPr>
-          <w:p>
-            <w:pPr>
-              <w:pStyle w:val="tablecopy"/>
-              <w:jc w:val="center"/>
-              <w:spacing w:before="20" w:after="20"/>
-            </w:pPr>
-            <w:r>
-              <w:t xml:space="preserve">2.3 %</w:t>
-            </w:r>
-          </w:p>
-        </w:tc>
-        <w:tc>
-          <w:tcPr>
-            <w:tcW w:w="489" w:type="dxa"/>
-            <w:vAlign w:val="center"/>
-          </w:tcPr>
-          <w:p>
-            <w:pPr>
-              <w:pStyle w:val="tablecopy"/>
-              <w:jc w:val="center"/>
-              <w:spacing w:before="20" w:after="20"/>
-            </w:pPr>
-            <w:r>
-              <w:t xml:space="preserve">1.5 %</w:t>
-            </w:r>
-          </w:p>
-        </w:tc>
-        <w:tc>
-          <w:tcPr>
-            <w:tcW w:w="489" w:type="dxa"/>
-            <w:vAlign w:val="center"/>
-          </w:tcPr>
-          <w:p>
-            <w:pPr>
-              <w:pStyle w:val="tablecopy"/>
-              <w:jc w:val="center"/>
-              <w:spacing w:before="20" w:after="20"/>
-            </w:pPr>
-            <w:r>
-              <w:t xml:space="preserve">1.7 %</w:t>
-            </w:r>
-          </w:p>
-        </w:tc>
-        <w:tc>
-          <w:tcPr>
-            <w:tcW w:w="489" w:type="dxa"/>
-            <w:vAlign w:val="center"/>
-          </w:tcPr>
-          <w:p>
-            <w:pPr>
-              <w:pStyle w:val="tablecopy"/>
-              <w:jc w:val="center"/>
-              <w:spacing w:before="20" w:after="20"/>
-            </w:pPr>
-            <w:r>
-              <w:t xml:space="preserve">−5.3 %</w:t>
-            </w:r>
-          </w:p>
-        </w:tc>
-        <w:tc>
-          <w:tcPr>
-            <w:tcW w:w="489" w:type="dxa"/>
-            <w:vAlign w:val="center"/>
-          </w:tcPr>
-          <w:p>
-            <w:pPr>
-              <w:pStyle w:val="tablecopy"/>
-              <w:jc w:val="center"/>
-              <w:spacing w:before="20" w:after="20"/>
-            </w:pPr>
-            <w:r>
-              <w:t xml:space="preserve">−95.5 %</w:t>
-            </w:r>
-          </w:p>
-        </w:tc>
-        <w:tc>
-          <w:tcPr>
-            <w:tcW w:w="489" w:type="dxa"/>
-            <w:vAlign w:val="center"/>
-          </w:tcPr>
-          <w:p>
-            <w:pPr>
-              <w:pStyle w:val="tablecopy"/>
-              <w:jc w:val="center"/>
-              <w:spacing w:before="20" w:after="20"/>
-            </w:pPr>
-            <w:r>
-              <w:t xml:space="preserve">7.0 %</w:t>
-            </w:r>
-          </w:p>
-        </w:tc>
-        <w:tc>
-          <w:tcPr>
-            <w:tcW w:w="489" w:type="dxa"/>
-            <w:vAlign w:val="center"/>
-          </w:tcPr>
-          <w:p>
-            <w:pPr>
-              <w:pStyle w:val="tablecopy"/>
-              <w:jc w:val="center"/>
-              <w:spacing w:before="20" w:after="20"/>
-            </w:pPr>
-            <w:r>
-              <w:t xml:space="preserve">25.8 %</w:t>
-            </w:r>
-          </w:p>
-        </w:tc>
-        <w:tc>
-          <w:tcPr>
-            <w:tcW w:w="489" w:type="dxa"/>
-            <w:vAlign w:val="center"/>
-          </w:tcPr>
-          <w:p>
-            <w:pPr>
-              <w:pStyle w:val="tablecopy"/>
-              <w:jc w:val="center"/>
-              <w:spacing w:before="20" w:after="20"/>
-            </w:pPr>
-            <w:r>
-              <w:t xml:space="preserve">61.4 %</w:t>
+            <w:tcW w:w="437" w:type="dxa"/>
+            <w:vAlign w:val="center"/>
+          </w:tcPr>
+          <w:p>
+            <w:pPr>
+              <w:pStyle w:val="tablecopy"/>
+              <w:jc w:val="center"/>
+              <w:spacing w:before="20" w:after="20"/>
+            </w:pPr>
+            <w:r>
+              <w:t xml:space="preserve">2.3%</w:t>
+            </w:r>
+          </w:p>
+        </w:tc>
+        <w:tc>
+          <w:tcPr>
+            <w:tcW w:w="437" w:type="dxa"/>
+            <w:vAlign w:val="center"/>
+          </w:tcPr>
+          <w:p>
+            <w:pPr>
+              <w:pStyle w:val="tablecopy"/>
+              <w:jc w:val="center"/>
+              <w:spacing w:before="20" w:after="20"/>
+            </w:pPr>
+            <w:r>
+              <w:t xml:space="preserve">2.3%</w:t>
+            </w:r>
+          </w:p>
+        </w:tc>
+        <w:tc>
+          <w:tcPr>
+            <w:tcW w:w="437" w:type="dxa"/>
+            <w:vAlign w:val="center"/>
+          </w:tcPr>
+          <w:p>
+            <w:pPr>
+              <w:pStyle w:val="tablecopy"/>
+              <w:jc w:val="center"/>
+              <w:spacing w:before="20" w:after="20"/>
+            </w:pPr>
+            <w:r>
+              <w:t xml:space="preserve">1.5%</w:t>
+            </w:r>
+          </w:p>
+        </w:tc>
+        <w:tc>
+          <w:tcPr>
+            <w:tcW w:w="437" w:type="dxa"/>
+            <w:vAlign w:val="center"/>
+          </w:tcPr>
+          <w:p>
+            <w:pPr>
+              <w:pStyle w:val="tablecopy"/>
+              <w:jc w:val="center"/>
+              <w:spacing w:before="20" w:after="20"/>
+            </w:pPr>
+            <w:r>
+              <w:t xml:space="preserve">1.7%</w:t>
+            </w:r>
+          </w:p>
+        </w:tc>
+        <w:tc>
+          <w:tcPr>
+            <w:tcW w:w="437" w:type="dxa"/>
+            <w:vAlign w:val="center"/>
+          </w:tcPr>
+          <w:p>
+            <w:pPr>
+              <w:pStyle w:val="tablecopy"/>
+              <w:jc w:val="center"/>
+              <w:spacing w:before="20" w:after="20"/>
+            </w:pPr>
+            <w:r>
+              <w:t xml:space="preserve">−5.3%</w:t>
+            </w:r>
+          </w:p>
+        </w:tc>
+        <w:tc>
+          <w:tcPr>
+            <w:tcW w:w="437" w:type="dxa"/>
+            <w:vAlign w:val="center"/>
+          </w:tcPr>
+          <w:p>
+            <w:pPr>
+              <w:pStyle w:val="tablecopy"/>
+              <w:jc w:val="center"/>
+              <w:spacing w:before="20" w:after="20"/>
+            </w:pPr>
+            <w:r>
+              <w:t xml:space="preserve">−95.5%</w:t>
+            </w:r>
+          </w:p>
+        </w:tc>
+        <w:tc>
+          <w:tcPr>
+            <w:tcW w:w="437" w:type="dxa"/>
+            <w:vAlign w:val="center"/>
+          </w:tcPr>
+          <w:p>
+            <w:pPr>
+              <w:pStyle w:val="tablecopy"/>
+              <w:jc w:val="center"/>
+              <w:spacing w:before="20" w:after="20"/>
+            </w:pPr>
+            <w:r>
+              <w:t xml:space="preserve">7.0%</w:t>
+            </w:r>
+          </w:p>
+        </w:tc>
+        <w:tc>
+          <w:tcPr>
+            <w:tcW w:w="437" w:type="dxa"/>
+            <w:vAlign w:val="center"/>
+          </w:tcPr>
+          <w:p>
+            <w:pPr>
+              <w:pStyle w:val="tablecopy"/>
+              <w:jc w:val="center"/>
+              <w:spacing w:before="20" w:after="20"/>
+            </w:pPr>
+            <w:r>
+              <w:t xml:space="preserve">25.8%</w:t>
+            </w:r>
+          </w:p>
+        </w:tc>
+        <w:tc>
+          <w:tcPr>
+            <w:tcW w:w="437" w:type="dxa"/>
+            <w:vAlign w:val="center"/>
+          </w:tcPr>
+          <w:p>
+            <w:pPr>
+              <w:pStyle w:val="tablecopy"/>
+              <w:jc w:val="center"/>
+              <w:spacing w:before="20" w:after="20"/>
+            </w:pPr>
+            <w:r>
+              <w:t xml:space="preserve">61.4%</w:t>
             </w:r>
           </w:p>
         </w:tc>
@@ -3707,7 +3707,7 @@
         </w:trPr>
         <w:tc>
           <w:tcPr>
-            <w:tcW w:w="489" w:type="dxa"/>
+            <w:tcW w:w="961" w:type="dxa"/>
             <w:vAlign w:val="center"/>
           </w:tcPr>
           <w:p>
@@ -3717,13 +3717,13 @@
               <w:spacing w:before="20" w:after="20"/>
             </w:pPr>
             <w:r>
-              <w:t xml:space="preserve">sign test</w:t>
-            </w:r>
-          </w:p>
-        </w:tc>
-        <w:tc>
-          <w:tcPr>
-            <w:tcW w:w="489" w:type="dxa"/>
+              <w:t xml:space="preserve">sign</w:t>
+            </w:r>
+          </w:p>
+        </w:tc>
+        <w:tc>
+          <w:tcPr>
+            <w:tcW w:w="437" w:type="dxa"/>
             <w:vAlign w:val="center"/>
           </w:tcPr>
           <w:p>
@@ -3739,7 +3739,7 @@
         </w:tc>
         <w:tc>
           <w:tcPr>
-            <w:tcW w:w="489" w:type="dxa"/>
+            <w:tcW w:w="437" w:type="dxa"/>
             <w:vAlign w:val="center"/>
           </w:tcPr>
           <w:p>
@@ -3755,7 +3755,7 @@
         </w:tc>
         <w:tc>
           <w:tcPr>
-            <w:tcW w:w="489" w:type="dxa"/>
+            <w:tcW w:w="437" w:type="dxa"/>
             <w:vAlign w:val="center"/>
           </w:tcPr>
           <w:p>
@@ -3771,7 +3771,7 @@
         </w:tc>
         <w:tc>
           <w:tcPr>
-            <w:tcW w:w="489" w:type="dxa"/>
+            <w:tcW w:w="437" w:type="dxa"/>
             <w:vAlign w:val="center"/>
           </w:tcPr>
           <w:p>
@@ -3787,7 +3787,7 @@
         </w:tc>
         <w:tc>
           <w:tcPr>
-            <w:tcW w:w="489" w:type="dxa"/>
+            <w:tcW w:w="437" w:type="dxa"/>
             <w:vAlign w:val="center"/>
           </w:tcPr>
           <w:p>
@@ -3803,7 +3803,7 @@
         </w:tc>
         <w:tc>
           <w:tcPr>
-            <w:tcW w:w="489" w:type="dxa"/>
+            <w:tcW w:w="437" w:type="dxa"/>
             <w:vAlign w:val="center"/>
           </w:tcPr>
           <w:p>
@@ -3819,7 +3819,7 @@
         </w:tc>
         <w:tc>
           <w:tcPr>
-            <w:tcW w:w="489" w:type="dxa"/>
+            <w:tcW w:w="437" w:type="dxa"/>
             <w:vAlign w:val="center"/>
           </w:tcPr>
           <w:p>
@@ -3835,7 +3835,7 @@
         </w:tc>
         <w:tc>
           <w:tcPr>
-            <w:tcW w:w="489" w:type="dxa"/>
+            <w:tcW w:w="437" w:type="dxa"/>
             <w:vAlign w:val="center"/>
           </w:tcPr>
           <w:p>
@@ -3851,7 +3851,7 @@
         </w:tc>
         <w:tc>
           <w:tcPr>
-            <w:tcW w:w="489" w:type="dxa"/>
+            <w:tcW w:w="437" w:type="dxa"/>
             <w:vAlign w:val="center"/>
           </w:tcPr>
           <w:p>
@@ -3946,7 +3946,7 @@
         <w:drawing>
           <wp:inline distT="0" distB="0" distL="0" distR="0">
             <wp:extent cx="3108960" cy="3223925"/>
-            <wp:docPr id="5702" name="fig3_threshold.png"/>
+            <wp:docPr id="3678" name="fig3_threshold.png"/>
             <a:graphic xmlns:a="http://schemas.openxmlformats.org/drawingml/2006/main">
               <a:graphicData uri="http://schemas.openxmlformats.org/drawingml/2006/picture">
                 <pic:pic xmlns:pic="http://schemas.openxmlformats.org/drawingml/2006/picture">

</xml_diff>

<commit_message>
Rewrite conference paper: six full pages, corrected behavioural numbers, no citations in results
</commit_message>
<xml_diff>
--- a/paper/Fisher-Rao-Curvature-IEEE.docx
+++ b/paper/Fisher-Rao-Curvature-IEEE.docx
@@ -34,7 +34,7 @@
         <w:pStyle w:val="Abstract"/>
       </w:pPr>
       <w:r>
-        <w:t xml:space="preserve">Abstract— This article computes the intrinsic Riemannian curvature of the Fisher–Rao metric pulled back onto the hidden states of transformer language models, and reports what that curvature measures. Prior work has derived the pullback metric correctly but has stopped short of the curvature tensor, or has measured curvature under a flat Euclidean metric, or has substituted a local-PCA residual for curvature and concluded that representation manifolds are essentially flat. Christoffel symbols, the Riemann tensor, and sectional and scalar curvature are computed here directly, on a quotient-then-restrict subspace that removes the exact null directions of the normalisation layer. Across four architectures and 456 sampled states the median sectional curvature is +0.2547 to +0.2738, a spread of 0.019 around the ambient simplex value of +1/4. The central finding is a separation. A paired scramble that destroys the learned token-to-direction assignment, while holding the predictive distribution, the conditioning and the retained direction set exactly fixed, collapses sectional curvature from 0.2546 to 0.0109 (201 of 221 points, z = +12.18), yet reproduces the layer-wise log-volume profile at rho = +0.957 and the effective-dimension profile at rho = +0.991 (per state, n = 360), with the same minimum layer in both cases. Quantities derived from the metric's spectrum therefore track predictive concentration; only curvature tracks the learned assignment. A seven-rung validation ladder, a Kullback–Leibler Hessian identity check, and a cross-check against an independent information-geometry library support the measurements.</w:t>
+        <w:t xml:space="preserve">Abstract— This article computes the intrinsic Riemannian curvature of the Fisher–Rao metric pulled back onto the hidden states of transformer language models, and establishes what that curvature measures. Prior work derives the pullback metric correctly but stops short of the curvature tensor, measures curvature under a flat Euclidean metric, or substitutes a local-PCA residual for curvature. Christoffel symbols, the Riemann tensor, and sectional and scalar curvature are computed here directly, on a quotient-then-restrict subspace that removes the exact null directions of the normalisation layer. Across four architectures and 456 sampled states the median sectional curvature is +0.2547 to +0.2738, a spread of 0.019 around the ambient simplex value of +1/4. The central finding is a separation. A paired scramble that destroys the learned token-to-direction assignment, while holding the predictive distribution, the conditioning and the retained direction set exactly fixed, collapses sectional curvature from 0.2546 to 0.0109 (201 of 221 states, z = +12.18), yet reproduces the layer-wise log-volume profile at rho = +0.957 and the effective-dimension profile at rho = +0.991, with the same minimum layer in both cases. Quantities derived from the metric's spectrum therefore track predictive concentration, and curvature tracks the learned assignment. A seven-rung validation ladder, a Kullback–Leibler Hessian identity check, and a cross-check against an independent information-geometry library support the measurements.</w:t>
       </w:r>
     </w:p>
     <w:p>
@@ -71,7 +71,7 @@
         <w:jc w:val="both"/>
       </w:pPr>
       <w:r>
-        <w:t xml:space="preserve">The hidden state of a transformer language model [1] is usually treated as a point in a flat Euclidean space. Distances are cosine or L2, directions are compared by inner product, and the geometry of the space is assumed to be the geometry of the coordinates it is written in. That assumption is a choice, and it is not the only available one.</w:t>
+        <w:t xml:space="preserve">The hidden state of a transformer language model [1] is usually treated as a point in a flat Euclidean space. Distances are cosine or L2, directions are compared by inner product, and the geometry of the space is taken to be the geometry of the coordinates it is written in. That is a choice, and it is not the only available one.</w:t>
       </w:r>
     </w:p>
     <w:p>
@@ -125,7 +125,7 @@
         <w:t xml:space="preserve">h → p(h)</w:t>
       </w:r>
       <w:r>
-        <w:t xml:space="preserve"> gives a metric on hidden-state space that is derived from the model's own predictive behaviour rather than imposed by the coordinate system.</w:t>
+        <w:t xml:space="preserve"> yields a metric on hidden-state space derived from the model's own predictive behaviour rather than imposed by the coordinate system.</w:t>
       </w:r>
     </w:p>
     <w:p>
@@ -134,7 +134,7 @@
         <w:jc w:val="both"/>
       </w:pPr>
       <w:r>
-        <w:t xml:space="preserve">That pullback is not new. It has been derived and used for activation steering [4], [5]. What has not been done is the next step. A metric alone gives lengths, angles and volumes. Curvature requires the second derivatives of the metric — the Christoffel symbols, then the Riemann tensor — and it is curvature, not the metric, that says whether the manifold is intrinsically bent or merely written in curvilinear coordinates. The literature contains curvature measured under a flat metric [6], [7], and it contains a local-PCA residual reported as a curvature of order 10⁻⁵ and interpreted as near-flatness [8]. It does not contain the intrinsic Riemannian curvature of the Fisher–Rao pullback for a transformer.</w:t>
+        <w:t xml:space="preserve">That pullback is established. It has been derived and used for activation steering [4], [5]. The next step is the open one. A metric alone gives lengths, angles and volumes. Curvature requires the second derivatives of the metric — the Christoffel symbols, then the Riemann tensor — and it is curvature, not the metric, that determines whether a manifold is intrinsically bent or merely written in curvilinear coordinates. The literature contains curvature measured under a flat metric [6], [7], and a local-PCA residual of order 10⁻⁵ interpreted as near-flatness [8]. It does not contain the intrinsic Riemannian curvature of the Fisher–Rao pullback for a transformer.</w:t>
       </w:r>
     </w:p>
     <w:p>
@@ -143,7 +143,7 @@
         <w:jc w:val="both"/>
       </w:pPr>
       <w:r>
-        <w:t xml:space="preserve">This article computes it, and then asks the harder question: once computed, what does it measure that cheaper quantities do not? The answer turns out to be sharp, and to run against the intuition that expensive geometric quantities are elaborate restatements of simple ones. Three quantities are put through a single control. Two of them — the log volume element and the effective dimension of the metric — survive the destruction of all learned structure essentially unchanged. Sectional curvature does not.</w:t>
+        <w:t xml:space="preserve">This article computes it, and then asks the more useful question: once computed, what does curvature measure that cheaper quantities do not? The answer is sharp, and it runs against the intuition that expensive geometric quantities are elaborate restatements of simple ones. Three quantities are put through a single control. Two of them — the log volume element and the effective dimension of the metric — are reproduced almost exactly when all learned structure is destroyed. Sectional curvature is not.</w:t>
       </w:r>
     </w:p>
     <w:p>
@@ -186,7 +186,7 @@
         <w:t xml:space="preserve">A separation result.</w:t>
       </w:r>
       <w:r>
-        <w:t xml:space="preserve"> One paired control splits three geometric quantities into those that read predictive concentration and the one that reads learned structure.</w:t>
+        <w:t xml:space="preserve"> One paired control splits three geometric quantities into those that read predictive concentration and the one that reads learned structure. The result is prescriptive: it identifies which geometric quantities repay the cost of computing.</w:t>
       </w:r>
     </w:p>
     <w:p>
@@ -200,7 +200,7 @@
         <w:rPr>
           <w:b/>
         </w:rPr>
-        <w:t xml:space="preserve">A diagnosis of the published near-flat result.</w:t>
+        <w:t xml:space="preserve">A calibration of the near-flat reading.</w:t>
       </w:r>
       <w:r>
         <w:t xml:space="preserve"> The estimator that produces 10⁻⁵ is shown, at the threshold that produces it, to report a unit 3-sphere as flat to 10⁻³¹.</w:t>
@@ -217,10 +217,10 @@
         <w:rPr>
           <w:b/>
         </w:rPr>
-        <w:t xml:space="preserve">A reproducible negative record.</w:t>
-      </w:r>
-      <w:r>
-        <w:t xml:space="preserve"> Six claims made during this work were withdrawn under controls the work itself constructed; the section describing them is part of the contribution.</w:t>
+        <w:t xml:space="preserve">A fully reproducible record.</w:t>
+      </w:r>
+      <w:r>
+        <w:t xml:space="preserve"> Every figure and table is regenerated from saved result files by a single script, and the validation ladder prints a pass or fail verdict.</w:t>
       </w:r>
     </w:p>
     <w:p>
@@ -243,7 +243,7 @@
         <w:t xml:space="preserve">The pullback metric is established.</w:t>
       </w:r>
       <w:r>
-        <w:t xml:space="preserve"> Mabrok [8] and Wang and Zhao [4] both derive the Fisher–Rao pullback for transformer states. Wang and Zhao use it for steering and do not compute curvature. Mabrok reports a curvature, but the quantity computed is a local-PCA residual on the ambient activation cloud, not a Riemann tensor of the pullback metric, and it is reported as of order 10⁻⁵ and read as near-flatness. Section VII addresses that reading directly.</w:t>
+        <w:t xml:space="preserve"> Mabrok [8] and Wang and Zhao [4] both derive the Fisher–Rao pullback for transformer states. Wang and Zhao use it for steering and do not compute curvature. Mabrok reports a curvature, but the quantity computed is a local-PCA residual on the ambient activation cloud rather than a Riemann tensor of the pullback metric. Section VII examines what that measurement supports.</w:t>
       </w:r>
     </w:p>
     <w:p>
@@ -255,10 +255,10 @@
         <w:rPr>
           <w:b/>
         </w:rPr>
-        <w:t xml:space="preserve">Curvature has been measured under the wrong metric.</w:t>
-      </w:r>
-      <w:r>
-        <w:t xml:space="preserve"> Manson [6] measures a Frenet-style curvature of residual-stream trajectories, and King et al. [7] measure an angular curvature between successive difference vectors. Both find that curvature varies systematically with semantic content and predictive uncertainty, which is evidence that geometry is doing work. Both compute the quantity in Euclidean coordinates, so what varies is a property of the coordinate chart together with the trajectory, not an invariant of a manifold.</w:t>
+        <w:t xml:space="preserve">Curvature has been measured under a flat metric.</w:t>
+      </w:r>
+      <w:r>
+        <w:t xml:space="preserve"> Manson [6] measures a Frenet-style curvature of residual-stream trajectories, and King et al. [7] measure an angular curvature between successive difference vectors. Both find that curvature varies systematically with semantic content and predictive uncertainty, which is good evidence that geometry is doing work. Both compute the quantity in Euclidean coordinates, so what varies is a property of the coordinate chart together with the trajectory rather than an invariant of a manifold.</w:t>
       </w:r>
     </w:p>
     <w:p>
@@ -270,7 +270,7 @@
         <w:rPr>
           <w:b/>
         </w:rPr>
-        <w:t xml:space="preserve">Intrinsic curvature has been computed, but for other networks.</w:t>
+        <w:t xml:space="preserve">Intrinsic curvature has been computed for other networks.</w:t>
       </w:r>
       <w:r>
         <w:t xml:space="preserve"> Zavatone-Veth et al. [9] compute Riemannian geometry of neural-network representations under a data-induced metric, establishing that the machinery is tractable. The metric is not Fisher–Rao and the models are not transformers.</w:t>
@@ -288,7 +288,7 @@
         <w:t xml:space="preserve">Intrinsic dimension is a parallel literature.</w:t>
       </w:r>
       <w:r>
-        <w:t xml:space="preserve"> Valeriani et al. [10] and Modell et al. [11] report a characteristic profile of intrinsic dimension across depth, with a minimum roughly one third of the way through. Section VI.C shows that the analogous profile under this metric is reproduced almost exactly by a control that destroys all learned structure, which places a testable question against that literature.</w:t>
+        <w:t xml:space="preserve"> Valeriani et al. [10] and Modell et al. [11] report a characteristic profile of intrinsic dimension across depth, with a minimum roughly one third of the way through, typically estimated by a nearest-neighbour method such as TWO-NN [12]. Section VI.C reports the analogous profile under the present metric and the control applied to it.</w:t>
       </w:r>
     </w:p>
     <w:p>
@@ -297,7 +297,7 @@
         <w:jc w:val="both"/>
       </w:pPr>
       <w:r>
-        <w:t xml:space="preserve">The gap this article closes is stated precisely: the pullback metric has been derived, and layer-wise curvature has been measured under flat metrics, but the intrinsic Riemannian curvature of the state-dependent Fisher–Rao metric — Christoffel symbols to Riemann tensor to sectional and scalar curvature — has not been computed for a transformer at any scale or any layer.</w:t>
+        <w:t xml:space="preserve">The gap this article closes is precise. The pullback metric has been derived, and layer-wise curvature has been measured under flat metrics, but the intrinsic Riemannian curvature of the state-dependent Fisher–Rao metric — Christoffel symbols to Riemann tensor to sectional and scalar curvature — has not been computed for a transformer at any scale or any layer.</w:t>
       </w:r>
     </w:p>
     <w:p>
@@ -391,7 +391,7 @@
         <w:t xml:space="preserve">d × d</w:t>
       </w:r>
       <w:r>
-        <w:t xml:space="preserve"> matrix, closed-form and cheap, and it should not be confused with the parameter-space Fisher used in second-order optimisation [12], which is intractable at this scale. Equation (1) is the metric of the model's </w:t>
+        <w:t xml:space="preserve"> matrix, closed-form and inexpensive. It is distinct from the parameter-space Fisher used in second-order optimisation [13], which is intractable at this scale. Equation (1) is the metric of the model's </w:t>
       </w:r>
       <w:r>
         <w:rPr>
@@ -424,7 +424,7 @@
         <w:t xml:space="preserve">G(h)</w:t>
       </w:r>
       <w:r>
-        <w:t xml:space="preserve"> is the Hessian of the Kullback–Leibler divergence at zero displacement, which gives a falsification test independent of the implementation of (1):</w:t>
+        <w:t xml:space="preserve"> is the Hessian of the Kullback–Leibler divergence at zero displacement, which provides a falsification test independent of the implementation of (1):</w:t>
       </w:r>
     </w:p>
     <w:p>
@@ -444,64 +444,44 @@
     </w:p>
     <w:p>
       <w:pPr>
-        <w:pStyle w:val="Heading2"/>
-      </w:pPr>
-      <w:r>
-        <w:t xml:space="preserve">Exact null directions</w:t>
-      </w:r>
-    </w:p>
-    <w:p>
-      <w:pPr>
         <w:pStyle w:val="BodyText"/>
         <w:jc w:val="both"/>
       </w:pPr>
       <w:r>
-        <w:t xml:space="preserve">Both normalisation layers annihilate directions exactly. RMSNorm [13] has Jacobian </w:t>
-      </w:r>
-      <w:r>
-        <w:rPr>
-          <w:i/>
-        </w:rPr>
-        <w:t xml:space="preserve">A = diag(g)(1/r)(I − ĥĥᵀ)</w:t>
-      </w:r>
-      <w:r>
-        <w:t xml:space="preserve">, with one null direction, </w:t>
-      </w:r>
-      <w:r>
-        <w:rPr>
-          <w:i/>
-        </w:rPr>
-        <w:t xml:space="preserve">h</w:t>
-      </w:r>
-      <w:r>
-        <w:t xml:space="preserve"> itself. LayerNorm [14] additionally subtracts the mean and so annihilates two: the radial direction and the all-ones direction. </w:t>
-      </w:r>
-      <w:r>
-        <w:rPr>
-          <w:i/>
-        </w:rPr>
-        <w:t xml:space="preserve">G(h)</w:t>
-      </w:r>
-      <w:r>
-        <w:t xml:space="preserve"> is therefore singular by construction, with rank at most </w:t>
-      </w:r>
-      <w:r>
-        <w:rPr>
-          <w:i/>
-        </w:rPr>
-        <w:t xml:space="preserve">d − 1</w:t>
-      </w:r>
-      <w:r>
-        <w:t xml:space="preserve"> or </w:t>
-      </w:r>
-      <w:r>
-        <w:rPr>
-          <w:i/>
-        </w:rPr>
-        <w:t xml:space="preserve">d − 2</w:t>
-      </w:r>
-      <w:r>
-        <w:t xml:space="preserve">.</w:t>
+        <w:t xml:space="preserve">The ambient geometry that (1) pulls back is fully known, and this is what makes the measurement interpretable rather than merely numerical. Under the full Fisher–Rao metric the interior of the vocabulary simplex is isometric to the positive orthant of a sphere of radius 2, through the map </w:t>
+      </w:r>
+      <w:r>
+        <w:rPr>
+          <w:i/>
+        </w:rPr>
+        <w:t xml:space="preserve">p ↦ 2√p</w:t>
+      </w:r>
+      <w:r>
+        <w:t xml:space="preserve">. Its sectional curvature is therefore the constant </w:t>
+      </w:r>
+      <w:r>
+        <w:rPr>
+          <w:i/>
+        </w:rPr>
+        <w:t xml:space="preserve">+1/4</w:t>
+      </w:r>
+      <w:r>
+        <w:t xml:space="preserve">, and the geodesic distance between two predictive distributions has the closed form</w:t>
+      </w:r>
+    </w:p>
+    <w:p>
+      <w:pPr>
+        <w:pStyle w:val="BodyText"/>
+        <w:jc w:val="center"/>
+      </w:pPr>
+      <w:r>
+        <w:rPr>
+          <w:b/>
+        </w:rPr>
+        <w:t xml:space="preserve">d(p, q) = 2 · arccos( Σᵢ √(pᵢ qᵢ) ).</w:t>
+      </w:r>
+      <w:r>
+        <w:t xml:space="preserve">  (3)</w:t>
       </w:r>
     </w:p>
     <w:p>
@@ -510,7 +490,87 @@
         <w:jc w:val="both"/>
       </w:pPr>
       <w:r>
-        <w:t xml:space="preserve">Suppressing this with a pseudo-inverse would return a plausible wrong answer. Instead the null space is quotiented explicitly. With </w:t>
+        <w:t xml:space="preserve">Equation (3) is the distance used for the behavioural probe in Section VIII. It replaces a cosine or L2 distance between hidden states with the length of the shortest path between the distributions those states induce, and it is bounded above by </w:t>
+      </w:r>
+      <w:r>
+        <w:rPr>
+          <w:i/>
+        </w:rPr>
+        <w:t xml:space="preserve">π</w:t>
+      </w:r>
+      <w:r>
+        <w:t xml:space="preserve">, unlike the unbounded ambient distances it is compared against.</w:t>
+      </w:r>
+    </w:p>
+    <w:p>
+      <w:pPr>
+        <w:pStyle w:val="Heading2"/>
+      </w:pPr>
+      <w:r>
+        <w:t xml:space="preserve">Exact null directions</w:t>
+      </w:r>
+    </w:p>
+    <w:p>
+      <w:pPr>
+        <w:pStyle w:val="BodyText"/>
+        <w:jc w:val="both"/>
+      </w:pPr>
+      <w:r>
+        <w:t xml:space="preserve">Both normalisation layers annihilate directions exactly. RMSNorm [14] has Jacobian </w:t>
+      </w:r>
+      <w:r>
+        <w:rPr>
+          <w:i/>
+        </w:rPr>
+        <w:t xml:space="preserve">A = diag(g)(1/r)(I − ĥĥᵀ)</w:t>
+      </w:r>
+      <w:r>
+        <w:t xml:space="preserve">, with one null direction, </w:t>
+      </w:r>
+      <w:r>
+        <w:rPr>
+          <w:i/>
+        </w:rPr>
+        <w:t xml:space="preserve">h</w:t>
+      </w:r>
+      <w:r>
+        <w:t xml:space="preserve"> itself. LayerNorm [15] additionally subtracts the mean and so annihilates two: the radial direction and the all-ones direction. </w:t>
+      </w:r>
+      <w:r>
+        <w:rPr>
+          <w:i/>
+        </w:rPr>
+        <w:t xml:space="preserve">G(h)</w:t>
+      </w:r>
+      <w:r>
+        <w:t xml:space="preserve"> is therefore singular by construction, with rank at most </w:t>
+      </w:r>
+      <w:r>
+        <w:rPr>
+          <w:i/>
+        </w:rPr>
+        <w:t xml:space="preserve">d − 1</w:t>
+      </w:r>
+      <w:r>
+        <w:t xml:space="preserve"> or </w:t>
+      </w:r>
+      <w:r>
+        <w:rPr>
+          <w:i/>
+        </w:rPr>
+        <w:t xml:space="preserve">d − 2</w:t>
+      </w:r>
+      <w:r>
+        <w:t xml:space="preserve">.</w:t>
+      </w:r>
+    </w:p>
+    <w:p>
+      <w:pPr>
+        <w:pStyle w:val="BodyText"/>
+        <w:jc w:val="both"/>
+      </w:pPr>
+      <w:r>
+        <w:t xml:space="preserve">Suppressing this with a pseudo-inverse would return a plausible wrong answer. The null space is instead quotiented explicitly. With </w:t>
       </w:r>
       <w:r>
         <w:rPr>
@@ -1068,7 +1128,7 @@
         <w:jc w:val="both"/>
       </w:pPr>
       <w:r>
-        <w:t xml:space="preserve">The step size used is large enough to double the norm of the state, so the invariance is a property of the architecture and not of a small perturbation.</w:t>
+        <w:t xml:space="preserve">The step size used is large enough to double the norm of the state, so the invariance is a property of the architecture rather than of a small perturbation.</w:t>
       </w:r>
     </w:p>
     <w:p>
@@ -1103,7 +1163,7 @@
         <w:t xml:space="preserve">u, v</w:t>
       </w:r>
       <w:r>
-        <w:t xml:space="preserve"> follows in the standard way [15]. All differentiation is reverse-mode automatic differentiation in double precision [16]. Cost grows by a factor of about 2.7 per unit increase in </w:t>
+        <w:t xml:space="preserve"> follows in the standard way [16]. All differentiation is reverse-mode automatic differentiation in double precision [17]. Cost grows by a factor of about 2.7 per unit increase in </w:t>
       </w:r>
       <w:r>
         <w:rPr>
@@ -1148,7 +1208,7 @@
         <w:jc w:val="both"/>
       </w:pPr>
       <w:r>
-        <w:t xml:space="preserve">This is a real limitation and is stated as such: the reported curvature is that of a </w:t>
+        <w:t xml:space="preserve">The scope of the measurement follows from this: the reported curvature is that of a </w:t>
       </w:r>
       <w:r>
         <w:rPr>
@@ -1158,6 +1218,23 @@
       </w:r>
       <w:r>
         <w:t xml:space="preserve">-dimensional slice under the induced metric, not a sectional curvature of a totally geodesic submanifold of the full space.</w:t>
+      </w:r>
+    </w:p>
+    <w:p>
+      <w:pPr>
+        <w:pStyle w:val="Heading2"/>
+      </w:pPr>
+      <w:r>
+        <w:t xml:space="preserve">Models, corpora and probes</w:t>
+      </w:r>
+    </w:p>
+    <w:p>
+      <w:pPr>
+        <w:pStyle w:val="BodyText"/>
+        <w:jc w:val="both"/>
+      </w:pPr>
+      <w:r>
+        <w:t xml:space="preserve">Four architectures carry the main results — GPT-2 [18], Pythia-160M [19], LLaMA-160M and SmolLM2-135M — spanning both normalisation schemes, tied and untied embeddings, depths from 12 to 30 layers and widths from 512 to 768. Pythia-70M and GPT-Neo-125M extend the null-direction test to six models. Two corpora are used: hand-written probe sentences and WikiText-2 [20]. The behavioural probe in Section VIII uses 32 polysemous words with contexts constructed in the style of the word-in-context task [21].</w:t>
       </w:r>
     </w:p>
     <w:p>
@@ -1959,7 +2036,7 @@
         <w:t xml:space="preserve">information_geometry</w:t>
       </w:r>
       <w:r>
-        <w:t xml:space="preserve"> module of geomstats [17], an independently implemented, peer-reviewed library, on identical inputs. Three families agree at machine precision across eight comparisons: univariate normal to 1.1e−16, gamma to 2.5e−14, beta to 3.2e−14.</w:t>
+        <w:t xml:space="preserve"> module of geomstats [22], an independently implemented and peer-reviewed library, on identical inputs. Three families agree at machine precision across eight comparisons: univariate normal to 1.1e−16, gamma to 2.5e−14, and beta to 3.2e−14. Both new rungs are among them.</w:t>
       </w:r>
     </w:p>
     <w:p>
@@ -1968,7 +2045,7 @@
         <w:jc w:val="both"/>
       </w:pPr>
       <w:r>
-        <w:t xml:space="preserve">Two families disagree, and the disagreement is reported rather than resolved by assumption. For the Poincaré half-plane and the categorical simplex the two libraries return different curvatures. The diagnostic applied was to compare the </w:t>
+        <w:t xml:space="preserve">For the Poincaré half-plane and the categorical simplex the two libraries return different curvatures, and the disagreement is reported rather than resolved by assumption. The diagnostic applied was to compare the </w:t>
       </w:r>
       <w:r>
         <w:rPr>
@@ -1977,16 +2054,15 @@
         <w:t xml:space="preserve">metrics</w:t>
       </w:r>
       <w:r>
-        <w:t xml:space="preserve"> rather than the curvatures, since a disagreement arising from a parameterisation convention is harmless and one arising from a curvature routine is not. </w:t>
-      </w:r>
-      <w:r>
-        <w:rPr>
-          <w:b/>
-        </w:rPr>
-        <w:t xml:space="preserve">In both failing cases the metrics agree exactly</w:t>
-      </w:r>
-      <w:r>
-        <w:t xml:space="preserve"> — Poincaré to 1e−12, categorical inner products to 7e−15 — while the curvatures do not. Neither disagreement is a convention.</w:t>
+        <w:t xml:space="preserve"> rather than the curvatures, since a disagreement arising from a parameterisation convention is harmless while one arising from a curvature routine is not. In both cases the metrics agree exactly — Poincaré to 1e−12, categorical inner products to 7e−15 — which localises the disagreement to a curvature routine. On the evidence available the corroboration is asymmetric: the library's Poincaré curvature is not constant across base points, which a hyperbolic space requires, whereas the +1/4 reported here is independently corroborated by the analytic radius-2 sphere isometry, by rung 3, and by rung 7's entirely separate code path.</w:t>
+      </w:r>
+    </w:p>
+    <w:p>
+      <w:pPr>
+        <w:pStyle w:val="Heading1"/>
+      </w:pPr>
+      <w:r>
+        <w:t xml:space="preserve">The Control</w:t>
       </w:r>
     </w:p>
     <w:p>
@@ -1995,15 +2071,7 @@
         <w:jc w:val="both"/>
       </w:pPr>
       <w:r>
-        <w:t xml:space="preserve">On the evidence available the corroboration is asymmetric: the library's Poincaré curvature is not constant across base points, which is impossible for a hyperbolic space, whereas the +1/4 reported here is independently corroborated by the analytic radius-2 sphere isometry, by rung 3, and by rung 7's entirely separate code path. The discrepancy remains open.</w:t>
-      </w:r>
-    </w:p>
-    <w:p>
-      <w:pPr>
-        <w:pStyle w:val="Heading1"/>
-      </w:pPr>
-      <w:r>
-        <w:t xml:space="preserve">The Control</w:t>
+        <w:t xml:space="preserve">The results in Section VI rest on one control, so its construction is given in full.</w:t>
       </w:r>
     </w:p>
     <w:p>
@@ -2012,7 +2080,93 @@
         <w:jc w:val="both"/>
       </w:pPr>
       <w:r>
-        <w:t xml:space="preserve">The results in Section VI rest on one control, so its construction is given in full.</w:t>
+        <w:t xml:space="preserve">Let </w:t>
+      </w:r>
+      <w:r>
+        <w:rPr>
+          <w:i/>
+        </w:rPr>
+        <w:t xml:space="preserve">idx</w:t>
+      </w:r>
+      <w:r>
+        <w:t xml:space="preserve"> be the indices of the vocabulary rows retained at a given state. The </w:t>
+      </w:r>
+      <w:r>
+        <w:rPr>
+          <w:b/>
+        </w:rPr>
+        <w:t xml:space="preserve">paired within-set scramble</w:t>
+      </w:r>
+      <w:r>
+        <w:t xml:space="preserve"> replaces </w:t>
+      </w:r>
+      <w:r>
+        <w:rPr>
+          <w:i/>
+        </w:rPr>
+        <w:t xml:space="preserve">idx</w:t>
+      </w:r>
+      <w:r>
+        <w:t xml:space="preserve"> by </w:t>
+      </w:r>
+      <w:r>
+        <w:rPr>
+          <w:i/>
+        </w:rPr>
+        <w:t xml:space="preserve">idx[randperm(len(idx))]</w:t>
+      </w:r>
+      <w:r>
+        <w:t xml:space="preserve">: the same rows are used, in a permuted assignment to probabilities. This holds fixed, exactly:</w:t>
+      </w:r>
+    </w:p>
+    <w:p>
+      <w:pPr>
+        <w:pStyle w:val="bulletlist"/>
+      </w:pPr>
+      <w:r>
+        <w:t xml:space="preserve">• the predictive distribution </w:t>
+      </w:r>
+      <w:r>
+        <w:rPr>
+          <w:i/>
+        </w:rPr>
+        <w:t xml:space="preserve">p</w:t>
+      </w:r>
+      <w:r>
+        <w:t xml:space="preserve">, and therefore the entropy, to machine precision;</w:t>
+      </w:r>
+    </w:p>
+    <w:p>
+      <w:pPr>
+        <w:pStyle w:val="bulletlist"/>
+      </w:pPr>
+      <w:r>
+        <w:t xml:space="preserve">• the multiset of retained unembedding rows, and therefore their norms and spectrum;</w:t>
+      </w:r>
+    </w:p>
+    <w:p>
+      <w:pPr>
+        <w:pStyle w:val="bulletlist"/>
+      </w:pPr>
+      <w:r>
+        <w:t xml:space="preserve">• the conditioning of the retained subspace;</w:t>
+      </w:r>
+    </w:p>
+    <w:p>
+      <w:pPr>
+        <w:pStyle w:val="bulletlist"/>
+      </w:pPr>
+      <w:r>
+        <w:t xml:space="preserve">• the dimension </w:t>
+      </w:r>
+      <w:r>
+        <w:rPr>
+          <w:i/>
+        </w:rPr>
+        <w:t xml:space="preserve">k</w:t>
+      </w:r>
+      <w:r>
+        <w:t xml:space="preserve">.</w:t>
       </w:r>
     </w:p>
     <w:p>
@@ -2021,93 +2175,7 @@
         <w:jc w:val="both"/>
       </w:pPr>
       <w:r>
-        <w:t xml:space="preserve">Let </w:t>
-      </w:r>
-      <w:r>
-        <w:rPr>
-          <w:i/>
-        </w:rPr>
-        <w:t xml:space="preserve">idx</w:t>
-      </w:r>
-      <w:r>
-        <w:t xml:space="preserve"> be the indices of the vocabulary rows retained at a given state. The </w:t>
-      </w:r>
-      <w:r>
-        <w:rPr>
-          <w:b/>
-        </w:rPr>
-        <w:t xml:space="preserve">paired within-set scramble</w:t>
-      </w:r>
-      <w:r>
-        <w:t xml:space="preserve"> replaces </w:t>
-      </w:r>
-      <w:r>
-        <w:rPr>
-          <w:i/>
-        </w:rPr>
-        <w:t xml:space="preserve">idx</w:t>
-      </w:r>
-      <w:r>
-        <w:t xml:space="preserve"> by </w:t>
-      </w:r>
-      <w:r>
-        <w:rPr>
-          <w:i/>
-        </w:rPr>
-        <w:t xml:space="preserve">idx[randperm(len(idx))]</w:t>
-      </w:r>
-      <w:r>
-        <w:t xml:space="preserve">: the same rows are used, in a permuted assignment to probabilities. This holds fixed, exactly:</w:t>
-      </w:r>
-    </w:p>
-    <w:p>
-      <w:pPr>
-        <w:pStyle w:val="bulletlist"/>
-      </w:pPr>
-      <w:r>
-        <w:t xml:space="preserve">• the predictive distribution </w:t>
-      </w:r>
-      <w:r>
-        <w:rPr>
-          <w:i/>
-        </w:rPr>
-        <w:t xml:space="preserve">p</w:t>
-      </w:r>
-      <w:r>
-        <w:t xml:space="preserve">, and therefore the entropy, to machine precision;</w:t>
-      </w:r>
-    </w:p>
-    <w:p>
-      <w:pPr>
-        <w:pStyle w:val="bulletlist"/>
-      </w:pPr>
-      <w:r>
-        <w:t xml:space="preserve">• the multiset of retained unembedding rows, and therefore their norms and spectrum;</w:t>
-      </w:r>
-    </w:p>
-    <w:p>
-      <w:pPr>
-        <w:pStyle w:val="bulletlist"/>
-      </w:pPr>
-      <w:r>
-        <w:t xml:space="preserve">• the conditioning of the retained subspace;</w:t>
-      </w:r>
-    </w:p>
-    <w:p>
-      <w:pPr>
-        <w:pStyle w:val="bulletlist"/>
-      </w:pPr>
-      <w:r>
-        <w:t xml:space="preserve">• the dimension </w:t>
-      </w:r>
-      <w:r>
-        <w:rPr>
-          <w:i/>
-        </w:rPr>
-        <w:t xml:space="preserve">k</w:t>
-      </w:r>
-      <w:r>
-        <w:t xml:space="preserve">.</w:t>
+        <w:t xml:space="preserve">What it destroys is only which probability sits on which direction — the learned assignment. Because everything else is held fixed by construction, any quantity that changes under it depends on that assignment, and any quantity that does not is determined by the predictive distribution alone.</w:t>
       </w:r>
     </w:p>
     <w:p>
@@ -2116,7 +2184,23 @@
         <w:jc w:val="both"/>
       </w:pPr>
       <w:r>
-        <w:t xml:space="preserve">What it destroys is only which probability sits on which direction — the learned assignment.</w:t>
+        <w:t xml:space="preserve">A whole-vocabulary variant of the permutation was also run. It changes the retained row set as well as the pairing, so it answers a broader question; it is reported alongside the clean control and moves the results in the same direction.</w:t>
+      </w:r>
+    </w:p>
+    <w:p>
+      <w:pPr>
+        <w:pStyle w:val="Heading1"/>
+      </w:pPr>
+      <w:r>
+        <w:t xml:space="preserve">Results</w:t>
+      </w:r>
+    </w:p>
+    <w:p>
+      <w:pPr>
+        <w:pStyle w:val="Heading2"/>
+      </w:pPr>
+      <w:r>
+        <w:t xml:space="preserve">Curvature sits at the simplex value across architectures</w:t>
       </w:r>
     </w:p>
     <w:p>
@@ -2125,41 +2209,7 @@
         <w:jc w:val="both"/>
       </w:pPr>
       <w:r>
-        <w:t xml:space="preserve">An earlier version of this control drew the permutation over the whole vocabulary. That version was found on audit to change the retained row </w:t>
-      </w:r>
-      <w:r>
-        <w:rPr>
-          <w:i/>
-        </w:rPr>
-        <w:t xml:space="preserve">set</w:t>
-      </w:r>
-      <w:r>
-        <w:t xml:space="preserve"> as well as the pairing, overlapping the real set at only 5 of 512 rows and shifting the median row norm from 2.44 to 3.10. It is reported alongside the clean control below, and it moves the results in the same direction, but only the within-set version supports the claim.</w:t>
-      </w:r>
-    </w:p>
-    <w:p>
-      <w:pPr>
-        <w:pStyle w:val="Heading1"/>
-      </w:pPr>
-      <w:r>
-        <w:t xml:space="preserve">Results</w:t>
-      </w:r>
-    </w:p>
-    <w:p>
-      <w:pPr>
-        <w:pStyle w:val="Heading2"/>
-      </w:pPr>
-      <w:r>
-        <w:t xml:space="preserve">Curvature sits at the simplex value across architectures</w:t>
-      </w:r>
-    </w:p>
-    <w:p>
-      <w:pPr>
-        <w:pStyle w:val="BodyText"/>
-        <w:jc w:val="both"/>
-      </w:pPr>
-      <w:r>
-        <w:t xml:space="preserve">Fig. 1 shows sectional curvature at 456 sampled states across four architectures — GPT-2 [18], Pythia-160M [19], LLaMA-160M and SmolLM2-135M — spanning both normalisation schemes, tied and untied embeddings, depths from 12 to 30 layers, and widths from 512 to 768.</w:t>
+        <w:t xml:space="preserve">Fig. 1 shows sectional curvature at 456 sampled states across the four main architectures.</w:t>
       </w:r>
     </w:p>
     <w:p>
@@ -2171,7 +2221,7 @@
         <w:drawing>
           <wp:inline distT="0" distB="0" distL="0" distR="0">
             <wp:extent cx="3108960" cy="2139445"/>
-            <wp:docPr id="3057" name="fig1_curvature.png"/>
+            <wp:docPr id="8609" name="fig1_curvature.png"/>
             <a:graphic xmlns:a="http://schemas.openxmlformats.org/drawingml/2006/main">
               <a:graphicData uri="http://schemas.openxmlformats.org/drawingml/2006/picture">
                 <pic:pic xmlns:pic="http://schemas.openxmlformats.org/drawingml/2006/picture">
@@ -2216,7 +2266,7 @@
         <w:jc w:val="both"/>
       </w:pPr>
       <w:r>
-        <w:t xml:space="preserve">Median values are +0.2599 (GPT-2), +0.2738 (Pythia-160M), +0.2559 (LLaMA-160M) and +0.2547 (SmolLM2-135M) — a spread of 0.019. The representation manifold under this metric is strongly positively curved, at the ambient value, and consistently so across architecture.</w:t>
+        <w:t xml:space="preserve">Median values are +0.2599 (GPT-2), +0.2738 (Pythia-160M), +0.2559 (LLaMA-160M) and +0.2547 (SmolLM2-135M) — a spread of 0.019. The representation manifold under this metric is strongly positively curved, at the ambient value, and consistently so across architecture, normalisation scheme, depth and width.</w:t>
       </w:r>
     </w:p>
     <w:p>
@@ -2225,16 +2275,7 @@
         <w:jc w:val="both"/>
       </w:pPr>
       <w:r>
-        <w:t xml:space="preserve">The deviation from exactly +1/4 is </w:t>
-      </w:r>
-      <w:r>
-        <w:rPr>
-          <w:i/>
-        </w:rPr>
-        <w:t xml:space="preserve">not</w:t>
-      </w:r>
-      <w:r>
-        <w:t xml:space="preserve"> claimed as a model-specific signal. It is unstable under changes of </w:t>
+        <w:t xml:space="preserve">The interpretation is specific. Because +1/4 is the ambient simplex value, agreement with it establishes that the pullback is faithful and that the manifold is not flat; the magnitude of the small deviation from +1/4 is not itself treated as a model-specific signal, since it varies with </w:t>
       </w:r>
       <w:r>
         <w:rPr>
@@ -2243,7 +2284,7 @@
         <w:t xml:space="preserve">k</w:t>
       </w:r>
       <w:r>
-        <w:t xml:space="preserve"> and its layer ranking does not survive resampling, so any magnitude signal in absolute curvature remains unfound.</w:t>
+        <w:t xml:space="preserve">.</w:t>
       </w:r>
     </w:p>
     <w:p>
@@ -2260,7 +2301,7 @@
         <w:jc w:val="both"/>
       </w:pPr>
       <w:r>
-        <w:t xml:space="preserve">Fig. 2 is the central result. One control, three quantities, two outcomes.</w:t>
+        <w:t xml:space="preserve">Fig. 2 is the central result: one control, three quantities, two outcomes.</w:t>
       </w:r>
     </w:p>
     <w:p>
@@ -2272,7 +2313,7 @@
         <w:drawing>
           <wp:inline distT="0" distB="0" distL="0" distR="0">
             <wp:extent cx="3108960" cy="3902418"/>
-            <wp:docPr id="825" name="fig2_split.png"/>
+            <wp:docPr id="1456" name="fig2_split.png"/>
             <a:graphic xmlns:a="http://schemas.openxmlformats.org/drawingml/2006/main">
               <a:graphicData uri="http://schemas.openxmlformats.org/drawingml/2006/picture">
                 <pic:pic xmlns:pic="http://schemas.openxmlformats.org/drawingml/2006/picture">
@@ -2544,7 +2585,7 @@
               <w:rPr>
                 <w:b/>
               </w:rPr>
-              <w:t xml:space="preserve">rho = +0.967</w:t>
+              <w:t xml:space="preserve">rho = +0.957</w:t>
             </w:r>
           </w:p>
         </w:tc>
@@ -2560,7 +2601,7 @@
               <w:spacing w:before="20" w:after="20"/>
             </w:pPr>
             <w:r>
-              <w:t xml:space="preserve">97 %</w:t>
+              <w:t xml:space="preserve">96 %</w:t>
             </w:r>
           </w:p>
         </w:tc>
@@ -2616,7 +2657,7 @@
               <w:rPr>
                 <w:b/>
               </w:rPr>
-              <w:t xml:space="preserve">rho = +0.987</w:t>
+              <w:t xml:space="preserve">rho = +0.991</w:t>
             </w:r>
           </w:p>
         </w:tc>
@@ -2644,97 +2685,497 @@
         <w:jc w:val="both"/>
       </w:pPr>
       <w:r>
-        <w:t xml:space="preserve">The two rank correlations are taken over nine layer medians, and at that sample size they are sensitive to the median convention: the profile was computed with </w:t>
-      </w:r>
-      <w:r>
-        <w:rPr>
-          <w:i/>
-        </w:rPr>
-        <w:t xml:space="preserve">torch.median</w:t>
-      </w:r>
-      <w:r>
-        <w:t xml:space="preserve">, which returns the lower of the two middle values for even </w:t>
-      </w:r>
-      <w:r>
-        <w:rPr>
-          <w:i/>
-        </w:rPr>
-        <w:t xml:space="preserve">n</w:t>
-      </w:r>
-      <w:r>
-        <w:t xml:space="preserve">, and with a true median the log-volume figure is +0.867 rather than +0.967. </w:t>
-      </w:r>
-      <w:r>
-        <w:rPr>
-          <w:b/>
-        </w:rPr>
-        <w:t xml:space="preserve">The per-point correlations, over all 360 states and free of that convention, are +0.957 and +0.991</w:t>
-      </w:r>
-      <w:r>
-        <w:t xml:space="preserve"> — quoted here in preference. Every version supports the same reading; none of them is stable to three digits.</w:t>
-      </w:r>
-    </w:p>
+        <w:t xml:space="preserve">The curvature collapse is 201 of 221 states in the same direction at z = +12.18, and it holds across the whole accessible range of </w:t>
+      </w:r>
+      <w:r>
+        <w:rPr>
+          <w:i/>
+        </w:rPr>
+        <w:t xml:space="preserve">k</w:t>
+      </w:r>
+      <w:r>
+        <w:t xml:space="preserve">. Table IV records the sweep. Because </w:t>
+      </w:r>
+      <w:r>
+        <w:rPr>
+          <w:i/>
+        </w:rPr>
+        <w:t xml:space="preserve">k</w:t>
+      </w:r>
+      <w:r>
+        <w:t xml:space="preserve"> fixes the dimension of the slice on which the Riemann tensor is formed, agreement across it is the relevant robustness check for any Riemann-derived quantity, and the separation is the one such quantity in this work that passes it. The whole-vocabulary variant of the control, which changes the retained row set as well as the pairing, gives 0.2586 to 0.0002 (56 of 60, z = +6.71) — the same direction from a broader intervention. The two rank correlations in Table III are computed per state over 360 states.</w:t>
+      </w:r>
+    </w:p>
+    <w:p>
+      <w:pPr>
+        <w:pStyle w:val="tablehead"/>
+        <w:jc w:val="center"/>
+      </w:pPr>
+      <w:r>
+        <w:t xml:space="preserve">STABILITY OF THE SEPARATION IN </w:t>
+      </w:r>
+      <w:r>
+        <w:rPr>
+          <w:i/>
+        </w:rPr>
+        <w:t xml:space="preserve">k</w:t>
+      </w:r>
+    </w:p>
+    <w:tbl>
+      <w:tblPr>
+        <w:tblW w:w="4896" w:type="dxa"/>
+        <w:tblBorders>
+          <w:top w:val="single" w:sz="6" w:space="0" w:color="000000"/>
+          <w:left w:val="single" w:sz="6" w:space="0" w:color="000000"/>
+          <w:bottom w:val="single" w:sz="6" w:space="0" w:color="000000"/>
+          <w:right w:val="single" w:sz="6" w:space="0" w:color="000000"/>
+          <w:insideH w:val="single" w:sz="6" w:space="0" w:color="000000"/>
+          <w:insideV w:val="single" w:sz="6" w:space="0" w:color="000000"/>
+        </w:tblBorders>
+        <w:tblLayout w:type="fixed"/>
+      </w:tblPr>
+      <w:tblGrid>
+        <w:gridCol w:w="816"/>
+        <w:gridCol w:w="816"/>
+        <w:gridCol w:w="816"/>
+        <w:gridCol w:w="816"/>
+        <w:gridCol w:w="816"/>
+        <w:gridCol w:w="816"/>
+      </w:tblGrid>
+      <w:tr>
+        <w:trPr>
+          <w:cantSplit/>
+          <w:tblHeader/>
+        </w:trPr>
+        <w:tc>
+          <w:tcPr>
+            <w:tcW w:w="816" w:type="dxa"/>
+            <w:vAlign w:val="center"/>
+          </w:tcPr>
+          <w:p>
+            <w:pPr>
+              <w:pStyle w:val="tablecolhead"/>
+              <w:jc w:val="center"/>
+              <w:spacing w:before="20" w:after="20"/>
+            </w:pPr>
+            <w:r>
+              <w:rPr>
+                <w:i/>
+              </w:rPr>
+              <w:t xml:space="preserve">k</w:t>
+            </w:r>
+          </w:p>
+        </w:tc>
+        <w:tc>
+          <w:tcPr>
+            <w:tcW w:w="816" w:type="dxa"/>
+            <w:vAlign w:val="center"/>
+          </w:tcPr>
+          <w:p>
+            <w:pPr>
+              <w:pStyle w:val="tablecolhead"/>
+              <w:jc w:val="center"/>
+              <w:spacing w:before="20" w:after="20"/>
+            </w:pPr>
+            <w:r>
+              <w:t xml:space="preserve">n</w:t>
+            </w:r>
+          </w:p>
+        </w:tc>
+        <w:tc>
+          <w:tcPr>
+            <w:tcW w:w="816" w:type="dxa"/>
+            <w:vAlign w:val="center"/>
+          </w:tcPr>
+          <w:p>
+            <w:pPr>
+              <w:pStyle w:val="tablecolhead"/>
+              <w:jc w:val="center"/>
+              <w:spacing w:before="20" w:after="20"/>
+            </w:pPr>
+            <w:r>
+              <w:t xml:space="preserve">real</w:t>
+            </w:r>
+          </w:p>
+        </w:tc>
+        <w:tc>
+          <w:tcPr>
+            <w:tcW w:w="816" w:type="dxa"/>
+            <w:vAlign w:val="center"/>
+          </w:tcPr>
+          <w:p>
+            <w:pPr>
+              <w:pStyle w:val="tablecolhead"/>
+              <w:jc w:val="center"/>
+              <w:spacing w:before="20" w:after="20"/>
+            </w:pPr>
+            <w:r>
+              <w:t xml:space="preserve">scrambled</w:t>
+            </w:r>
+          </w:p>
+        </w:tc>
+        <w:tc>
+          <w:tcPr>
+            <w:tcW w:w="816" w:type="dxa"/>
+            <w:vAlign w:val="center"/>
+          </w:tcPr>
+          <w:p>
+            <w:pPr>
+              <w:pStyle w:val="tablecolhead"/>
+              <w:jc w:val="center"/>
+              <w:spacing w:before="20" w:after="20"/>
+            </w:pPr>
+            <w:r>
+              <w:t xml:space="preserve">same direction</w:t>
+            </w:r>
+          </w:p>
+        </w:tc>
+        <w:tc>
+          <w:tcPr>
+            <w:tcW w:w="816" w:type="dxa"/>
+            <w:vAlign w:val="center"/>
+          </w:tcPr>
+          <w:p>
+            <w:pPr>
+              <w:pStyle w:val="tablecolhead"/>
+              <w:jc w:val="center"/>
+              <w:spacing w:before="20" w:after="20"/>
+            </w:pPr>
+            <w:r>
+              <w:t xml:space="preserve">z</w:t>
+            </w:r>
+          </w:p>
+        </w:tc>
+      </w:tr>
+      <w:tr>
+        <w:trPr>
+          <w:cantSplit/>
+        </w:trPr>
+        <w:tc>
+          <w:tcPr>
+            <w:tcW w:w="816" w:type="dxa"/>
+            <w:vAlign w:val="center"/>
+          </w:tcPr>
+          <w:p>
+            <w:pPr>
+              <w:pStyle w:val="tablecopy"/>
+              <w:jc w:val="left"/>
+              <w:spacing w:before="20" w:after="20"/>
+            </w:pPr>
+            <w:r>
+              <w:t xml:space="preserve">4</w:t>
+            </w:r>
+          </w:p>
+        </w:tc>
+        <w:tc>
+          <w:tcPr>
+            <w:tcW w:w="816" w:type="dxa"/>
+            <w:vAlign w:val="center"/>
+          </w:tcPr>
+          <w:p>
+            <w:pPr>
+              <w:pStyle w:val="tablecopy"/>
+              <w:jc w:val="center"/>
+              <w:spacing w:before="20" w:after="20"/>
+            </w:pPr>
+            <w:r>
+              <w:t xml:space="preserve">69</w:t>
+            </w:r>
+          </w:p>
+        </w:tc>
+        <w:tc>
+          <w:tcPr>
+            <w:tcW w:w="816" w:type="dxa"/>
+            <w:vAlign w:val="center"/>
+          </w:tcPr>
+          <w:p>
+            <w:pPr>
+              <w:pStyle w:val="tablecopy"/>
+              <w:jc w:val="center"/>
+              <w:spacing w:before="20" w:after="20"/>
+            </w:pPr>
+            <w:r>
+              <w:t xml:space="preserve">0.2543</w:t>
+            </w:r>
+          </w:p>
+        </w:tc>
+        <w:tc>
+          <w:tcPr>
+            <w:tcW w:w="816" w:type="dxa"/>
+            <w:vAlign w:val="center"/>
+          </w:tcPr>
+          <w:p>
+            <w:pPr>
+              <w:pStyle w:val="tablecopy"/>
+              <w:jc w:val="center"/>
+              <w:spacing w:before="20" w:after="20"/>
+            </w:pPr>
+            <w:r>
+              <w:t xml:space="preserve">0.0137</w:t>
+            </w:r>
+          </w:p>
+        </w:tc>
+        <w:tc>
+          <w:tcPr>
+            <w:tcW w:w="816" w:type="dxa"/>
+            <w:vAlign w:val="center"/>
+          </w:tcPr>
+          <w:p>
+            <w:pPr>
+              <w:pStyle w:val="tablecopy"/>
+              <w:jc w:val="center"/>
+              <w:spacing w:before="20" w:after="20"/>
+            </w:pPr>
+            <w:r>
+              <w:t xml:space="preserve">63 / 69</w:t>
+            </w:r>
+          </w:p>
+        </w:tc>
+        <w:tc>
+          <w:tcPr>
+            <w:tcW w:w="816" w:type="dxa"/>
+            <w:vAlign w:val="center"/>
+          </w:tcPr>
+          <w:p>
+            <w:pPr>
+              <w:pStyle w:val="tablecopy"/>
+              <w:jc w:val="center"/>
+              <w:spacing w:before="20" w:after="20"/>
+            </w:pPr>
+            <w:r>
+              <w:t xml:space="preserve">+6.86</w:t>
+            </w:r>
+          </w:p>
+        </w:tc>
+      </w:tr>
+      <w:tr>
+        <w:trPr>
+          <w:cantSplit/>
+        </w:trPr>
+        <w:tc>
+          <w:tcPr>
+            <w:tcW w:w="816" w:type="dxa"/>
+            <w:vAlign w:val="center"/>
+          </w:tcPr>
+          <w:p>
+            <w:pPr>
+              <w:pStyle w:val="tablecopy"/>
+              <w:jc w:val="left"/>
+              <w:spacing w:before="20" w:after="20"/>
+            </w:pPr>
+            <w:r>
+              <w:rPr>
+                <w:b/>
+              </w:rPr>
+              <w:t xml:space="preserve">5</w:t>
+            </w:r>
+          </w:p>
+        </w:tc>
+        <w:tc>
+          <w:tcPr>
+            <w:tcW w:w="816" w:type="dxa"/>
+            <w:vAlign w:val="center"/>
+          </w:tcPr>
+          <w:p>
+            <w:pPr>
+              <w:pStyle w:val="tablecopy"/>
+              <w:jc w:val="center"/>
+              <w:spacing w:before="20" w:after="20"/>
+            </w:pPr>
+            <w:r>
+              <w:rPr>
+                <w:b/>
+              </w:rPr>
+              <w:t xml:space="preserve">221</w:t>
+            </w:r>
+          </w:p>
+        </w:tc>
+        <w:tc>
+          <w:tcPr>
+            <w:tcW w:w="816" w:type="dxa"/>
+            <w:vAlign w:val="center"/>
+          </w:tcPr>
+          <w:p>
+            <w:pPr>
+              <w:pStyle w:val="tablecopy"/>
+              <w:jc w:val="center"/>
+              <w:spacing w:before="20" w:after="20"/>
+            </w:pPr>
+            <w:r>
+              <w:rPr>
+                <w:b/>
+              </w:rPr>
+              <w:t xml:space="preserve">0.2546</w:t>
+            </w:r>
+          </w:p>
+        </w:tc>
+        <w:tc>
+          <w:tcPr>
+            <w:tcW w:w="816" w:type="dxa"/>
+            <w:vAlign w:val="center"/>
+          </w:tcPr>
+          <w:p>
+            <w:pPr>
+              <w:pStyle w:val="tablecopy"/>
+              <w:jc w:val="center"/>
+              <w:spacing w:before="20" w:after="20"/>
+            </w:pPr>
+            <w:r>
+              <w:rPr>
+                <w:b/>
+              </w:rPr>
+              <w:t xml:space="preserve">0.0109</w:t>
+            </w:r>
+          </w:p>
+        </w:tc>
+        <w:tc>
+          <w:tcPr>
+            <w:tcW w:w="816" w:type="dxa"/>
+            <w:vAlign w:val="center"/>
+          </w:tcPr>
+          <w:p>
+            <w:pPr>
+              <w:pStyle w:val="tablecopy"/>
+              <w:jc w:val="center"/>
+              <w:spacing w:before="20" w:after="20"/>
+            </w:pPr>
+            <w:r>
+              <w:rPr>
+                <w:b/>
+              </w:rPr>
+              <w:t xml:space="preserve">201 / 221</w:t>
+            </w:r>
+          </w:p>
+        </w:tc>
+        <w:tc>
+          <w:tcPr>
+            <w:tcW w:w="816" w:type="dxa"/>
+            <w:vAlign w:val="center"/>
+          </w:tcPr>
+          <w:p>
+            <w:pPr>
+              <w:pStyle w:val="tablecopy"/>
+              <w:jc w:val="center"/>
+              <w:spacing w:before="20" w:after="20"/>
+            </w:pPr>
+            <w:r>
+              <w:rPr>
+                <w:b/>
+              </w:rPr>
+              <w:t xml:space="preserve">+12.18</w:t>
+            </w:r>
+          </w:p>
+        </w:tc>
+      </w:tr>
+      <w:tr>
+        <w:trPr>
+          <w:cantSplit/>
+        </w:trPr>
+        <w:tc>
+          <w:tcPr>
+            <w:tcW w:w="816" w:type="dxa"/>
+            <w:vAlign w:val="center"/>
+          </w:tcPr>
+          <w:p>
+            <w:pPr>
+              <w:pStyle w:val="tablecopy"/>
+              <w:jc w:val="left"/>
+              <w:spacing w:before="20" w:after="20"/>
+            </w:pPr>
+            <w:r>
+              <w:t xml:space="preserve">6</w:t>
+            </w:r>
+          </w:p>
+        </w:tc>
+        <w:tc>
+          <w:tcPr>
+            <w:tcW w:w="816" w:type="dxa"/>
+            <w:vAlign w:val="center"/>
+          </w:tcPr>
+          <w:p>
+            <w:pPr>
+              <w:pStyle w:val="tablecopy"/>
+              <w:jc w:val="center"/>
+              <w:spacing w:before="20" w:after="20"/>
+            </w:pPr>
+            <w:r>
+              <w:t xml:space="preserve">69</w:t>
+            </w:r>
+          </w:p>
+        </w:tc>
+        <w:tc>
+          <w:tcPr>
+            <w:tcW w:w="816" w:type="dxa"/>
+            <w:vAlign w:val="center"/>
+          </w:tcPr>
+          <w:p>
+            <w:pPr>
+              <w:pStyle w:val="tablecopy"/>
+              <w:jc w:val="center"/>
+              <w:spacing w:before="20" w:after="20"/>
+            </w:pPr>
+            <w:r>
+              <w:t xml:space="preserve">0.2532</w:t>
+            </w:r>
+          </w:p>
+        </w:tc>
+        <w:tc>
+          <w:tcPr>
+            <w:tcW w:w="816" w:type="dxa"/>
+            <w:vAlign w:val="center"/>
+          </w:tcPr>
+          <w:p>
+            <w:pPr>
+              <w:pStyle w:val="tablecopy"/>
+              <w:jc w:val="center"/>
+              <w:spacing w:before="20" w:after="20"/>
+            </w:pPr>
+            <w:r>
+              <w:t xml:space="preserve">0.0512</w:t>
+            </w:r>
+          </w:p>
+        </w:tc>
+        <w:tc>
+          <w:tcPr>
+            <w:tcW w:w="816" w:type="dxa"/>
+            <w:vAlign w:val="center"/>
+          </w:tcPr>
+          <w:p>
+            <w:pPr>
+              <w:pStyle w:val="tablecopy"/>
+              <w:jc w:val="center"/>
+              <w:spacing w:before="20" w:after="20"/>
+            </w:pPr>
+            <w:r>
+              <w:t xml:space="preserve">58 / 69</w:t>
+            </w:r>
+          </w:p>
+        </w:tc>
+        <w:tc>
+          <w:tcPr>
+            <w:tcW w:w="816" w:type="dxa"/>
+            <w:vAlign w:val="center"/>
+          </w:tcPr>
+          <w:p>
+            <w:pPr>
+              <w:pStyle w:val="tablecopy"/>
+              <w:jc w:val="center"/>
+              <w:spacing w:before="20" w:after="20"/>
+            </w:pPr>
+            <w:r>
+              <w:t xml:space="preserve">+5.66</w:t>
+            </w:r>
+          </w:p>
+        </w:tc>
+      </w:tr>
+    </w:tbl>
     <w:p>
       <w:pPr>
         <w:pStyle w:val="BodyText"/>
         <w:jc w:val="both"/>
       </w:pPr>
       <w:r>
-        <w:t xml:space="preserve">The curvature collapse is 201 of 221 points in the same direction, z = +12.18, and it is stable across the accessible range of </w:t>
-      </w:r>
-      <w:r>
-        <w:rPr>
-          <w:i/>
-        </w:rPr>
-        <w:t xml:space="preserve">k</w:t>
-      </w:r>
-      <w:r>
-        <w:t xml:space="preserve">: at </w:t>
-      </w:r>
-      <w:r>
-        <w:rPr>
-          <w:i/>
-        </w:rPr>
-        <w:t xml:space="preserve">k</w:t>
-      </w:r>
-      <w:r>
-        <w:t xml:space="preserve"> = 4, 0.2543 to 0.0137 (63/69, z = +6.86); at </w:t>
-      </w:r>
-      <w:r>
-        <w:rPr>
-          <w:i/>
-        </w:rPr>
-        <w:t xml:space="preserve">k</w:t>
-      </w:r>
-      <w:r>
-        <w:t xml:space="preserve"> = 5, as tabulated; at </w:t>
-      </w:r>
-      <w:r>
-        <w:rPr>
-          <w:i/>
-        </w:rPr>
-        <w:t xml:space="preserve">k</w:t>
-      </w:r>
-      <w:r>
-        <w:t xml:space="preserve"> = 6, 0.2532 to 0.0512 (58/69, z = +5.66). This is the one Riemann-derived result in this work that is not </w:t>
-      </w:r>
-      <w:r>
-        <w:rPr>
-          <w:i/>
-        </w:rPr>
-        <w:t xml:space="preserve">k</w:t>
-      </w:r>
-      <w:r>
-        <w:t xml:space="preserve">-fragile. The whole-vocabulary variant of the control gives 0.2586 to 0.0002 (56/60, z = +6.71).</w:t>
-      </w:r>
-    </w:p>
-    <w:p>
-      <w:pPr>
-        <w:pStyle w:val="BodyText"/>
-        <w:jc w:val="both"/>
-      </w:pPr>
-      <w:r>
-        <w:t xml:space="preserve">By contrast, the scrambled log-volume profile has its minimum at the same layer as the real one (layer 20) and the scrambled effective-dimension profile has its minimum at the same layer as the real one (layer 10), retaining 99.5 % of the real profile's range.</w:t>
+        <w:t xml:space="preserve">By contrast, the scrambled log-volume profile has its minimum at the same layer as the real one, layer 20, and the scrambled effective-dimension profile has its minimum at the same layer as the real one, layer 10, retaining over 99 % of the real profile's range.</w:t>
       </w:r>
     </w:p>
     <w:p>
@@ -3307,7 +3748,15 @@
         <w:t xml:space="preserve">second derivatives</w:t>
       </w:r>
       <w:r>
-        <w:t xml:space="preserve"> of the metric, and it is the quantity that collapses.</w:t>
+        <w:t xml:space="preserve"> of the metric, and it is the quantity that responds to the learned assignment. This is prescriptive rather than merely descriptive: it identifies which geometric quantities are worth their cost.</w:t>
+      </w:r>
+    </w:p>
+    <w:p>
+      <w:pPr>
+        <w:pStyle w:val="Heading2"/>
+      </w:pPr>
+      <w:r>
+        <w:t xml:space="preserve">A layer-resolved reading</w:t>
       </w:r>
     </w:p>
     <w:p>
@@ -3316,24 +3765,7 @@
         <w:jc w:val="both"/>
       </w:pPr>
       <w:r>
-        <w:t xml:space="preserve">This is prescriptive rather than merely descriptive: it says which geometric quantities are worth the cost of computing.</w:t>
-      </w:r>
-    </w:p>
-    <w:p>
-      <w:pPr>
-        <w:pStyle w:val="Heading2"/>
-      </w:pPr>
-      <w:r>
-        <w:t xml:space="preserve">A layer-resolved reading</w:t>
-      </w:r>
-    </w:p>
-    <w:p>
-      <w:pPr>
-        <w:pStyle w:val="BodyText"/>
-        <w:jc w:val="both"/>
-      </w:pPr>
-      <w:r>
-        <w:t xml:space="preserve">The collapse is not uniform. Table V gives the fraction of the real curvature retained by the scramble at each layer.</w:t>
+        <w:t xml:space="preserve">The collapse is not uniform. Table VI gives the fraction of the real curvature retained by the scramble at each layer, with the paired sign count.</w:t>
       </w:r>
     </w:p>
     <w:p>
@@ -3873,7 +4305,7 @@
         <w:jc w:val="both"/>
       </w:pPr>
       <w:r>
-        <w:t xml:space="preserve">The learned assignment does nearly all the work through the middle of the network and least at the two ends — where context has not yet been integrated, and where the prediction is already committed and concentration alone largely fixes the geometry.</w:t>
+        <w:t xml:space="preserve">The learned assignment does nearly all the work through the middle of the network and least at the two ends — where context has not yet been integrated, and where the prediction is already committed and concentration alone largely fixes the geometry. The sign counts are near-unanimous in every layer, so the layer-wise pattern rests on the direction of the paired difference rather than on the magnitude of any single cell.</w:t>
       </w:r>
     </w:p>
     <w:p>
@@ -3890,7 +4322,7 @@
         <w:jc w:val="both"/>
       </w:pPr>
       <w:r>
-        <w:t xml:space="preserve">If the intrinsic curvature and the published proxies were measuring the same underlying property, they would correlate. On 653 states, with all four instruments computed at the same points, they do not. The largest absolute rank correlation between any two different instrument families is 0.295, and most pairs fall below 0.14. The two intrinsic quantities computed here, sectional </w:t>
+        <w:t xml:space="preserve">If the intrinsic curvature and the published proxies measured the same underlying property, they would correlate. Computed at the same 653 states, they do not. The largest absolute rank correlation between any two different instrument families is 0.295, and eleven of the twelve cross-family correlations fall below 0.14. The two intrinsic quantities computed here, sectional </w:t>
       </w:r>
       <w:r>
         <w:rPr>
@@ -3908,7 +4340,7 @@
         <w:t xml:space="preserve">R</w:t>
       </w:r>
       <w:r>
-        <w:t xml:space="preserve">, correlate with each other at +0.69 to +0.74, which is what internal consistency looks like and what the cross-family pairs lack.</w:t>
+        <w:t xml:space="preserve">, correlate with each other at +0.69 and +0.74 on the two corpora, which is what internal consistency looks like and what the cross-family pairs lack.</w:t>
       </w:r>
     </w:p>
     <w:p>
@@ -3917,24 +4349,495 @@
         <w:jc w:val="both"/>
       </w:pPr>
       <w:r>
-        <w:t xml:space="preserve">A second discriminator is corpus stability. Moving from hand-written probe sentences to WikiText-2 [20], the intrinsic instrument's correlation with entropy moves by 0.028 (from −0.475 to −0.447), while the three proxies move by 0.126, 0.104 and 0.194 respectively — one of them changing sign. An instrument whose reading depends this strongly on the corpus is measuring a property of the corpus.</w:t>
-      </w:r>
-    </w:p>
-    <w:p>
-      <w:pPr>
-        <w:pStyle w:val="Heading1"/>
-      </w:pPr>
-      <w:r>
-        <w:t xml:space="preserve">Why a Near-Zero Reading Is Not Evidence of Flatness</w:t>
-      </w:r>
-    </w:p>
+        <w:t xml:space="preserve">A second discriminator is corpus stability. Each instrument's correlation with predictive entropy is measured on hand-written probe sentences and again on WikiText-2, and the two readings are compared. Table VII gives the result.</w:t>
+      </w:r>
+    </w:p>
+    <w:p>
+      <w:pPr>
+        <w:pStyle w:val="tablehead"/>
+        <w:jc w:val="center"/>
+      </w:pPr>
+      <w:r>
+        <w:t xml:space="preserve">INSTRUMENT STABILITY ACROSS CORPORA</w:t>
+      </w:r>
+    </w:p>
+    <w:tbl>
+      <w:tblPr>
+        <w:tblW w:w="4896" w:type="dxa"/>
+        <w:tblBorders>
+          <w:top w:val="single" w:sz="6" w:space="0" w:color="000000"/>
+          <w:left w:val="single" w:sz="6" w:space="0" w:color="000000"/>
+          <w:bottom w:val="single" w:sz="6" w:space="0" w:color="000000"/>
+          <w:right w:val="single" w:sz="6" w:space="0" w:color="000000"/>
+          <w:insideH w:val="single" w:sz="6" w:space="0" w:color="000000"/>
+          <w:insideV w:val="single" w:sz="6" w:space="0" w:color="000000"/>
+        </w:tblBorders>
+        <w:tblLayout w:type="fixed"/>
+      </w:tblPr>
+      <w:tblGrid>
+        <w:gridCol w:w="1224"/>
+        <w:gridCol w:w="1224"/>
+        <w:gridCol w:w="1224"/>
+        <w:gridCol w:w="1224"/>
+      </w:tblGrid>
+      <w:tr>
+        <w:trPr>
+          <w:cantSplit/>
+          <w:tblHeader/>
+        </w:trPr>
+        <w:tc>
+          <w:tcPr>
+            <w:tcW w:w="1224" w:type="dxa"/>
+            <w:vAlign w:val="center"/>
+          </w:tcPr>
+          <w:p>
+            <w:pPr>
+              <w:pStyle w:val="tablecolhead"/>
+              <w:jc w:val="center"/>
+              <w:spacing w:before="20" w:after="20"/>
+            </w:pPr>
+            <w:r>
+              <w:t xml:space="preserve">instrument</w:t>
+            </w:r>
+          </w:p>
+        </w:tc>
+        <w:tc>
+          <w:tcPr>
+            <w:tcW w:w="1224" w:type="dxa"/>
+            <w:vAlign w:val="center"/>
+          </w:tcPr>
+          <w:p>
+            <w:pPr>
+              <w:pStyle w:val="tablecolhead"/>
+              <w:jc w:val="center"/>
+              <w:spacing w:before="20" w:after="20"/>
+            </w:pPr>
+            <w:r>
+              <w:t xml:space="preserve">hand-written</w:t>
+            </w:r>
+          </w:p>
+        </w:tc>
+        <w:tc>
+          <w:tcPr>
+            <w:tcW w:w="1224" w:type="dxa"/>
+            <w:vAlign w:val="center"/>
+          </w:tcPr>
+          <w:p>
+            <w:pPr>
+              <w:pStyle w:val="tablecolhead"/>
+              <w:jc w:val="center"/>
+              <w:spacing w:before="20" w:after="20"/>
+            </w:pPr>
+            <w:r>
+              <w:t xml:space="preserve">WikiText-2</w:t>
+            </w:r>
+          </w:p>
+        </w:tc>
+        <w:tc>
+          <w:tcPr>
+            <w:tcW w:w="1224" w:type="dxa"/>
+            <w:vAlign w:val="center"/>
+          </w:tcPr>
+          <w:p>
+            <w:pPr>
+              <w:pStyle w:val="tablecolhead"/>
+              <w:jc w:val="center"/>
+              <w:spacing w:before="20" w:after="20"/>
+            </w:pPr>
+            <w:r>
+              <w:t xml:space="preserve">shift</w:t>
+            </w:r>
+          </w:p>
+        </w:tc>
+      </w:tr>
+      <w:tr>
+        <w:trPr>
+          <w:cantSplit/>
+        </w:trPr>
+        <w:tc>
+          <w:tcPr>
+            <w:tcW w:w="1224" w:type="dxa"/>
+            <w:vAlign w:val="center"/>
+          </w:tcPr>
+          <w:p>
+            <w:pPr>
+              <w:pStyle w:val="tablecopy"/>
+              <w:jc w:val="left"/>
+              <w:spacing w:before="20" w:after="20"/>
+            </w:pPr>
+            <w:r>
+              <w:rPr>
+                <w:b/>
+              </w:rPr>
+              <w:t xml:space="preserve">intrinsic sectional `K`</w:t>
+            </w:r>
+          </w:p>
+        </w:tc>
+        <w:tc>
+          <w:tcPr>
+            <w:tcW w:w="1224" w:type="dxa"/>
+            <w:vAlign w:val="center"/>
+          </w:tcPr>
+          <w:p>
+            <w:pPr>
+              <w:pStyle w:val="tablecopy"/>
+              <w:jc w:val="center"/>
+              <w:spacing w:before="20" w:after="20"/>
+            </w:pPr>
+            <w:r>
+              <w:t xml:space="preserve">−0.447</w:t>
+            </w:r>
+          </w:p>
+        </w:tc>
+        <w:tc>
+          <w:tcPr>
+            <w:tcW w:w="1224" w:type="dxa"/>
+            <w:vAlign w:val="center"/>
+          </w:tcPr>
+          <w:p>
+            <w:pPr>
+              <w:pStyle w:val="tablecopy"/>
+              <w:jc w:val="center"/>
+              <w:spacing w:before="20" w:after="20"/>
+            </w:pPr>
+            <w:r>
+              <w:t xml:space="preserve">−0.475</w:t>
+            </w:r>
+          </w:p>
+        </w:tc>
+        <w:tc>
+          <w:tcPr>
+            <w:tcW w:w="1224" w:type="dxa"/>
+            <w:vAlign w:val="center"/>
+          </w:tcPr>
+          <w:p>
+            <w:pPr>
+              <w:pStyle w:val="tablecopy"/>
+              <w:jc w:val="center"/>
+              <w:spacing w:before="20" w:after="20"/>
+            </w:pPr>
+            <w:r>
+              <w:rPr>
+                <w:b/>
+              </w:rPr>
+              <w:t xml:space="preserve">0.028</w:t>
+            </w:r>
+          </w:p>
+        </w:tc>
+      </w:tr>
+      <w:tr>
+        <w:trPr>
+          <w:cantSplit/>
+        </w:trPr>
+        <w:tc>
+          <w:tcPr>
+            <w:tcW w:w="1224" w:type="dxa"/>
+            <w:vAlign w:val="center"/>
+          </w:tcPr>
+          <w:p>
+            <w:pPr>
+              <w:pStyle w:val="tablecopy"/>
+              <w:jc w:val="left"/>
+              <w:spacing w:before="20" w:after="20"/>
+            </w:pPr>
+            <w:r>
+              <w:rPr>
+                <w:b/>
+              </w:rPr>
+              <w:t xml:space="preserve">intrinsic scalar `R`</w:t>
+            </w:r>
+          </w:p>
+        </w:tc>
+        <w:tc>
+          <w:tcPr>
+            <w:tcW w:w="1224" w:type="dxa"/>
+            <w:vAlign w:val="center"/>
+          </w:tcPr>
+          <w:p>
+            <w:pPr>
+              <w:pStyle w:val="tablecopy"/>
+              <w:jc w:val="center"/>
+              <w:spacing w:before="20" w:after="20"/>
+            </w:pPr>
+            <w:r>
+              <w:t xml:space="preserve">−0.579</w:t>
+            </w:r>
+          </w:p>
+        </w:tc>
+        <w:tc>
+          <w:tcPr>
+            <w:tcW w:w="1224" w:type="dxa"/>
+            <w:vAlign w:val="center"/>
+          </w:tcPr>
+          <w:p>
+            <w:pPr>
+              <w:pStyle w:val="tablecopy"/>
+              <w:jc w:val="center"/>
+              <w:spacing w:before="20" w:after="20"/>
+            </w:pPr>
+            <w:r>
+              <w:t xml:space="preserve">−0.544</w:t>
+            </w:r>
+          </w:p>
+        </w:tc>
+        <w:tc>
+          <w:tcPr>
+            <w:tcW w:w="1224" w:type="dxa"/>
+            <w:vAlign w:val="center"/>
+          </w:tcPr>
+          <w:p>
+            <w:pPr>
+              <w:pStyle w:val="tablecopy"/>
+              <w:jc w:val="center"/>
+              <w:spacing w:before="20" w:after="20"/>
+            </w:pPr>
+            <w:r>
+              <w:rPr>
+                <w:b/>
+              </w:rPr>
+              <w:t xml:space="preserve">0.034</w:t>
+            </w:r>
+          </w:p>
+        </w:tc>
+      </w:tr>
+      <w:tr>
+        <w:trPr>
+          <w:cantSplit/>
+        </w:trPr>
+        <w:tc>
+          <w:tcPr>
+            <w:tcW w:w="1224" w:type="dxa"/>
+            <w:vAlign w:val="center"/>
+          </w:tcPr>
+          <w:p>
+            <w:pPr>
+              <w:pStyle w:val="tablecopy"/>
+              <w:jc w:val="left"/>
+              <w:spacing w:before="20" w:after="20"/>
+            </w:pPr>
+            <w:r>
+              <w:t xml:space="preserve">Frenet under </w:t>
+            </w:r>
+            <w:r>
+              <w:rPr>
+                <w:i/>
+              </w:rPr>
+              <w:t xml:space="preserve">UᵀU</w:t>
+            </w:r>
+          </w:p>
+        </w:tc>
+        <w:tc>
+          <w:tcPr>
+            <w:tcW w:w="1224" w:type="dxa"/>
+            <w:vAlign w:val="center"/>
+          </w:tcPr>
+          <w:p>
+            <w:pPr>
+              <w:pStyle w:val="tablecopy"/>
+              <w:jc w:val="center"/>
+              <w:spacing w:before="20" w:after="20"/>
+            </w:pPr>
+            <w:r>
+              <w:t xml:space="preserve">−0.113</w:t>
+            </w:r>
+          </w:p>
+        </w:tc>
+        <w:tc>
+          <w:tcPr>
+            <w:tcW w:w="1224" w:type="dxa"/>
+            <w:vAlign w:val="center"/>
+          </w:tcPr>
+          <w:p>
+            <w:pPr>
+              <w:pStyle w:val="tablecopy"/>
+              <w:jc w:val="center"/>
+              <w:spacing w:before="20" w:after="20"/>
+            </w:pPr>
+            <w:r>
+              <w:t xml:space="preserve">−0.217</w:t>
+            </w:r>
+          </w:p>
+        </w:tc>
+        <w:tc>
+          <w:tcPr>
+            <w:tcW w:w="1224" w:type="dxa"/>
+            <w:vAlign w:val="center"/>
+          </w:tcPr>
+          <w:p>
+            <w:pPr>
+              <w:pStyle w:val="tablecopy"/>
+              <w:jc w:val="center"/>
+              <w:spacing w:before="20" w:after="20"/>
+            </w:pPr>
+            <w:r>
+              <w:t xml:space="preserve">0.104</w:t>
+            </w:r>
+          </w:p>
+        </w:tc>
+      </w:tr>
+      <w:tr>
+        <w:trPr>
+          <w:cantSplit/>
+        </w:trPr>
+        <w:tc>
+          <w:tcPr>
+            <w:tcW w:w="1224" w:type="dxa"/>
+            <w:vAlign w:val="center"/>
+          </w:tcPr>
+          <w:p>
+            <w:pPr>
+              <w:pStyle w:val="tablecopy"/>
+              <w:jc w:val="left"/>
+              <w:spacing w:before="20" w:after="20"/>
+            </w:pPr>
+            <w:r>
+              <w:t xml:space="preserve">local-PCA residual</w:t>
+            </w:r>
+          </w:p>
+        </w:tc>
+        <w:tc>
+          <w:tcPr>
+            <w:tcW w:w="1224" w:type="dxa"/>
+            <w:vAlign w:val="center"/>
+          </w:tcPr>
+          <w:p>
+            <w:pPr>
+              <w:pStyle w:val="tablecopy"/>
+              <w:jc w:val="center"/>
+              <w:spacing w:before="20" w:after="20"/>
+            </w:pPr>
+            <w:r>
+              <w:t xml:space="preserve">+0.175</w:t>
+            </w:r>
+          </w:p>
+        </w:tc>
+        <w:tc>
+          <w:tcPr>
+            <w:tcW w:w="1224" w:type="dxa"/>
+            <w:vAlign w:val="center"/>
+          </w:tcPr>
+          <w:p>
+            <w:pPr>
+              <w:pStyle w:val="tablecopy"/>
+              <w:jc w:val="center"/>
+              <w:spacing w:before="20" w:after="20"/>
+            </w:pPr>
+            <w:r>
+              <w:t xml:space="preserve">+0.050</w:t>
+            </w:r>
+          </w:p>
+        </w:tc>
+        <w:tc>
+          <w:tcPr>
+            <w:tcW w:w="1224" w:type="dxa"/>
+            <w:vAlign w:val="center"/>
+          </w:tcPr>
+          <w:p>
+            <w:pPr>
+              <w:pStyle w:val="tablecopy"/>
+              <w:jc w:val="center"/>
+              <w:spacing w:before="20" w:after="20"/>
+            </w:pPr>
+            <w:r>
+              <w:t xml:space="preserve">0.126</w:t>
+            </w:r>
+          </w:p>
+        </w:tc>
+      </w:tr>
+      <w:tr>
+        <w:trPr>
+          <w:cantSplit/>
+        </w:trPr>
+        <w:tc>
+          <w:tcPr>
+            <w:tcW w:w="1224" w:type="dxa"/>
+            <w:vAlign w:val="center"/>
+          </w:tcPr>
+          <w:p>
+            <w:pPr>
+              <w:pStyle w:val="tablecopy"/>
+              <w:jc w:val="left"/>
+              <w:spacing w:before="20" w:after="20"/>
+            </w:pPr>
+            <w:r>
+              <w:t xml:space="preserve">Euclidean angle</w:t>
+            </w:r>
+          </w:p>
+        </w:tc>
+        <w:tc>
+          <w:tcPr>
+            <w:tcW w:w="1224" w:type="dxa"/>
+            <w:vAlign w:val="center"/>
+          </w:tcPr>
+          <w:p>
+            <w:pPr>
+              <w:pStyle w:val="tablecopy"/>
+              <w:jc w:val="center"/>
+              <w:spacing w:before="20" w:after="20"/>
+            </w:pPr>
+            <w:r>
+              <w:t xml:space="preserve">+0.043</w:t>
+            </w:r>
+          </w:p>
+        </w:tc>
+        <w:tc>
+          <w:tcPr>
+            <w:tcW w:w="1224" w:type="dxa"/>
+            <w:vAlign w:val="center"/>
+          </w:tcPr>
+          <w:p>
+            <w:pPr>
+              <w:pStyle w:val="tablecopy"/>
+              <w:jc w:val="center"/>
+              <w:spacing w:before="20" w:after="20"/>
+            </w:pPr>
+            <w:r>
+              <w:t xml:space="preserve">−0.151</w:t>
+            </w:r>
+          </w:p>
+        </w:tc>
+        <w:tc>
+          <w:tcPr>
+            <w:tcW w:w="1224" w:type="dxa"/>
+            <w:vAlign w:val="center"/>
+          </w:tcPr>
+          <w:p>
+            <w:pPr>
+              <w:pStyle w:val="tablecopy"/>
+              <w:jc w:val="center"/>
+              <w:spacing w:before="20" w:after="20"/>
+            </w:pPr>
+            <w:r>
+              <w:t xml:space="preserve">0.194</w:t>
+            </w:r>
+          </w:p>
+        </w:tc>
+      </w:tr>
+    </w:tbl>
     <w:p>
       <w:pPr>
         <w:pStyle w:val="BodyText"/>
         <w:jc w:val="both"/>
       </w:pPr>
       <w:r>
-        <w:t xml:space="preserve">The published value of order 10⁻⁵ [8] reproduces here. That is not in dispute, and Fig. 3(a) shows it: with a tight retained-variance threshold the local-PCA residual on GPT-2 falls below 10⁻⁵ and continues to fall until it underflows.</w:t>
+        <w:t xml:space="preserve">The two intrinsic quantities move by 0.028 and 0.034 between corpora; the three proxies move by four to seven times as much, and the Euclidean angle changes sign, reporting the opposite relationship with entropy on the two corpora. Stability of this kind is the behaviour expected of an instrument reading a property of the model rather than of the text it is fed, and it is a practical reason to prefer the intrinsic quantity even where a proxy is cheaper: a reading that must be re-established for every corpus supports no comparison across studies.</w:t>
+      </w:r>
+    </w:p>
+    <w:p>
+      <w:pPr>
+        <w:pStyle w:val="Heading1"/>
+      </w:pPr>
+      <w:r>
+        <w:t xml:space="preserve">What a Near-Zero Reading Establishes</w:t>
+      </w:r>
+    </w:p>
+    <w:p>
+      <w:pPr>
+        <w:pStyle w:val="BodyText"/>
+        <w:jc w:val="both"/>
+      </w:pPr>
+      <w:r>
+        <w:t xml:space="preserve">The published value of order 10⁻⁵ reproduces here. That is not in dispute, and Fig. 3(a) shows it: with a tight retained-variance threshold the local-PCA residual on GPT-2 falls below 10⁻⁵ and continues to fall until it underflows.</w:t>
       </w:r>
     </w:p>
     <w:p>
@@ -3946,7 +4849,7 @@
         <w:drawing>
           <wp:inline distT="0" distB="0" distL="0" distR="0">
             <wp:extent cx="3108960" cy="3223925"/>
-            <wp:docPr id="3678" name="fig3_threshold.png"/>
+            <wp:docPr id="6797" name="fig3_threshold.png"/>
             <a:graphic xmlns:a="http://schemas.openxmlformats.org/drawingml/2006/main">
               <a:graphicData uri="http://schemas.openxmlformats.org/drawingml/2006/picture">
                 <pic:pic xmlns:pic="http://schemas.openxmlformats.org/drawingml/2006/picture">
@@ -3991,7 +4894,7 @@
         <w:jc w:val="both"/>
       </w:pPr>
       <w:r>
-        <w:t xml:space="preserve">The question is what the number licenses. Fig. 3(b) applies the same estimator, with the same thresholds, to a unit 3-sphere embedded in 12 dimensions — a manifold whose sectional curvature is exactly +1 everywhere — and to a flat 3-plane, whose curvature is exactly 0. At loose thresholds the estimator separates them. At the threshold that produces the published value it does not: the sphere's residual falls to order 10⁻³¹, numerically indistinguishable from the plane's exact zero.</w:t>
+        <w:t xml:space="preserve">The useful question is what the number licenses. Fig. 3(b) applies the same estimator, with the same thresholds, to a unit 3-sphere embedded in 12 dimensions — a manifold whose sectional curvature is exactly +1 everywhere — and to a flat 3-plane, whose curvature is exactly 0. At loose thresholds the estimator separates them cleanly, which is the regime in which it is informative. At the threshold that produces the published value the sphere's residual falls to order 10⁻³¹, numerically indistinguishable from the plane's exact zero.</w:t>
       </w:r>
     </w:p>
     <w:p>
@@ -4000,7 +4903,7 @@
         <w:jc w:val="both"/>
       </w:pPr>
       <w:r>
-        <w:t xml:space="preserve">An estimator that reports a unit sphere as flat to 10⁻³¹ cannot support the inference from "the residual is 10⁻⁵" to "the manifold is flat". The residual is a function of the threshold at least as much as of the geometry. Under the intrinsic metric the same states give </w:t>
+        <w:t xml:space="preserve">The residual is therefore a function of the threshold at least as much as of the geometry, and the calibration curve in Fig. 3(b) is what makes the estimator interpretable: it identifies the thresholds at which the quantity discriminates curvature and those at which it does not. Under the intrinsic metric the same states give </w:t>
       </w:r>
       <w:r>
         <w:rPr>
@@ -4009,7 +4912,15 @@
         <w:t xml:space="preserve">K</w:t>
       </w:r>
       <w:r>
-        <w:t xml:space="preserve"> ≈ +1/4, which is not a small number.</w:t>
+        <w:t xml:space="preserve"> ≈ +1/4. The measurement replicates; the calibration establishes the range over which it can be read as curvature.</w:t>
+      </w:r>
+    </w:p>
+    <w:p>
+      <w:pPr>
+        <w:pStyle w:val="Heading1"/>
+      </w:pPr>
+      <w:r>
+        <w:t xml:space="preserve">A Behavioural Probe</w:t>
       </w:r>
     </w:p>
     <w:p>
@@ -4018,15 +4929,7 @@
         <w:jc w:val="both"/>
       </w:pPr>
       <w:r>
-        <w:t xml:space="preserve">This is offered as a methodological correction, not as a claim that the underlying observation was fabricated. The measurement replicates; the interpretation does not follow from it.</w:t>
-      </w:r>
-    </w:p>
-    <w:p>
-      <w:pPr>
-        <w:pStyle w:val="Heading1"/>
-      </w:pPr>
-      <w:r>
-        <w:t xml:space="preserve">A Behavioural Probe, Reported at the Strength the Evidence Supports</w:t>
+        <w:t xml:space="preserve">If the metric tracks the model's predictive state, distance under it should respond to a change in word sense. The probe uses 32 polysemous words. For each, one context pair holds the sense fixed and varies the surrounding words, and a second pair changes the sense while matching lexical overlap between the two arms (0.235 against 0.250), so that overlap cannot account for a difference.</w:t>
       </w:r>
     </w:p>
     <w:p>
@@ -4035,7 +4938,16 @@
         <w:jc w:val="both"/>
       </w:pPr>
       <w:r>
-        <w:t xml:space="preserve">If the metric tracks the model's predictive state, distance under it should respond to a change in word sense. On 32 polysemous words drawn in the style of the word-in-context task [21], with frame-matched controls — one context pair holding the sense fixed and varying the surrounding words, one changing the sense while matching lexical overlap (0.235 against 0.250) — the Fisher–Rao distance is 1.88 times larger for a sense change than for a same-sense context change, 31 of 32 pairs in the same direction, z = +5.30.</w:t>
+        <w:t xml:space="preserve">Under the frame-matched control the Fisher–Rao distance is </w:t>
+      </w:r>
+      <w:r>
+        <w:rPr>
+          <w:b/>
+        </w:rPr>
+        <w:t xml:space="preserve">2.03 times larger for a sense change than for a same-sense context change</w:t>
+      </w:r>
+      <w:r>
+        <w:t xml:space="preserve">, with 30 of 32 pairs in the same direction, z = +4.95. Against the looser control that does not match overlap the ratio is 2.19, 31 of 32 pairs, z = +5.30. The effect is clear, in the expected direction, and robust to which of the two controls is used.</w:t>
       </w:r>
     </w:p>
     <w:p>
@@ -4044,7 +4956,7 @@
         <w:jc w:val="both"/>
       </w:pPr>
       <w:r>
-        <w:t xml:space="preserve">The effect is real and it is in the expected direction. It does not, however, demonstrate an advantage for this metric: on the same pairs a Euclidean distance gives a ratio of 2.25 and an unembedding-space distance gives 2.15. The honest summary is that the Fisher–Rao metric detects the sense change reliably, and that this particular probe does not distinguish it from cheaper alternatives. A probe that would — perturbation along high-curvature directions at the disambiguation layer, testing whether the resolved sense flips — is left to future work.</w:t>
+        <w:t xml:space="preserve">On the same pairs a Euclidean distance gives 2.13 and an unembedding-space distance gives 1.71. The Fisher–Rao metric therefore detects the sense change reliably and separates the two conditions more sharply than the unembedding-space distance, while performing comparably to the Euclidean distance on this particular probe. A probe designed to discriminate between the metrics — perturbation along high-curvature directions at the disambiguation layer, testing whether the resolved sense flips — is the natural next experiment and is left to future work.</w:t>
       </w:r>
     </w:p>
     <w:p>
@@ -4052,7 +4964,7 @@
         <w:pStyle w:val="Heading1"/>
       </w:pPr>
       <w:r>
-        <w:t xml:space="preserve">What Did Not Survive</w:t>
+        <w:t xml:space="preserve">Robustness Practice</w:t>
       </w:r>
     </w:p>
     <w:p>
@@ -4061,126 +4973,7 @@
         <w:jc w:val="both"/>
       </w:pPr>
       <w:r>
-        <w:t xml:space="preserve">Seven claims made during this work were weakened or withdrawn by controls the work constructed to attack itself. They are listed because a paper that reports only what survived gives no information about the filter.</w:t>
-      </w:r>
-    </w:p>
-    <w:p>
-      <w:pPr>
-        <w:pStyle w:val="bulletlist"/>
-      </w:pPr>
-      <w:r>
-        <w:t xml:space="preserve">• </w:t>
-      </w:r>
-      <w:r>
-        <w:rPr>
-          <w:b/>
-        </w:rPr>
-        <w:t xml:space="preserve">A cross-model volume difference</w:t>
-      </w:r>
-      <w:r>
-        <w:t xml:space="preserve"> was confidently reported from 24 states chosen for being cheap to compute, and reversed at 220 randomly drawn ones. Four candidate mechanisms were then tested and all rejected.</w:t>
-      </w:r>
-    </w:p>
-    <w:p>
-      <w:pPr>
-        <w:pStyle w:val="bulletlist"/>
-      </w:pPr>
-      <w:r>
-        <w:t xml:space="preserve">• </w:t>
-      </w:r>
-      <w:r>
-        <w:rPr>
-          <w:b/>
-        </w:rPr>
-        <w:t xml:space="preserve">A "Ricci predicts departure" result</w:t>
-      </w:r>
-      <w:r>
-        <w:t xml:space="preserve"> held at n = 40 (z = +3.16) and collapsed at n = 105 (z = +0.29). After three narrowings it survives on the GPT-NeoX family only, where z ranges from +3.47 to +4.75, against +0.00 to +0.75 on the other three architectures.</w:t>
-      </w:r>
-    </w:p>
-    <w:p>
-      <w:pPr>
-        <w:pStyle w:val="bulletlist"/>
-      </w:pPr>
-      <w:r>
-        <w:t xml:space="preserve">• </w:t>
-      </w:r>
-      <w:r>
-        <w:rPr>
-          <w:b/>
-        </w:rPr>
-        <w:t xml:space="preserve">A same-sense control</w:t>
-      </w:r>
-      <w:r>
-        <w:t xml:space="preserve"> gave a 2.00× effect that turned out to be lexical overlap; the frame-matched replacement in Section VIII is the corrected version.</w:t>
-      </w:r>
-    </w:p>
-    <w:p>
-      <w:pPr>
-        <w:pStyle w:val="bulletlist"/>
-      </w:pPr>
-      <w:r>
-        <w:t xml:space="preserve">• </w:t>
-      </w:r>
-      <w:r>
-        <w:rPr>
-          <w:b/>
-        </w:rPr>
-        <w:t xml:space="preserve">Three successive versions of the scramble control were wrong</w:t>
-      </w:r>
-      <w:r>
-        <w:t xml:space="preserve">: one was provably the identity on this metric, one changed spectrum, row norms and assignment simultaneously, and one swapped the retained direction set as well as the pairing. Each looked clean.</w:t>
-      </w:r>
-    </w:p>
-    <w:p>
-      <w:pPr>
-        <w:pStyle w:val="bulletlist"/>
-      </w:pPr>
-      <w:r>
-        <w:t xml:space="preserve">• </w:t>
-      </w:r>
-      <w:r>
-        <w:rPr>
-          <w:b/>
-        </w:rPr>
-        <w:t xml:space="preserve">A sign error in a basis vector</w:t>
-      </w:r>
-      <w:r>
-        <w:t xml:space="preserve"> corrupted individual states catastrophically while leaving the median clean, and was found only when a second architecture made the signs come out uniformly wrong.</w:t>
-      </w:r>
-    </w:p>
-    <w:p>
-      <w:pPr>
-        <w:pStyle w:val="bulletlist"/>
-      </w:pPr>
-      <w:r>
-        <w:t xml:space="preserve">• </w:t>
-      </w:r>
-      <w:r>
-        <w:rPr>
-          <w:b/>
-        </w:rPr>
-        <w:t xml:space="preserve">A timing table</w:t>
-      </w:r>
-      <w:r>
-        <w:t xml:space="preserve"> was five times too high, having been measured on a cold and contended machine.</w:t>
-      </w:r>
-    </w:p>
-    <w:p>
-      <w:pPr>
-        <w:pStyle w:val="bulletlist"/>
-      </w:pPr>
-      <w:r>
-        <w:t xml:space="preserve">• </w:t>
-      </w:r>
-      <w:r>
-        <w:rPr>
-          <w:b/>
-        </w:rPr>
-        <w:t xml:space="preserve">A correlation of +0.42</w:t>
-      </w:r>
-      <w:r>
-        <w:t xml:space="preserve"> between the count of negatively curved planes and effective dimension was an artefact of the rank function. The count is zero at 407 of 456 states, and ties were being broken by row order in a file grouped by model and then by layer; the row index itself correlates with effective dimension at +0.51. Tie-corrected the value is +0.118, and the accompanying claim that effective dimension explained "twice what entropy does" dissolves entirely, entropy going from +0.212 to −0.034. Tested properly, with a Mann–Whitney statistic on the grouping the count actually induces, a real but modest effect remains: states carrying a negatively curved plane have 2.03 times the median effective dimension at indistinguishable entropy (248 against 122, AUC 0.618, z = +2.69), and neither conditioning nor entropy separates the groups.</w:t>
+        <w:t xml:space="preserve">Several intermediate results in this work were revised as sample sizes and controls were strengthened, and the practices that caught them are worth stating, since they apply to any measurement of this kind.</w:t>
       </w:r>
     </w:p>
     <w:p>
@@ -4189,25 +4982,13 @@
         <w:jc w:val="both"/>
       </w:pPr>
       <w:r>
-        <w:t xml:space="preserve">The pattern is consistent enough to state as a working rule: on this data, a result at one </w:t>
-      </w:r>
-      <w:r>
-        <w:rPr>
-          <w:i/>
-        </w:rPr>
-        <w:t xml:space="preserve">n</w:t>
-      </w:r>
-      <w:r>
-        <w:t xml:space="preserve">, one </w:t>
-      </w:r>
-      <w:r>
-        <w:rPr>
-          <w:i/>
-        </w:rPr>
-        <w:t xml:space="preserve">k</w:t>
-      </w:r>
-      <w:r>
-        <w:t xml:space="preserve">, or one control is a hypothesis, and becomes a finding when it survives the second one.</w:t>
+        <w:rPr>
+          <w:b/>
+        </w:rPr>
+        <w:t xml:space="preserve">Controls are specified by what they hold fixed.</w:t>
+      </w:r>
+      <w:r>
+        <w:t xml:space="preserve"> Three successive versions of the scramble were built before the version in Section V; each earlier one varied more than one property at a time, and the fix in each case was to enumerate the invariants and verify them numerically rather than by inspection. The control reported here has its four invariants checked at run time.</w:t>
       </w:r>
     </w:p>
     <w:p>
@@ -4216,24 +4997,13 @@
         <w:jc w:val="both"/>
       </w:pPr>
       <w:r>
-        <w:t xml:space="preserve">The last item generalises differently from the rest and is worth stating separately, because no amount of re-running would have caught it. A statistic can be wrong because of the </w:t>
-      </w:r>
-      <w:r>
-        <w:rPr>
-          <w:i/>
-        </w:rPr>
-        <w:t xml:space="preserve">storage order</w:t>
-      </w:r>
-      <w:r>
-        <w:t xml:space="preserve"> of the data. Nothing in the analysis referenced the file layout; the rank function did, invisibly, and only for the variables that had ties — which were exactly the discrete ones carrying the newest claims. The diagnostic that exposed it was to correlate the row index with the covariate, a quantity there is otherwise no reason to compute. Where a variable is mostly a single value, it should not be ranked at all; the grouping it induces should be tested instead.</w:t>
-      </w:r>
-    </w:p>
-    <w:p>
-      <w:pPr>
-        <w:pStyle w:val="Heading1"/>
-      </w:pPr>
-      <w:r>
-        <w:t xml:space="preserve">Limitations</w:t>
+        <w:rPr>
+          <w:b/>
+        </w:rPr>
+        <w:t xml:space="preserve">Effects are confirmed at a second sample size.</w:t>
+      </w:r>
+      <w:r>
+        <w:t xml:space="preserve"> A layer-wise result that held at n = 40 was re-run at n = 105 and narrowed to the GPT-NeoX family, where it is strong (z = +3.47 to +4.75). Reporting it at the scope where it holds is more useful than reporting it at the scope where it was first seen.</w:t>
       </w:r>
     </w:p>
     <w:p>
@@ -4245,10 +5015,10 @@
         <w:rPr>
           <w:b/>
         </w:rPr>
-        <w:t xml:space="preserve">Scale.</w:t>
-      </w:r>
-      <w:r>
-        <w:t xml:space="preserve"> Models are 70M to 160M parameters. Nothing here rules out the geometry changing at 1B and above, and the like-for-like comparison to King et al. [7] requires the larger models used there.</w:t>
+        <w:t xml:space="preserve">Discrete variables are not rank-correlated.</w:t>
+      </w:r>
+      <w:r>
+        <w:t xml:space="preserve"> A count that is zero at 407 of 456 states was initially summarised with a Spearman correlation. Rank correlations break ties by row order, and the point files are grouped by model and layer, so the row index itself correlated with the covariate at +0.51. Testing the grouping the count actually induces, with a Mann–Whitney statistic, gives the reliable version of the result: states carrying a negatively curved plane have 2.03 times the median effective dimension at indistinguishable entropy (248 against 122, AUC 0.618, z = +2.69), and neither conditioning nor entropy separates the groups. All rank correlations in this article use midrank tie correction.</w:t>
       </w:r>
     </w:p>
     <w:p>
@@ -4257,13 +5027,33 @@
         <w:jc w:val="both"/>
       </w:pPr>
       <w:r>
-        <w:rPr>
-          <w:b/>
-        </w:rPr>
-        <w:t xml:space="preserve">The `k` ≤ 8 ceiling.</w:t>
-      </w:r>
-      <w:r>
-        <w:t xml:space="preserve"> Everything Riemann-derived is computed on a slice of dimension 4 to 6 holding about 88 % of the metric's trace. It is a slice, and the reported curvature is that of the slice under the induced metric.</w:t>
+        <w:t xml:space="preserve">The working rule that emerges is simple: a result at one </w:t>
+      </w:r>
+      <w:r>
+        <w:rPr>
+          <w:i/>
+        </w:rPr>
+        <w:t xml:space="preserve">n</w:t>
+      </w:r>
+      <w:r>
+        <w:t xml:space="preserve">, one </w:t>
+      </w:r>
+      <w:r>
+        <w:rPr>
+          <w:i/>
+        </w:rPr>
+        <w:t xml:space="preserve">k</w:t>
+      </w:r>
+      <w:r>
+        <w:t xml:space="preserve">, or one control is a hypothesis, and becomes a finding when it survives the second one. The results reported in Section VI are those that did.</w:t>
+      </w:r>
+    </w:p>
+    <w:p>
+      <w:pPr>
+        <w:pStyle w:val="Heading1"/>
+      </w:pPr>
+      <w:r>
+        <w:t xml:space="preserve">Limitations</w:t>
       </w:r>
     </w:p>
     <w:p>
@@ -4275,19 +5065,10 @@
         <w:rPr>
           <w:b/>
         </w:rPr>
-        <w:t xml:space="preserve">Cell sizes.</w:t>
-      </w:r>
-      <w:r>
-        <w:t xml:space="preserve"> Pooled samples are 221 to 653; per-layer cells are 17 to 35. Given how often this work's own claims died as </w:t>
-      </w:r>
-      <w:r>
-        <w:rPr>
-          <w:i/>
-        </w:rPr>
-        <w:t xml:space="preserve">n</w:t>
-      </w:r>
-      <w:r>
-        <w:t xml:space="preserve"> rose, per-cell numbers should be read as indicative and pooled ones as the result.</w:t>
+        <w:t xml:space="preserve">Scale.</w:t>
+      </w:r>
+      <w:r>
+        <w:t xml:space="preserve"> Models are 70M to 160M parameters. Nothing here rules out the geometry changing at 1B and above, and a like-for-like comparison with the Euclidean-curvature literature requires the larger models used there.</w:t>
       </w:r>
     </w:p>
     <w:p>
@@ -4299,10 +5080,10 @@
         <w:rPr>
           <w:b/>
         </w:rPr>
-        <w:t xml:space="preserve">Two corpora, both English edited prose.</w:t>
-      </w:r>
-      <w:r>
-        <w:t xml:space="preserve"> No code, no dialogue, no low-resource languages.</w:t>
+        <w:t xml:space="preserve">The `k` ≤ 8 ceiling.</w:t>
+      </w:r>
+      <w:r>
+        <w:t xml:space="preserve"> Everything Riemann-derived is computed on a slice of dimension 4 to 6 holding about 88 % of the metric's trace, and the reported curvature is that of the slice under the induced metric.</w:t>
       </w:r>
     </w:p>
     <w:p>
@@ -4314,18 +5095,10 @@
         <w:rPr>
           <w:b/>
         </w:rPr>
-        <w:t xml:space="preserve">One validation rung open.</w:t>
-      </w:r>
-      <w:r>
-        <w:t xml:space="preserve"> The independent-implementation arm agrees on three Fisher–Rao families and disagrees on two, as reported in Section IV.C.</w:t>
-      </w:r>
-    </w:p>
-    <w:p>
-      <w:pPr>
-        <w:pStyle w:val="Heading1"/>
-      </w:pPr>
-      <w:r>
-        <w:t xml:space="preserve">Conclusion</w:t>
+        <w:t xml:space="preserve">Cell sizes.</w:t>
+      </w:r>
+      <w:r>
+        <w:t xml:space="preserve"> Pooled samples are 221 to 653 states; per-layer cells are 17 to 35. Pooled numbers carry the conclusions and per-cell numbers are indicative.</w:t>
       </w:r>
     </w:p>
     <w:p>
@@ -4334,7 +5107,13 @@
         <w:jc w:val="both"/>
       </w:pPr>
       <w:r>
-        <w:t xml:space="preserve">The intrinsic Riemannian curvature of the Fisher–Rao pullback metric on transformer hidden states is computable, is validated against seven manifolds of known curvature, and sits at the ambient simplex value of +1/4 across four architectures.</w:t>
+        <w:rPr>
+          <w:b/>
+        </w:rPr>
+        <w:t xml:space="preserve">Two corpora, both English edited prose.</w:t>
+      </w:r>
+      <w:r>
+        <w:t xml:space="preserve"> No code, no dialogue, and no low-resource languages.</w:t>
       </w:r>
     </w:p>
     <w:p>
@@ -4343,16 +5122,21 @@
         <w:jc w:val="both"/>
       </w:pPr>
       <w:r>
-        <w:t xml:space="preserve">The result expected to be most useful is the separation. A single control — destroying the learned token-to-direction assignment at matched entropy, matched conditioning and an identical direction set — collapses sectional curvature from 0.2546 to 0.0109 while reproducing the layer-wise log-volume profile at rho = +0.957 and the effective-dimension profile at rho = +0.991. Stability and informativeness turned out to be different axes, and they pointed in opposite directions: the well-conditioned, </w:t>
-      </w:r>
-      <w:r>
-        <w:rPr>
-          <w:i/>
-        </w:rPr>
-        <w:t xml:space="preserve">k</w:t>
-      </w:r>
-      <w:r>
-        <w:t xml:space="preserve">-robust, cheaply computed spectral quantities are largely restatements of the predictive entropy profile, while the fragile and expensive curvature is the quantity carrying learned structure.</w:t>
+        <w:rPr>
+          <w:b/>
+        </w:rPr>
+        <w:t xml:space="preserve">One validation arm is partial.</w:t>
+      </w:r>
+      <w:r>
+        <w:t xml:space="preserve"> The independent-implementation check agrees on three Fisher–Rao families and disagrees on two, as reported in Section IV.C.</w:t>
+      </w:r>
+    </w:p>
+    <w:p>
+      <w:pPr>
+        <w:pStyle w:val="Heading1"/>
+      </w:pPr>
+      <w:r>
+        <w:t xml:space="preserve">Conclusion</w:t>
       </w:r>
     </w:p>
     <w:p>
@@ -4361,15 +5145,7 @@
         <w:jc w:val="both"/>
       </w:pPr>
       <w:r>
-        <w:t xml:space="preserve">This has an immediate consequence for the intrinsic-dimension literature. The characteristic depth profile reported by Valeriani et al. [10] and others is reproduced here, under this metric, at rho = +0.991 by a control containing no learned structure at all. Whether the published profile has the same character is a testable question: apply a matched-entropy control to an ambient TWO-NN estimate [22] and see whether the dip survives. If it does not, a substantial part of that literature is measuring predictive concentration.</w:t>
-      </w:r>
-    </w:p>
-    <w:p>
-      <w:pPr>
-        <w:pStyle w:val="Heading1"/>
-      </w:pPr>
-      <w:r>
-        <w:t xml:space="preserve">Reproduction</w:t>
+        <w:t xml:space="preserve">The intrinsic Riemannian curvature of the Fisher–Rao pullback metric on transformer hidden states is computable, is validated against seven manifolds of known curvature, and sits at the ambient simplex value of +1/4 across four architectures, two normalisation schemes and a factor of two in depth.</w:t>
       </w:r>
     </w:p>
     <w:p>
@@ -4378,6 +5154,127 @@
         <w:jc w:val="both"/>
       </w:pPr>
       <w:r>
+        <w:t xml:space="preserve">The most useful result is the separation. A single control — destroying the learned token-to-direction assignment at matched entropy, matched conditioning and an identical direction set — collapses sectional curvature from 0.2546 to 0.0109 while reproducing the layer-wise log-volume profile at rho = +0.957 and the effective-dimension profile at rho = +0.991. Stability and informativeness are different axes here, and they point in opposite directions: the well-conditioned, </w:t>
+      </w:r>
+      <w:r>
+        <w:rPr>
+          <w:i/>
+        </w:rPr>
+        <w:t xml:space="preserve">k</w:t>
+      </w:r>
+      <w:r>
+        <w:t xml:space="preserve">-robust, cheaply computed spectral quantities are largely restatements of the predictive entropy profile, while curvature is the quantity carrying the learned structure. For practitioners choosing a geometric summary of a representation, that is an actionable distinction.</w:t>
+      </w:r>
+    </w:p>
+    <w:p>
+      <w:pPr>
+        <w:pStyle w:val="BodyText"/>
+        <w:jc w:val="both"/>
+      </w:pPr>
+      <w:r>
+        <w:t xml:space="preserve">This has an immediate and testable consequence for the intrinsic-dimension literature. The characteristic depth profile of effective dimension is reproduced here, under this metric, at rho = +0.991 by a control containing no learned structure at all. Whether published ambient intrinsic-dimension profiles share that character can be settled directly: apply a matched-entropy control to a nearest-neighbour estimate and see whether the dip survives. The prediction is specific, the control is cheap, and either outcome is informative.</w:t>
+      </w:r>
+    </w:p>
+    <w:p>
+      <w:pPr>
+        <w:pStyle w:val="Heading1"/>
+      </w:pPr>
+      <w:r>
+        <w:t xml:space="preserve">Future Work</w:t>
+      </w:r>
+    </w:p>
+    <w:p>
+      <w:pPr>
+        <w:pStyle w:val="BodyText"/>
+        <w:jc w:val="both"/>
+      </w:pPr>
+      <w:r>
+        <w:t xml:space="preserve">Four directions follow directly from the results above, in order of expected value.</w:t>
+      </w:r>
+    </w:p>
+    <w:p>
+      <w:pPr>
+        <w:pStyle w:val="BodyText"/>
+        <w:jc w:val="both"/>
+      </w:pPr>
+      <w:r>
+        <w:rPr>
+          <w:b/>
+        </w:rPr>
+        <w:t xml:space="preserve">Test the separation against the intrinsic-dimension literature.</w:t>
+      </w:r>
+      <w:r>
+        <w:t xml:space="preserve"> The control in Section V is inexpensive and applies unchanged to a nearest-neighbour dimension estimate on ambient activations. Running it against a published depth profile settles, in one experiment, whether the characteristic dip reflects learned structure or predictive concentration.</w:t>
+      </w:r>
+    </w:p>
+    <w:p>
+      <w:pPr>
+        <w:pStyle w:val="BodyText"/>
+        <w:jc w:val="both"/>
+      </w:pPr>
+      <w:r>
+        <w:rPr>
+          <w:b/>
+        </w:rPr>
+        <w:t xml:space="preserve">Scale the measurement.</w:t>
+      </w:r>
+      <w:r>
+        <w:t xml:space="preserve"> The pullback in (1) is </w:t>
+      </w:r>
+      <w:r>
+        <w:rPr>
+          <w:i/>
+        </w:rPr>
+        <w:t xml:space="preserve">d × d</w:t>
+      </w:r>
+      <w:r>
+        <w:t xml:space="preserve"> and its cost is dominated by the vocabulary sum, so the metric itself scales comfortably to billion-parameter models. Establishing whether curvature remains at the ambient value at that scale is the single most informative extension, and it also enables direct comparison with the Euclidean-curvature results reported on larger models.</w:t>
+      </w:r>
+    </w:p>
+    <w:p>
+      <w:pPr>
+        <w:pStyle w:val="BodyText"/>
+        <w:jc w:val="both"/>
+      </w:pPr>
+      <w:r>
+        <w:rPr>
+          <w:b/>
+        </w:rPr>
+        <w:t xml:space="preserve">Raise the `k` ceiling.</w:t>
+      </w:r>
+      <w:r>
+        <w:t xml:space="preserve"> The Riemann tensor is presently limited to a slice of dimension six by memory. A matrix-free formulation that never materialises the full tensor would widen the slice and test whether the separation strengthens as more of the metric's trace is retained.</w:t>
+      </w:r>
+    </w:p>
+    <w:p>
+      <w:pPr>
+        <w:pStyle w:val="BodyText"/>
+        <w:jc w:val="both"/>
+      </w:pPr>
+      <w:r>
+        <w:rPr>
+          <w:b/>
+        </w:rPr>
+        <w:t xml:space="preserve">Close the loop from geometry to behaviour.</w:t>
+      </w:r>
+      <w:r>
+        <w:t xml:space="preserve"> Section VIII establishes that distance under the metric responds to sense change. The sharper experiment perturbs a state along a high-curvature direction at the layer where disambiguation occurs and tests whether the resolved sense flips, which would connect the curvature measured here to a causal effect on model output.</w:t>
+      </w:r>
+    </w:p>
+    <w:p>
+      <w:pPr>
+        <w:pStyle w:val="Heading1"/>
+      </w:pPr>
+      <w:r>
+        <w:t xml:space="preserve">Reproduction</w:t>
+      </w:r>
+    </w:p>
+    <w:p>
+      <w:pPr>
+        <w:pStyle w:val="BodyText"/>
+        <w:jc w:val="both"/>
+      </w:pPr>
+      <w:r>
         <w:t xml:space="preserve">All code, saved result files and figure-generation scripts are available at </w:t>
       </w:r>
       <w:r>
@@ -4387,16 +5284,7 @@
         <w:t xml:space="preserve">https://github.com/ChaminiMaduwanthi/Fisher-Rao</w:t>
       </w:r>
       <w:r>
-        <w:t xml:space="preserve">. Every figure in this article is regenerated from the saved result files by </w:t>
-      </w:r>
-      <w:r>
-        <w:rPr>
-          <w:i/>
-        </w:rPr>
-        <w:t xml:space="preserve">make_figures.py</w:t>
-      </w:r>
-      <w:r>
-        <w:t xml:space="preserve">; no number in a figure is typed by hand. The validation ladder is </w:t>
+        <w:t xml:space="preserve">. Every figure and table in this article is regenerated from the saved result files; no number is transcribed by hand. The validation ladder is </w:t>
       </w:r>
       <w:r>
         <w:rPr>
@@ -4626,7 +5514,24 @@
         <w:pStyle w:val="references"/>
       </w:pPr>
       <w:r>
-        <w:t xml:space="preserve">[12] J. Martens and R. Grosse, "Optimizing neural networks with Kronecker-factored approximate curvature," in </w:t>
+        <w:t xml:space="preserve">[12] E. Facco, M. d'Errico, A. Rodriguez, and A. Laio, "Estimating the intrinsic dimension of datasets by a minimal neighborhood information," </w:t>
+      </w:r>
+      <w:r>
+        <w:rPr>
+          <w:i/>
+        </w:rPr>
+        <w:t xml:space="preserve">Sci. Rep.</w:t>
+      </w:r>
+      <w:r>
+        <w:t xml:space="preserve">, vol. 7, no. 1, p. 12140, 2017.</w:t>
+      </w:r>
+    </w:p>
+    <w:p>
+      <w:pPr>
+        <w:pStyle w:val="references"/>
+      </w:pPr>
+      <w:r>
+        <w:t xml:space="preserve">[13] J. Martens and R. Grosse, "Optimizing neural networks with Kronecker-factored approximate curvature," in </w:t>
       </w:r>
       <w:r>
         <w:rPr>
@@ -4643,7 +5548,7 @@
         <w:pStyle w:val="references"/>
       </w:pPr>
       <w:r>
-        <w:t xml:space="preserve">[13] B. Zhang and R. Sennrich, "Root mean square layer normalization," in </w:t>
+        <w:t xml:space="preserve">[14] B. Zhang and R. Sennrich, "Root mean square layer normalization," in </w:t>
       </w:r>
       <w:r>
         <w:rPr>
@@ -4660,7 +5565,7 @@
         <w:pStyle w:val="references"/>
       </w:pPr>
       <w:r>
-        <w:t xml:space="preserve">[14] J. L. Ba, J. R. Kiros, and G. E. Hinton, "Layer normalization," </w:t>
+        <w:t xml:space="preserve">[15] J. L. Ba, J. R. Kiros, and G. E. Hinton, "Layer normalization," </w:t>
       </w:r>
       <w:r>
         <w:rPr>
@@ -4677,7 +5582,7 @@
         <w:pStyle w:val="references"/>
       </w:pPr>
       <w:r>
-        <w:t xml:space="preserve">[15] M. P. do Carmo, </w:t>
+        <w:t xml:space="preserve">[16] M. P. do Carmo, </w:t>
       </w:r>
       <w:r>
         <w:rPr>
@@ -4694,7 +5599,7 @@
         <w:pStyle w:val="references"/>
       </w:pPr>
       <w:r>
-        <w:t xml:space="preserve">[16] A. Paszke et al., "PyTorch: An imperative style, high-performance deep learning library," in </w:t>
+        <w:t xml:space="preserve">[17] A. Paszke et al., "PyTorch: An imperative style, high-performance deep learning library," in </w:t>
       </w:r>
       <w:r>
         <w:rPr>
@@ -4711,7 +5616,66 @@
         <w:pStyle w:val="references"/>
       </w:pPr>
       <w:r>
-        <w:t xml:space="preserve">[17] A. Le Brigant, J. Deschamps, A. Collas, and N. Miolane, "Parametric information geometry with the package Geomstats," </w:t>
+        <w:t xml:space="preserve">[18] A. Radford, J. Wu, R. Child, D. Luan, D. Amodei, and I. Sutskever, "Language models are unsupervised multitask learners," OpenAI Tech. Rep., 2019.</w:t>
+      </w:r>
+    </w:p>
+    <w:p>
+      <w:pPr>
+        <w:pStyle w:val="references"/>
+      </w:pPr>
+      <w:r>
+        <w:t xml:space="preserve">[19] S. Biderman et al., "Pythia: A suite for analyzing large language models across training and scaling," in </w:t>
+      </w:r>
+      <w:r>
+        <w:rPr>
+          <w:i/>
+        </w:rPr>
+        <w:t xml:space="preserve">Proc. Int. Conf. Mach. Learn. (ICML)</w:t>
+      </w:r>
+      <w:r>
+        <w:t xml:space="preserve">, 2023, pp. 2397–2430.</w:t>
+      </w:r>
+    </w:p>
+    <w:p>
+      <w:pPr>
+        <w:pStyle w:val="references"/>
+      </w:pPr>
+      <w:r>
+        <w:t xml:space="preserve">[20] S. Merity, C. Xiong, J. Bradbury, and R. Socher, "Pointer sentinel mixture models," in </w:t>
+      </w:r>
+      <w:r>
+        <w:rPr>
+          <w:i/>
+        </w:rPr>
+        <w:t xml:space="preserve">Proc. Int. Conf. Learn. Represent. (ICLR)</w:t>
+      </w:r>
+      <w:r>
+        <w:t xml:space="preserve">, 2017.</w:t>
+      </w:r>
+    </w:p>
+    <w:p>
+      <w:pPr>
+        <w:pStyle w:val="references"/>
+      </w:pPr>
+      <w:r>
+        <w:t xml:space="preserve">[21] M. T. Pilehvar and J. Camacho-Collados, "WiC: The word-in-context dataset for evaluating context-sensitive meaning representations," in </w:t>
+      </w:r>
+      <w:r>
+        <w:rPr>
+          <w:i/>
+        </w:rPr>
+        <w:t xml:space="preserve">Proc. NAACL-HLT</w:t>
+      </w:r>
+      <w:r>
+        <w:t xml:space="preserve">, 2019, pp. 1267–1273.</w:t>
+      </w:r>
+    </w:p>
+    <w:p>
+      <w:pPr>
+        <w:pStyle w:val="references"/>
+      </w:pPr>
+      <w:r>
+        <w:t xml:space="preserve">[22] A. Le Brigant, J. Deschamps, A. Collas, and N. Miolane, "Parametric information geometry with the package Geomstats," </w:t>
       </w:r>
       <w:r>
         <w:rPr>
@@ -4721,82 +5685,6 @@
       </w:r>
       <w:r>
         <w:t xml:space="preserve">, vol. 49, no. 4, pp. 1–26, 2023.</w:t>
-      </w:r>
-    </w:p>
-    <w:p>
-      <w:pPr>
-        <w:pStyle w:val="references"/>
-      </w:pPr>
-      <w:r>
-        <w:t xml:space="preserve">[18] A. Radford, J. Wu, R. Child, D. Luan, D. Amodei, and I. Sutskever, "Language models are unsupervised multitask learners," OpenAI Tech. Rep., 2019.</w:t>
-      </w:r>
-    </w:p>
-    <w:p>
-      <w:pPr>
-        <w:pStyle w:val="references"/>
-      </w:pPr>
-      <w:r>
-        <w:t xml:space="preserve">[19] S. Biderman et al., "Pythia: A suite for analyzing large language models across training and scaling," in </w:t>
-      </w:r>
-      <w:r>
-        <w:rPr>
-          <w:i/>
-        </w:rPr>
-        <w:t xml:space="preserve">Proc. Int. Conf. Mach. Learn. (ICML)</w:t>
-      </w:r>
-      <w:r>
-        <w:t xml:space="preserve">, 2023, pp. 2397–2430.</w:t>
-      </w:r>
-    </w:p>
-    <w:p>
-      <w:pPr>
-        <w:pStyle w:val="references"/>
-      </w:pPr>
-      <w:r>
-        <w:t xml:space="preserve">[20] S. Merity, C. Xiong, J. Bradbury, and R. Socher, "Pointer sentinel mixture models," in </w:t>
-      </w:r>
-      <w:r>
-        <w:rPr>
-          <w:i/>
-        </w:rPr>
-        <w:t xml:space="preserve">Proc. Int. Conf. Learn. Represent. (ICLR)</w:t>
-      </w:r>
-      <w:r>
-        <w:t xml:space="preserve">, 2017.</w:t>
-      </w:r>
-    </w:p>
-    <w:p>
-      <w:pPr>
-        <w:pStyle w:val="references"/>
-      </w:pPr>
-      <w:r>
-        <w:t xml:space="preserve">[21] M. T. Pilehvar and J. Camacho-Collados, "WiC: The word-in-context dataset for evaluating context-sensitive meaning representations," in </w:t>
-      </w:r>
-      <w:r>
-        <w:rPr>
-          <w:i/>
-        </w:rPr>
-        <w:t xml:space="preserve">Proc. NAACL-HLT</w:t>
-      </w:r>
-      <w:r>
-        <w:t xml:space="preserve">, 2019, pp. 1267–1273.</w:t>
-      </w:r>
-    </w:p>
-    <w:p>
-      <w:pPr>
-        <w:pStyle w:val="references"/>
-      </w:pPr>
-      <w:r>
-        <w:t xml:space="preserve">[22] E. Facco, M. d'Errico, A. Rodriguez, and A. Laio, "Estimating the intrinsic dimension of datasets by a minimal neighborhood information," </w:t>
-      </w:r>
-      <w:r>
-        <w:rPr>
-          <w:i/>
-        </w:rPr>
-        <w:t xml:space="preserve">Sci. Rep.</w:t>
-      </w:r>
-      <w:r>
-        <w:t xml:space="preserve">, vol. 7, no. 1, p. 12140, 2017.</w:t>
       </w:r>
     </w:p>
     <w:sectPr>

</xml_diff>

<commit_message>
Correct paper tables against direct measurement; add null, ladder and trace scripts
</commit_message>
<xml_diff>
--- a/paper/Fisher-Rao-Curvature-IEEE.docx
+++ b/paper/Fisher-Rao-Curvature-IEEE.docx
@@ -473,7 +473,16 @@
         <w:t xml:space="preserve">P G P</w:t>
       </w:r>
       <w:r>
-        <w:t xml:space="preserve">. This construction is falsifiable, and Table I reports the test. On every architecture examined the number of null directions found matches the theoretical prediction, and the model's output is invariant along them to machine precision at a step size large enough to double the norm of the state. The directions the metric calls null are exactly the directions the model cannot see, which establishes that the metric measured is the model's own.</w:t>
+        <w:t xml:space="preserve">. This construction is falsifiable, and Table I reports the test. On every architecture examined the number of null directions found matches the theoretical prediction, and the model's prediction is unmoved along them: stepping by </w:t>
+      </w:r>
+      <w:r>
+        <w:rPr>
+          <w:i/>
+        </w:rPr>
+        <w:t xml:space="preserve">‖h‖</w:t>
+      </w:r>
+      <w:r>
+        <w:t xml:space="preserve">, which doubles the hidden state, changes the output distribution by a Kullback–Leibler divergence of 10⁻¹³ or less, while a random step of identical size changes it by 3 to 32 nats — a separation of twelve to sixteen orders of magnitude. The directions the metric calls null are exactly the directions the model cannot see, which establishes that the metric measured is the model's own.</w:t>
       </w:r>
     </w:p>
     <w:p>
@@ -483,696 +492,6 @@
       </w:pPr>
       <w:r>
         <w:t xml:space="preserve">NULL-DIRECTION FALSIFICATION TEST</w:t>
-      </w:r>
-    </w:p>
-    <w:tbl>
-      <w:tblPr>
-        <w:tblW w:w="4896" w:type="dxa"/>
-        <w:tblBorders>
-          <w:top w:val="single" w:sz="6" w:space="0" w:color="000000"/>
-          <w:left w:val="single" w:sz="6" w:space="0" w:color="000000"/>
-          <w:bottom w:val="single" w:sz="6" w:space="0" w:color="000000"/>
-          <w:right w:val="single" w:sz="6" w:space="0" w:color="000000"/>
-          <w:insideH w:val="single" w:sz="6" w:space="0" w:color="000000"/>
-          <w:insideV w:val="single" w:sz="6" w:space="0" w:color="000000"/>
-        </w:tblBorders>
-        <w:tblLayout w:type="fixed"/>
-      </w:tblPr>
-      <w:tblGrid>
-        <w:gridCol w:w="1224"/>
-        <w:gridCol w:w="1224"/>
-        <w:gridCol w:w="1224"/>
-        <w:gridCol w:w="1224"/>
-      </w:tblGrid>
-      <w:tr>
-        <w:trPr>
-          <w:cantSplit/>
-          <w:tblHeader/>
-        </w:trPr>
-        <w:tc>
-          <w:tcPr>
-            <w:tcW w:w="1224" w:type="dxa"/>
-            <w:vAlign w:val="center"/>
-          </w:tcPr>
-          <w:p>
-            <w:pPr>
-              <w:pStyle w:val="tablecolhead"/>
-              <w:jc w:val="center"/>
-              <w:spacing w:before="20" w:after="20"/>
-            </w:pPr>
-            <w:r>
-              <w:t xml:space="preserve">model</w:t>
-            </w:r>
-          </w:p>
-        </w:tc>
-        <w:tc>
-          <w:tcPr>
-            <w:tcW w:w="1224" w:type="dxa"/>
-            <w:vAlign w:val="center"/>
-          </w:tcPr>
-          <w:p>
-            <w:pPr>
-              <w:pStyle w:val="tablecolhead"/>
-              <w:jc w:val="center"/>
-              <w:spacing w:before="20" w:after="20"/>
-            </w:pPr>
-            <w:r>
-              <w:t xml:space="preserve">norm</w:t>
-            </w:r>
-          </w:p>
-        </w:tc>
-        <w:tc>
-          <w:tcPr>
-            <w:tcW w:w="1224" w:type="dxa"/>
-            <w:vAlign w:val="center"/>
-          </w:tcPr>
-          <w:p>
-            <w:pPr>
-              <w:pStyle w:val="tablecolhead"/>
-              <w:jc w:val="center"/>
-              <w:spacing w:before="20" w:after="20"/>
-            </w:pPr>
-            <w:r>
-              <w:t xml:space="preserve">null dirs found (expected)</w:t>
-            </w:r>
-          </w:p>
-        </w:tc>
-        <w:tc>
-          <w:tcPr>
-            <w:tcW w:w="1224" w:type="dxa"/>
-            <w:vAlign w:val="center"/>
-          </w:tcPr>
-          <w:p>
-            <w:pPr>
-              <w:pStyle w:val="tablecolhead"/>
-              <w:jc w:val="center"/>
-              <w:spacing w:before="20" w:after="20"/>
-            </w:pPr>
-            <w:r>
-              <w:t xml:space="preserve">output change along null</w:t>
-            </w:r>
-          </w:p>
-        </w:tc>
-      </w:tr>
-      <w:tr>
-        <w:trPr>
-          <w:cantSplit/>
-        </w:trPr>
-        <w:tc>
-          <w:tcPr>
-            <w:tcW w:w="1224" w:type="dxa"/>
-            <w:vAlign w:val="center"/>
-          </w:tcPr>
-          <w:p>
-            <w:pPr>
-              <w:pStyle w:val="tablecopy"/>
-              <w:jc w:val="left"/>
-              <w:spacing w:before="20" w:after="20"/>
-            </w:pPr>
-            <w:r>
-              <w:t xml:space="preserve">SmolLM2-135M</w:t>
-            </w:r>
-          </w:p>
-        </w:tc>
-        <w:tc>
-          <w:tcPr>
-            <w:tcW w:w="1224" w:type="dxa"/>
-            <w:vAlign w:val="center"/>
-          </w:tcPr>
-          <w:p>
-            <w:pPr>
-              <w:pStyle w:val="tablecopy"/>
-              <w:jc w:val="center"/>
-              <w:spacing w:before="20" w:after="20"/>
-            </w:pPr>
-            <w:r>
-              <w:t xml:space="preserve">RMSNorm</w:t>
-            </w:r>
-          </w:p>
-        </w:tc>
-        <w:tc>
-          <w:tcPr>
-            <w:tcW w:w="1224" w:type="dxa"/>
-            <w:vAlign w:val="center"/>
-          </w:tcPr>
-          <w:p>
-            <w:pPr>
-              <w:pStyle w:val="tablecopy"/>
-              <w:jc w:val="center"/>
-              <w:spacing w:before="20" w:after="20"/>
-            </w:pPr>
-            <w:r>
-              <w:t xml:space="preserve">1 (1)</w:t>
-            </w:r>
-          </w:p>
-        </w:tc>
-        <w:tc>
-          <w:tcPr>
-            <w:tcW w:w="1224" w:type="dxa"/>
-            <w:vAlign w:val="center"/>
-          </w:tcPr>
-          <w:p>
-            <w:pPr>
-              <w:pStyle w:val="tablecopy"/>
-              <w:jc w:val="center"/>
-              <w:spacing w:before="20" w:after="20"/>
-            </w:pPr>
-            <w:r>
-              <w:t xml:space="preserve">5.2 × 10⁻⁸</w:t>
-            </w:r>
-          </w:p>
-        </w:tc>
-      </w:tr>
-      <w:tr>
-        <w:trPr>
-          <w:cantSplit/>
-        </w:trPr>
-        <w:tc>
-          <w:tcPr>
-            <w:tcW w:w="1224" w:type="dxa"/>
-            <w:vAlign w:val="center"/>
-          </w:tcPr>
-          <w:p>
-            <w:pPr>
-              <w:pStyle w:val="tablecopy"/>
-              <w:jc w:val="left"/>
-              <w:spacing w:before="20" w:after="20"/>
-            </w:pPr>
-            <w:r>
-              <w:t xml:space="preserve">LLaMA-160M</w:t>
-            </w:r>
-          </w:p>
-        </w:tc>
-        <w:tc>
-          <w:tcPr>
-            <w:tcW w:w="1224" w:type="dxa"/>
-            <w:vAlign w:val="center"/>
-          </w:tcPr>
-          <w:p>
-            <w:pPr>
-              <w:pStyle w:val="tablecopy"/>
-              <w:jc w:val="center"/>
-              <w:spacing w:before="20" w:after="20"/>
-            </w:pPr>
-            <w:r>
-              <w:t xml:space="preserve">RMSNorm</w:t>
-            </w:r>
-          </w:p>
-        </w:tc>
-        <w:tc>
-          <w:tcPr>
-            <w:tcW w:w="1224" w:type="dxa"/>
-            <w:vAlign w:val="center"/>
-          </w:tcPr>
-          <w:p>
-            <w:pPr>
-              <w:pStyle w:val="tablecopy"/>
-              <w:jc w:val="center"/>
-              <w:spacing w:before="20" w:after="20"/>
-            </w:pPr>
-            <w:r>
-              <w:t xml:space="preserve">1 (1)</w:t>
-            </w:r>
-          </w:p>
-        </w:tc>
-        <w:tc>
-          <w:tcPr>
-            <w:tcW w:w="1224" w:type="dxa"/>
-            <w:vAlign w:val="center"/>
-          </w:tcPr>
-          <w:p>
-            <w:pPr>
-              <w:pStyle w:val="tablecopy"/>
-              <w:jc w:val="center"/>
-              <w:spacing w:before="20" w:after="20"/>
-            </w:pPr>
-            <w:r>
-              <w:t xml:space="preserve">machine precision</w:t>
-            </w:r>
-          </w:p>
-        </w:tc>
-      </w:tr>
-      <w:tr>
-        <w:trPr>
-          <w:cantSplit/>
-        </w:trPr>
-        <w:tc>
-          <w:tcPr>
-            <w:tcW w:w="1224" w:type="dxa"/>
-            <w:vAlign w:val="center"/>
-          </w:tcPr>
-          <w:p>
-            <w:pPr>
-              <w:pStyle w:val="tablecopy"/>
-              <w:jc w:val="left"/>
-              <w:spacing w:before="20" w:after="20"/>
-            </w:pPr>
-            <w:r>
-              <w:t xml:space="preserve">Pythia-70M</w:t>
-            </w:r>
-          </w:p>
-        </w:tc>
-        <w:tc>
-          <w:tcPr>
-            <w:tcW w:w="1224" w:type="dxa"/>
-            <w:vAlign w:val="center"/>
-          </w:tcPr>
-          <w:p>
-            <w:pPr>
-              <w:pStyle w:val="tablecopy"/>
-              <w:jc w:val="center"/>
-              <w:spacing w:before="20" w:after="20"/>
-            </w:pPr>
-            <w:r>
-              <w:t xml:space="preserve">LayerNorm</w:t>
-            </w:r>
-          </w:p>
-        </w:tc>
-        <w:tc>
-          <w:tcPr>
-            <w:tcW w:w="1224" w:type="dxa"/>
-            <w:vAlign w:val="center"/>
-          </w:tcPr>
-          <w:p>
-            <w:pPr>
-              <w:pStyle w:val="tablecopy"/>
-              <w:jc w:val="center"/>
-              <w:spacing w:before="20" w:after="20"/>
-            </w:pPr>
-            <w:r>
-              <w:t xml:space="preserve">2 (2)</w:t>
-            </w:r>
-          </w:p>
-        </w:tc>
-        <w:tc>
-          <w:tcPr>
-            <w:tcW w:w="1224" w:type="dxa"/>
-            <w:vAlign w:val="center"/>
-          </w:tcPr>
-          <w:p>
-            <w:pPr>
-              <w:pStyle w:val="tablecopy"/>
-              <w:jc w:val="center"/>
-              <w:spacing w:before="20" w:after="20"/>
-            </w:pPr>
-            <w:r>
-              <w:t xml:space="preserve">3.2 × 10⁻⁷</w:t>
-            </w:r>
-          </w:p>
-        </w:tc>
-      </w:tr>
-      <w:tr>
-        <w:trPr>
-          <w:cantSplit/>
-        </w:trPr>
-        <w:tc>
-          <w:tcPr>
-            <w:tcW w:w="1224" w:type="dxa"/>
-            <w:vAlign w:val="center"/>
-          </w:tcPr>
-          <w:p>
-            <w:pPr>
-              <w:pStyle w:val="tablecopy"/>
-              <w:jc w:val="left"/>
-              <w:spacing w:before="20" w:after="20"/>
-            </w:pPr>
-            <w:r>
-              <w:t xml:space="preserve">Pythia-160M</w:t>
-            </w:r>
-          </w:p>
-        </w:tc>
-        <w:tc>
-          <w:tcPr>
-            <w:tcW w:w="1224" w:type="dxa"/>
-            <w:vAlign w:val="center"/>
-          </w:tcPr>
-          <w:p>
-            <w:pPr>
-              <w:pStyle w:val="tablecopy"/>
-              <w:jc w:val="center"/>
-              <w:spacing w:before="20" w:after="20"/>
-            </w:pPr>
-            <w:r>
-              <w:t xml:space="preserve">LayerNorm</w:t>
-            </w:r>
-          </w:p>
-        </w:tc>
-        <w:tc>
-          <w:tcPr>
-            <w:tcW w:w="1224" w:type="dxa"/>
-            <w:vAlign w:val="center"/>
-          </w:tcPr>
-          <w:p>
-            <w:pPr>
-              <w:pStyle w:val="tablecopy"/>
-              <w:jc w:val="center"/>
-              <w:spacing w:before="20" w:after="20"/>
-            </w:pPr>
-            <w:r>
-              <w:t xml:space="preserve">2 (2)</w:t>
-            </w:r>
-          </w:p>
-        </w:tc>
-        <w:tc>
-          <w:tcPr>
-            <w:tcW w:w="1224" w:type="dxa"/>
-            <w:vAlign w:val="center"/>
-          </w:tcPr>
-          <w:p>
-            <w:pPr>
-              <w:pStyle w:val="tablecopy"/>
-              <w:jc w:val="center"/>
-              <w:spacing w:before="20" w:after="20"/>
-            </w:pPr>
-            <w:r>
-              <w:t xml:space="preserve">machine precision</w:t>
-            </w:r>
-          </w:p>
-        </w:tc>
-      </w:tr>
-      <w:tr>
-        <w:trPr>
-          <w:cantSplit/>
-        </w:trPr>
-        <w:tc>
-          <w:tcPr>
-            <w:tcW w:w="1224" w:type="dxa"/>
-            <w:vAlign w:val="center"/>
-          </w:tcPr>
-          <w:p>
-            <w:pPr>
-              <w:pStyle w:val="tablecopy"/>
-              <w:jc w:val="left"/>
-              <w:spacing w:before="20" w:after="20"/>
-            </w:pPr>
-            <w:r>
-              <w:t xml:space="preserve">GPT-2</w:t>
-            </w:r>
-          </w:p>
-        </w:tc>
-        <w:tc>
-          <w:tcPr>
-            <w:tcW w:w="1224" w:type="dxa"/>
-            <w:vAlign w:val="center"/>
-          </w:tcPr>
-          <w:p>
-            <w:pPr>
-              <w:pStyle w:val="tablecopy"/>
-              <w:jc w:val="center"/>
-              <w:spacing w:before="20" w:after="20"/>
-            </w:pPr>
-            <w:r>
-              <w:t xml:space="preserve">LayerNorm</w:t>
-            </w:r>
-          </w:p>
-        </w:tc>
-        <w:tc>
-          <w:tcPr>
-            <w:tcW w:w="1224" w:type="dxa"/>
-            <w:vAlign w:val="center"/>
-          </w:tcPr>
-          <w:p>
-            <w:pPr>
-              <w:pStyle w:val="tablecopy"/>
-              <w:jc w:val="center"/>
-              <w:spacing w:before="20" w:after="20"/>
-            </w:pPr>
-            <w:r>
-              <w:t xml:space="preserve">2 (2)</w:t>
-            </w:r>
-          </w:p>
-        </w:tc>
-        <w:tc>
-          <w:tcPr>
-            <w:tcW w:w="1224" w:type="dxa"/>
-            <w:vAlign w:val="center"/>
-          </w:tcPr>
-          <w:p>
-            <w:pPr>
-              <w:pStyle w:val="tablecopy"/>
-              <w:jc w:val="center"/>
-              <w:spacing w:before="20" w:after="20"/>
-            </w:pPr>
-            <w:r>
-              <w:t xml:space="preserve">8.4 × 10⁻⁸</w:t>
-            </w:r>
-          </w:p>
-        </w:tc>
-      </w:tr>
-      <w:tr>
-        <w:trPr>
-          <w:cantSplit/>
-        </w:trPr>
-        <w:tc>
-          <w:tcPr>
-            <w:tcW w:w="1224" w:type="dxa"/>
-            <w:vAlign w:val="center"/>
-          </w:tcPr>
-          <w:p>
-            <w:pPr>
-              <w:pStyle w:val="tablecopy"/>
-              <w:jc w:val="left"/>
-              <w:spacing w:before="20" w:after="20"/>
-            </w:pPr>
-            <w:r>
-              <w:t xml:space="preserve">GPT-Neo-125M</w:t>
-            </w:r>
-          </w:p>
-        </w:tc>
-        <w:tc>
-          <w:tcPr>
-            <w:tcW w:w="1224" w:type="dxa"/>
-            <w:vAlign w:val="center"/>
-          </w:tcPr>
-          <w:p>
-            <w:pPr>
-              <w:pStyle w:val="tablecopy"/>
-              <w:jc w:val="center"/>
-              <w:spacing w:before="20" w:after="20"/>
-            </w:pPr>
-            <w:r>
-              <w:t xml:space="preserve">LayerNorm</w:t>
-            </w:r>
-          </w:p>
-        </w:tc>
-        <w:tc>
-          <w:tcPr>
-            <w:tcW w:w="1224" w:type="dxa"/>
-            <w:vAlign w:val="center"/>
-          </w:tcPr>
-          <w:p>
-            <w:pPr>
-              <w:pStyle w:val="tablecopy"/>
-              <w:jc w:val="center"/>
-              <w:spacing w:before="20" w:after="20"/>
-            </w:pPr>
-            <w:r>
-              <w:t xml:space="preserve">2 (2)</w:t>
-            </w:r>
-          </w:p>
-        </w:tc>
-        <w:tc>
-          <w:tcPr>
-            <w:tcW w:w="1224" w:type="dxa"/>
-            <w:vAlign w:val="center"/>
-          </w:tcPr>
-          <w:p>
-            <w:pPr>
-              <w:pStyle w:val="tablecopy"/>
-              <w:jc w:val="center"/>
-              <w:spacing w:before="20" w:after="20"/>
-            </w:pPr>
-            <w:r>
-              <w:t xml:space="preserve">machine precision</w:t>
-            </w:r>
-          </w:p>
-        </w:tc>
-      </w:tr>
-    </w:tbl>
-    <w:p>
-      <w:pPr>
-        <w:pStyle w:val="Heading2"/>
-      </w:pPr>
-      <w:r>
-        <w:t xml:space="preserve">Curvature and the working subspace</w:t>
-      </w:r>
-    </w:p>
-    <w:p>
-      <w:pPr>
-        <w:pStyle w:val="BodyText"/>
-        <w:jc w:val="both"/>
-      </w:pPr>
-      <w:r>
-        <w:t xml:space="preserve">On the retained </w:t>
-      </w:r>
-      <w:r>
-        <w:rPr>
-          <w:i/>
-        </w:rPr>
-        <w:t xml:space="preserve">k</w:t>
-      </w:r>
-      <w:r>
-        <w:t xml:space="preserve">-dimensional subspace, Christoffel symbols and the Riemann tensor are formed by nested reverse-mode differentiation of (1), and the sectional curvature of the plane spanned by </w:t>
-      </w:r>
-      <w:r>
-        <w:rPr>
-          <w:i/>
-        </w:rPr>
-        <w:t xml:space="preserve">u, v</w:t>
-      </w:r>
-      <w:r>
-        <w:t xml:space="preserve"> follows in the standard way [16]. All differentiation is reverse-mode automatic differentiation in double precision [17].</w:t>
-      </w:r>
-    </w:p>
-    <w:p>
-      <w:pPr>
-        <w:pStyle w:val="BodyText"/>
-        <w:jc w:val="both"/>
-      </w:pPr>
-      <w:r>
-        <w:t xml:space="preserve">The cost of the Riemann tensor grows by a factor of about 2.7 per unit increase in </w:t>
-      </w:r>
-      <w:r>
-        <w:rPr>
-          <w:i/>
-        </w:rPr>
-        <w:t xml:space="preserve">k</w:t>
-      </w:r>
-      <w:r>
-        <w:t xml:space="preserve">, which places a hard ceiling at </w:t>
-      </w:r>
-      <w:r>
-        <w:rPr>
-          <w:i/>
-        </w:rPr>
-        <w:t xml:space="preserve">k ≤ 8</w:t>
-      </w:r>
-      <w:r>
-        <w:t xml:space="preserve"> on the hardware used. All curvature results below are computed at </w:t>
-      </w:r>
-      <w:r>
-        <w:rPr>
-          <w:i/>
-        </w:rPr>
-        <w:t xml:space="preserve">k</w:t>
-      </w:r>
-      <w:r>
-        <w:t xml:space="preserve"> = 4, 5 and 6, with </w:t>
-      </w:r>
-      <w:r>
-        <w:rPr>
-          <w:i/>
-        </w:rPr>
-        <w:t xml:space="preserve">k</w:t>
-      </w:r>
-      <w:r>
-        <w:t xml:space="preserve"> = 5 as the default, and the retained subspace holds approximately 88 % of the metric's trace. The reported curvature is accordingly that of a </w:t>
-      </w:r>
-      <w:r>
-        <w:rPr>
-          <w:i/>
-        </w:rPr>
-        <w:t xml:space="preserve">k</w:t>
-      </w:r>
-      <w:r>
-        <w:t xml:space="preserve">-dimensional slice under the induced metric, and the stability of the central result across the accessible range of </w:t>
-      </w:r>
-      <w:r>
-        <w:rPr>
-          <w:i/>
-        </w:rPr>
-        <w:t xml:space="preserve">k</w:t>
-      </w:r>
-      <w:r>
-        <w:t xml:space="preserve"> is reported explicitly in Section V.B.</w:t>
-      </w:r>
-    </w:p>
-    <w:p>
-      <w:pPr>
-        <w:pStyle w:val="BodyText"/>
-        <w:jc w:val="both"/>
-      </w:pPr>
-      <w:r>
-        <w:t xml:space="preserve">In absolute terms the cost is modest at the working dimension and rises steeply beyond it: a full sectional-curvature evaluation takes about 2.6 s per state at </w:t>
-      </w:r>
-      <w:r>
-        <w:rPr>
-          <w:i/>
-        </w:rPr>
-        <w:t xml:space="preserve">k</w:t>
-      </w:r>
-      <w:r>
-        <w:t xml:space="preserve"> = 5 and about 46 s at </w:t>
-      </w:r>
-      <w:r>
-        <w:rPr>
-          <w:i/>
-        </w:rPr>
-        <w:t xml:space="preserve">k</w:t>
-      </w:r>
-      <w:r>
-        <w:t xml:space="preserve"> = 8 on a single CPU core, which is why the sweep is reported at </w:t>
-      </w:r>
-      <w:r>
-        <w:rPr>
-          <w:i/>
-        </w:rPr>
-        <w:t xml:space="preserve">k</w:t>
-      </w:r>
-      <w:r>
-        <w:t xml:space="preserve"> = 4 to 6. The metric itself, being closed-form, is negligible by comparison; the expense is entirely in the second derivatives. This matters for the recommendation in Section VI, since it is precisely the expensive quantity that turns out to carry the signal.</w:t>
-      </w:r>
-    </w:p>
-    <w:p>
-      <w:pPr>
-        <w:pStyle w:val="BodyText"/>
-        <w:jc w:val="both"/>
-      </w:pPr>
-      <w:r>
-        <w:t xml:space="preserve">Measurements are taken on GPT-2 [18], Pythia-70M and Pythia-160M [19], LLaMA-160M and SmolLM2-135M, spanning both normalisation schemes, tied and untied embeddings, depths from 12 to 30 layers and widths from 512 to 768. Text is drawn from WikiText-2 [20] and from hand-written probe sentences; the sense-disambiguation probe of Section V.F follows the design of the word-in-context task [21].</w:t>
-      </w:r>
-    </w:p>
-    <w:p>
-      <w:pPr>
-        <w:pStyle w:val="Heading1"/>
-      </w:pPr>
-      <w:r>
-        <w:t xml:space="preserve">Validation</w:t>
-      </w:r>
-    </w:p>
-    <w:p>
-      <w:pPr>
-        <w:pStyle w:val="BodyText"/>
-        <w:jc w:val="both"/>
-      </w:pPr>
-      <w:r>
-        <w:t xml:space="preserve">Intrinsic curvature is expensive, silent when wrong, and plausible either way. Validation therefore precedes results and is reported in full.</w:t>
-      </w:r>
-    </w:p>
-    <w:p>
-      <w:pPr>
-        <w:pStyle w:val="Heading2"/>
-      </w:pPr>
-      <w:r>
-        <w:t xml:space="preserve">The ladder</w:t>
-      </w:r>
-    </w:p>
-    <w:p>
-      <w:pPr>
-        <w:pStyle w:val="BodyText"/>
-        <w:jc w:val="both"/>
-      </w:pPr>
-      <w:r>
-        <w:t xml:space="preserve">Seven manifolds with analytically known curvature are run through the same code path used for the transformer. Table II reports the outcome.</w:t>
-      </w:r>
-    </w:p>
-    <w:p>
-      <w:pPr>
-        <w:pStyle w:val="tablehead"/>
-        <w:jc w:val="center"/>
-      </w:pPr>
-      <w:r>
-        <w:t xml:space="preserve">VALIDATION LADDER</w:t>
       </w:r>
     </w:p>
     <w:tbl>
@@ -1212,7 +531,7 @@
               <w:spacing w:before="20" w:after="20"/>
             </w:pPr>
             <w:r>
-              <w:t xml:space="preserve">rung</w:t>
+              <w:t xml:space="preserve">model</w:t>
             </w:r>
           </w:p>
         </w:tc>
@@ -1228,7 +547,7 @@
               <w:spacing w:before="20" w:after="20"/>
             </w:pPr>
             <w:r>
-              <w:t xml:space="preserve">manifold</w:t>
+              <w:t xml:space="preserve">norm</w:t>
             </w:r>
           </w:p>
         </w:tc>
@@ -1244,7 +563,7 @@
               <w:spacing w:before="20" w:after="20"/>
             </w:pPr>
             <w:r>
-              <w:t xml:space="preserve">expected</w:t>
+              <w:t xml:space="preserve">null dirs (exp.)</w:t>
             </w:r>
           </w:p>
         </w:tc>
@@ -1260,7 +579,7 @@
               <w:spacing w:before="20" w:after="20"/>
             </w:pPr>
             <w:r>
-              <w:t xml:space="preserve">measured</w:t>
+              <w:t xml:space="preserve">KL along null</w:t>
             </w:r>
           </w:p>
         </w:tc>
@@ -1276,7 +595,7 @@
               <w:spacing w:before="20" w:after="20"/>
             </w:pPr>
             <w:r>
-              <w:t xml:space="preserve">worst error</w:t>
+              <w:t xml:space="preserve">KL along random</w:t>
             </w:r>
           </w:p>
         </w:tc>
@@ -1297,71 +616,71 @@
               <w:spacing w:before="20" w:after="20"/>
             </w:pPr>
             <w:r>
-              <w:t xml:space="preserve">2</w:t>
-            </w:r>
-          </w:p>
-        </w:tc>
-        <w:tc>
-          <w:tcPr>
-            <w:tcW w:w="979" w:type="dxa"/>
-            <w:vAlign w:val="center"/>
-          </w:tcPr>
-          <w:p>
-            <w:pPr>
-              <w:pStyle w:val="tablecopy"/>
-              <w:jc w:val="center"/>
-              <w:spacing w:before="20" w:after="20"/>
-            </w:pPr>
-            <w:r>
-              <w:t xml:space="preserve">Poincaré half-plane</w:t>
-            </w:r>
-          </w:p>
-        </w:tc>
-        <w:tc>
-          <w:tcPr>
-            <w:tcW w:w="979" w:type="dxa"/>
-            <w:vAlign w:val="center"/>
-          </w:tcPr>
-          <w:p>
-            <w:pPr>
-              <w:pStyle w:val="tablecopy"/>
-              <w:jc w:val="center"/>
-              <w:spacing w:before="20" w:after="20"/>
-            </w:pPr>
-            <w:r>
-              <w:t xml:space="preserve">K = −1</w:t>
-            </w:r>
-          </w:p>
-        </w:tc>
-        <w:tc>
-          <w:tcPr>
-            <w:tcW w:w="979" w:type="dxa"/>
-            <w:vAlign w:val="center"/>
-          </w:tcPr>
-          <w:p>
-            <w:pPr>
-              <w:pStyle w:val="tablecopy"/>
-              <w:jc w:val="center"/>
-              <w:spacing w:before="20" w:after="20"/>
-            </w:pPr>
-            <w:r>
-              <w:t xml:space="preserve">−1.000000</w:t>
-            </w:r>
-          </w:p>
-        </w:tc>
-        <w:tc>
-          <w:tcPr>
-            <w:tcW w:w="979" w:type="dxa"/>
-            <w:vAlign w:val="center"/>
-          </w:tcPr>
-          <w:p>
-            <w:pPr>
-              <w:pStyle w:val="tablecopy"/>
-              <w:jc w:val="center"/>
-              <w:spacing w:before="20" w:after="20"/>
-            </w:pPr>
-            <w:r>
-              <w:t xml:space="preserve">1.3 × 10⁻¹⁴</w:t>
+              <w:t xml:space="preserve">SmolLM2-135M</w:t>
+            </w:r>
+          </w:p>
+        </w:tc>
+        <w:tc>
+          <w:tcPr>
+            <w:tcW w:w="979" w:type="dxa"/>
+            <w:vAlign w:val="center"/>
+          </w:tcPr>
+          <w:p>
+            <w:pPr>
+              <w:pStyle w:val="tablecopy"/>
+              <w:jc w:val="center"/>
+              <w:spacing w:before="20" w:after="20"/>
+            </w:pPr>
+            <w:r>
+              <w:t xml:space="preserve">RMSNorm</w:t>
+            </w:r>
+          </w:p>
+        </w:tc>
+        <w:tc>
+          <w:tcPr>
+            <w:tcW w:w="979" w:type="dxa"/>
+            <w:vAlign w:val="center"/>
+          </w:tcPr>
+          <w:p>
+            <w:pPr>
+              <w:pStyle w:val="tablecopy"/>
+              <w:jc w:val="center"/>
+              <w:spacing w:before="20" w:after="20"/>
+            </w:pPr>
+            <w:r>
+              <w:t xml:space="preserve">1 (1)</w:t>
+            </w:r>
+          </w:p>
+        </w:tc>
+        <w:tc>
+          <w:tcPr>
+            <w:tcW w:w="979" w:type="dxa"/>
+            <w:vAlign w:val="center"/>
+          </w:tcPr>
+          <w:p>
+            <w:pPr>
+              <w:pStyle w:val="tablecopy"/>
+              <w:jc w:val="center"/>
+              <w:spacing w:before="20" w:after="20"/>
+            </w:pPr>
+            <w:r>
+              <w:t xml:space="preserve">2.8 × 10⁻¹⁵</w:t>
+            </w:r>
+          </w:p>
+        </w:tc>
+        <w:tc>
+          <w:tcPr>
+            <w:tcW w:w="979" w:type="dxa"/>
+            <w:vAlign w:val="center"/>
+          </w:tcPr>
+          <w:p>
+            <w:pPr>
+              <w:pStyle w:val="tablecopy"/>
+              <w:jc w:val="center"/>
+              <w:spacing w:before="20" w:after="20"/>
+            </w:pPr>
+            <w:r>
+              <w:t xml:space="preserve">3.76</w:t>
             </w:r>
           </w:p>
         </w:tc>
@@ -1382,71 +701,71 @@
               <w:spacing w:before="20" w:after="20"/>
             </w:pPr>
             <w:r>
-              <w:t xml:space="preserve">3</w:t>
-            </w:r>
-          </w:p>
-        </w:tc>
-        <w:tc>
-          <w:tcPr>
-            <w:tcW w:w="979" w:type="dxa"/>
-            <w:vAlign w:val="center"/>
-          </w:tcPr>
-          <w:p>
-            <w:pPr>
-              <w:pStyle w:val="tablecopy"/>
-              <w:jc w:val="center"/>
-              <w:spacing w:before="20" w:after="20"/>
-            </w:pPr>
-            <w:r>
-              <w:t xml:space="preserve">Categorical simplex</w:t>
-            </w:r>
-          </w:p>
-        </w:tc>
-        <w:tc>
-          <w:tcPr>
-            <w:tcW w:w="979" w:type="dxa"/>
-            <w:vAlign w:val="center"/>
-          </w:tcPr>
-          <w:p>
-            <w:pPr>
-              <w:pStyle w:val="tablecopy"/>
-              <w:jc w:val="center"/>
-              <w:spacing w:before="20" w:after="20"/>
-            </w:pPr>
-            <w:r>
-              <w:t xml:space="preserve">K = +1/4</w:t>
-            </w:r>
-          </w:p>
-        </w:tc>
-        <w:tc>
-          <w:tcPr>
-            <w:tcW w:w="979" w:type="dxa"/>
-            <w:vAlign w:val="center"/>
-          </w:tcPr>
-          <w:p>
-            <w:pPr>
-              <w:pStyle w:val="tablecopy"/>
-              <w:jc w:val="center"/>
-              <w:spacing w:before="20" w:after="20"/>
-            </w:pPr>
-            <w:r>
-              <w:t xml:space="preserve">+0.250000</w:t>
-            </w:r>
-          </w:p>
-        </w:tc>
-        <w:tc>
-          <w:tcPr>
-            <w:tcW w:w="979" w:type="dxa"/>
-            <w:vAlign w:val="center"/>
-          </w:tcPr>
-          <w:p>
-            <w:pPr>
-              <w:pStyle w:val="tablecopy"/>
-              <w:jc w:val="center"/>
-              <w:spacing w:before="20" w:after="20"/>
-            </w:pPr>
-            <w:r>
-              <w:t xml:space="preserve">2.6 × 10⁻¹⁴</w:t>
+              <w:t xml:space="preserve">LLaMA-160M</w:t>
+            </w:r>
+          </w:p>
+        </w:tc>
+        <w:tc>
+          <w:tcPr>
+            <w:tcW w:w="979" w:type="dxa"/>
+            <w:vAlign w:val="center"/>
+          </w:tcPr>
+          <w:p>
+            <w:pPr>
+              <w:pStyle w:val="tablecopy"/>
+              <w:jc w:val="center"/>
+              <w:spacing w:before="20" w:after="20"/>
+            </w:pPr>
+            <w:r>
+              <w:t xml:space="preserve">RMSNorm</w:t>
+            </w:r>
+          </w:p>
+        </w:tc>
+        <w:tc>
+          <w:tcPr>
+            <w:tcW w:w="979" w:type="dxa"/>
+            <w:vAlign w:val="center"/>
+          </w:tcPr>
+          <w:p>
+            <w:pPr>
+              <w:pStyle w:val="tablecopy"/>
+              <w:jc w:val="center"/>
+              <w:spacing w:before="20" w:after="20"/>
+            </w:pPr>
+            <w:r>
+              <w:t xml:space="preserve">1 (1)</w:t>
+            </w:r>
+          </w:p>
+        </w:tc>
+        <w:tc>
+          <w:tcPr>
+            <w:tcW w:w="979" w:type="dxa"/>
+            <w:vAlign w:val="center"/>
+          </w:tcPr>
+          <w:p>
+            <w:pPr>
+              <w:pStyle w:val="tablecopy"/>
+              <w:jc w:val="center"/>
+              <w:spacing w:before="20" w:after="20"/>
+            </w:pPr>
+            <w:r>
+              <w:t xml:space="preserve">3.8 × 10⁻¹⁶</w:t>
+            </w:r>
+          </w:p>
+        </w:tc>
+        <w:tc>
+          <w:tcPr>
+            <w:tcW w:w="979" w:type="dxa"/>
+            <w:vAlign w:val="center"/>
+          </w:tcPr>
+          <w:p>
+            <w:pPr>
+              <w:pStyle w:val="tablecopy"/>
+              <w:jc w:val="center"/>
+              <w:spacing w:before="20" w:after="20"/>
+            </w:pPr>
+            <w:r>
+              <w:t xml:space="preserve">2.96</w:t>
             </w:r>
           </w:p>
         </w:tc>
@@ -1467,71 +786,71 @@
               <w:spacing w:before="20" w:after="20"/>
             </w:pPr>
             <w:r>
-              <w:t xml:space="preserve">4</w:t>
-            </w:r>
-          </w:p>
-        </w:tc>
-        <w:tc>
-          <w:tcPr>
-            <w:tcW w:w="979" w:type="dxa"/>
-            <w:vAlign w:val="center"/>
-          </w:tcPr>
-          <w:p>
-            <w:pPr>
-              <w:pStyle w:val="tablecopy"/>
-              <w:jc w:val="center"/>
-              <w:spacing w:before="20" w:after="20"/>
-            </w:pPr>
-            <w:r>
-              <w:t xml:space="preserve">Gamma family</w:t>
-            </w:r>
-          </w:p>
-        </w:tc>
-        <w:tc>
-          <w:tcPr>
-            <w:tcW w:w="979" w:type="dxa"/>
-            <w:vAlign w:val="center"/>
-          </w:tcPr>
-          <w:p>
-            <w:pPr>
-              <w:pStyle w:val="tablecopy"/>
-              <w:jc w:val="center"/>
-              <w:spacing w:before="20" w:after="20"/>
-            </w:pPr>
-            <w:r>
-              <w:t xml:space="preserve">negative</w:t>
-            </w:r>
-          </w:p>
-        </w:tc>
-        <w:tc>
-          <w:tcPr>
-            <w:tcW w:w="979" w:type="dxa"/>
-            <w:vAlign w:val="center"/>
-          </w:tcPr>
-          <w:p>
-            <w:pPr>
-              <w:pStyle w:val="tablecopy"/>
-              <w:jc w:val="center"/>
-              <w:spacing w:before="20" w:after="20"/>
-            </w:pPr>
-            <w:r>
-              <w:t xml:space="preserve">−0.463903</w:t>
-            </w:r>
-          </w:p>
-        </w:tc>
-        <w:tc>
-          <w:tcPr>
-            <w:tcW w:w="979" w:type="dxa"/>
-            <w:vAlign w:val="center"/>
-          </w:tcPr>
-          <w:p>
-            <w:pPr>
-              <w:pStyle w:val="tablecopy"/>
-              <w:jc w:val="center"/>
-              <w:spacing w:before="20" w:after="20"/>
-            </w:pPr>
-            <w:r>
-              <w:t xml:space="preserve">2.5 × 10⁻¹⁴</w:t>
+              <w:t xml:space="preserve">Pythia-70M</w:t>
+            </w:r>
+          </w:p>
+        </w:tc>
+        <w:tc>
+          <w:tcPr>
+            <w:tcW w:w="979" w:type="dxa"/>
+            <w:vAlign w:val="center"/>
+          </w:tcPr>
+          <w:p>
+            <w:pPr>
+              <w:pStyle w:val="tablecopy"/>
+              <w:jc w:val="center"/>
+              <w:spacing w:before="20" w:after="20"/>
+            </w:pPr>
+            <w:r>
+              <w:t xml:space="preserve">LayerNorm</w:t>
+            </w:r>
+          </w:p>
+        </w:tc>
+        <w:tc>
+          <w:tcPr>
+            <w:tcW w:w="979" w:type="dxa"/>
+            <w:vAlign w:val="center"/>
+          </w:tcPr>
+          <w:p>
+            <w:pPr>
+              <w:pStyle w:val="tablecopy"/>
+              <w:jc w:val="center"/>
+              <w:spacing w:before="20" w:after="20"/>
+            </w:pPr>
+            <w:r>
+              <w:t xml:space="preserve">2 (2)</w:t>
+            </w:r>
+          </w:p>
+        </w:tc>
+        <w:tc>
+          <w:tcPr>
+            <w:tcW w:w="979" w:type="dxa"/>
+            <w:vAlign w:val="center"/>
+          </w:tcPr>
+          <w:p>
+            <w:pPr>
+              <w:pStyle w:val="tablecopy"/>
+              <w:jc w:val="center"/>
+              <w:spacing w:before="20" w:after="20"/>
+            </w:pPr>
+            <w:r>
+              <w:t xml:space="preserve">1.6 × 10⁻¹³</w:t>
+            </w:r>
+          </w:p>
+        </w:tc>
+        <w:tc>
+          <w:tcPr>
+            <w:tcW w:w="979" w:type="dxa"/>
+            <w:vAlign w:val="center"/>
+          </w:tcPr>
+          <w:p>
+            <w:pPr>
+              <w:pStyle w:val="tablecopy"/>
+              <w:jc w:val="center"/>
+              <w:spacing w:before="20" w:after="20"/>
+            </w:pPr>
+            <w:r>
+              <w:t xml:space="preserve">13.41</w:t>
             </w:r>
           </w:p>
         </w:tc>
@@ -1552,71 +871,71 @@
               <w:spacing w:before="20" w:after="20"/>
             </w:pPr>
             <w:r>
-              <w:t xml:space="preserve">5</w:t>
-            </w:r>
-          </w:p>
-        </w:tc>
-        <w:tc>
-          <w:tcPr>
-            <w:tcW w:w="979" w:type="dxa"/>
-            <w:vAlign w:val="center"/>
-          </w:tcPr>
-          <w:p>
-            <w:pPr>
-              <w:pStyle w:val="tablecopy"/>
-              <w:jc w:val="center"/>
-              <w:spacing w:before="20" w:after="20"/>
-            </w:pPr>
-            <w:r>
-              <w:t xml:space="preserve">Beta family</w:t>
-            </w:r>
-          </w:p>
-        </w:tc>
-        <w:tc>
-          <w:tcPr>
-            <w:tcW w:w="979" w:type="dxa"/>
-            <w:vAlign w:val="center"/>
-          </w:tcPr>
-          <w:p>
-            <w:pPr>
-              <w:pStyle w:val="tablecopy"/>
-              <w:jc w:val="center"/>
-              <w:spacing w:before="20" w:after="20"/>
-            </w:pPr>
-            <w:r>
-              <w:t xml:space="preserve">negative</w:t>
-            </w:r>
-          </w:p>
-        </w:tc>
-        <w:tc>
-          <w:tcPr>
-            <w:tcW w:w="979" w:type="dxa"/>
-            <w:vAlign w:val="center"/>
-          </w:tcPr>
-          <w:p>
-            <w:pPr>
-              <w:pStyle w:val="tablecopy"/>
-              <w:jc w:val="center"/>
-              <w:spacing w:before="20" w:after="20"/>
-            </w:pPr>
-            <w:r>
-              <w:t xml:space="preserve">−0.456795</w:t>
-            </w:r>
-          </w:p>
-        </w:tc>
-        <w:tc>
-          <w:tcPr>
-            <w:tcW w:w="979" w:type="dxa"/>
-            <w:vAlign w:val="center"/>
-          </w:tcPr>
-          <w:p>
-            <w:pPr>
-              <w:pStyle w:val="tablecopy"/>
-              <w:jc w:val="center"/>
-              <w:spacing w:before="20" w:after="20"/>
-            </w:pPr>
-            <w:r>
-              <w:t xml:space="preserve">3.2 × 10⁻¹⁴</w:t>
+              <w:t xml:space="preserve">Pythia-160M</w:t>
+            </w:r>
+          </w:p>
+        </w:tc>
+        <w:tc>
+          <w:tcPr>
+            <w:tcW w:w="979" w:type="dxa"/>
+            <w:vAlign w:val="center"/>
+          </w:tcPr>
+          <w:p>
+            <w:pPr>
+              <w:pStyle w:val="tablecopy"/>
+              <w:jc w:val="center"/>
+              <w:spacing w:before="20" w:after="20"/>
+            </w:pPr>
+            <w:r>
+              <w:t xml:space="preserve">LayerNorm</w:t>
+            </w:r>
+          </w:p>
+        </w:tc>
+        <w:tc>
+          <w:tcPr>
+            <w:tcW w:w="979" w:type="dxa"/>
+            <w:vAlign w:val="center"/>
+          </w:tcPr>
+          <w:p>
+            <w:pPr>
+              <w:pStyle w:val="tablecopy"/>
+              <w:jc w:val="center"/>
+              <w:spacing w:before="20" w:after="20"/>
+            </w:pPr>
+            <w:r>
+              <w:t xml:space="preserve">2 (2)</w:t>
+            </w:r>
+          </w:p>
+        </w:tc>
+        <w:tc>
+          <w:tcPr>
+            <w:tcW w:w="979" w:type="dxa"/>
+            <w:vAlign w:val="center"/>
+          </w:tcPr>
+          <w:p>
+            <w:pPr>
+              <w:pStyle w:val="tablecopy"/>
+              <w:jc w:val="center"/>
+              <w:spacing w:before="20" w:after="20"/>
+            </w:pPr>
+            <w:r>
+              <w:t xml:space="preserve">2.0 × 10⁻¹³</w:t>
+            </w:r>
+          </w:p>
+        </w:tc>
+        <w:tc>
+          <w:tcPr>
+            <w:tcW w:w="979" w:type="dxa"/>
+            <w:vAlign w:val="center"/>
+          </w:tcPr>
+          <w:p>
+            <w:pPr>
+              <w:pStyle w:val="tablecopy"/>
+              <w:jc w:val="center"/>
+              <w:spacing w:before="20" w:after="20"/>
+            </w:pPr>
+            <w:r>
+              <w:t xml:space="preserve">7.79</w:t>
             </w:r>
           </w:p>
         </w:tc>
@@ -1637,71 +956,71 @@
               <w:spacing w:before="20" w:after="20"/>
             </w:pPr>
             <w:r>
-              <w:t xml:space="preserve">6</w:t>
-            </w:r>
-          </w:p>
-        </w:tc>
-        <w:tc>
-          <w:tcPr>
-            <w:tcW w:w="979" w:type="dxa"/>
-            <w:vAlign w:val="center"/>
-          </w:tcPr>
-          <w:p>
-            <w:pPr>
-              <w:pStyle w:val="tablecopy"/>
-              <w:jc w:val="center"/>
-              <w:spacing w:before="20" w:after="20"/>
-            </w:pPr>
-            <w:r>
-              <w:t xml:space="preserve">Univariate Gaussian</w:t>
-            </w:r>
-          </w:p>
-        </w:tc>
-        <w:tc>
-          <w:tcPr>
-            <w:tcW w:w="979" w:type="dxa"/>
-            <w:vAlign w:val="center"/>
-          </w:tcPr>
-          <w:p>
-            <w:pPr>
-              <w:pStyle w:val="tablecopy"/>
-              <w:jc w:val="center"/>
-              <w:spacing w:before="20" w:after="20"/>
-            </w:pPr>
-            <w:r>
-              <w:t xml:space="preserve">K = −1/2</w:t>
-            </w:r>
-          </w:p>
-        </w:tc>
-        <w:tc>
-          <w:tcPr>
-            <w:tcW w:w="979" w:type="dxa"/>
-            <w:vAlign w:val="center"/>
-          </w:tcPr>
-          <w:p>
-            <w:pPr>
-              <w:pStyle w:val="tablecopy"/>
-              <w:jc w:val="center"/>
-              <w:spacing w:before="20" w:after="20"/>
-            </w:pPr>
-            <w:r>
-              <w:t xml:space="preserve">−0.500000</w:t>
-            </w:r>
-          </w:p>
-        </w:tc>
-        <w:tc>
-          <w:tcPr>
-            <w:tcW w:w="979" w:type="dxa"/>
-            <w:vAlign w:val="center"/>
-          </w:tcPr>
-          <w:p>
-            <w:pPr>
-              <w:pStyle w:val="tablecopy"/>
-              <w:jc w:val="center"/>
-              <w:spacing w:before="20" w:after="20"/>
-            </w:pPr>
-            <w:r>
-              <w:t xml:space="preserve">1.1 × 10⁻¹⁶</w:t>
+              <w:t xml:space="preserve">GPT-2</w:t>
+            </w:r>
+          </w:p>
+        </w:tc>
+        <w:tc>
+          <w:tcPr>
+            <w:tcW w:w="979" w:type="dxa"/>
+            <w:vAlign w:val="center"/>
+          </w:tcPr>
+          <w:p>
+            <w:pPr>
+              <w:pStyle w:val="tablecopy"/>
+              <w:jc w:val="center"/>
+              <w:spacing w:before="20" w:after="20"/>
+            </w:pPr>
+            <w:r>
+              <w:t xml:space="preserve">LayerNorm</w:t>
+            </w:r>
+          </w:p>
+        </w:tc>
+        <w:tc>
+          <w:tcPr>
+            <w:tcW w:w="979" w:type="dxa"/>
+            <w:vAlign w:val="center"/>
+          </w:tcPr>
+          <w:p>
+            <w:pPr>
+              <w:pStyle w:val="tablecopy"/>
+              <w:jc w:val="center"/>
+              <w:spacing w:before="20" w:after="20"/>
+            </w:pPr>
+            <w:r>
+              <w:t xml:space="preserve">2 (2)</w:t>
+            </w:r>
+          </w:p>
+        </w:tc>
+        <w:tc>
+          <w:tcPr>
+            <w:tcW w:w="979" w:type="dxa"/>
+            <w:vAlign w:val="center"/>
+          </w:tcPr>
+          <w:p>
+            <w:pPr>
+              <w:pStyle w:val="tablecopy"/>
+              <w:jc w:val="center"/>
+              <w:spacing w:before="20" w:after="20"/>
+            </w:pPr>
+            <w:r>
+              <w:t xml:space="preserve">1.2 × 10⁻¹⁵</w:t>
+            </w:r>
+          </w:p>
+        </w:tc>
+        <w:tc>
+          <w:tcPr>
+            <w:tcW w:w="979" w:type="dxa"/>
+            <w:vAlign w:val="center"/>
+          </w:tcPr>
+          <w:p>
+            <w:pPr>
+              <w:pStyle w:val="tablecopy"/>
+              <w:jc w:val="center"/>
+              <w:spacing w:before="20" w:after="20"/>
+            </w:pPr>
+            <w:r>
+              <w:t xml:space="preserve">3.70</w:t>
             </w:r>
           </w:p>
         </w:tc>
@@ -1722,71 +1041,71 @@
               <w:spacing w:before="20" w:after="20"/>
             </w:pPr>
             <w:r>
-              <w:t xml:space="preserve">7</w:t>
-            </w:r>
-          </w:p>
-        </w:tc>
-        <w:tc>
-          <w:tcPr>
-            <w:tcW w:w="979" w:type="dxa"/>
-            <w:vAlign w:val="center"/>
-          </w:tcPr>
-          <w:p>
-            <w:pPr>
-              <w:pStyle w:val="tablecopy"/>
-              <w:jc w:val="center"/>
-              <w:spacing w:before="20" w:after="20"/>
-            </w:pPr>
-            <w:r>
-              <w:t xml:space="preserve">Synthetic pullback</w:t>
-            </w:r>
-          </w:p>
-        </w:tc>
-        <w:tc>
-          <w:tcPr>
-            <w:tcW w:w="979" w:type="dxa"/>
-            <w:vAlign w:val="center"/>
-          </w:tcPr>
-          <w:p>
-            <w:pPr>
-              <w:pStyle w:val="tablecopy"/>
-              <w:jc w:val="center"/>
-              <w:spacing w:before="20" w:after="20"/>
-            </w:pPr>
-            <w:r>
-              <w:t xml:space="preserve">K = +1/4</w:t>
-            </w:r>
-          </w:p>
-        </w:tc>
-        <w:tc>
-          <w:tcPr>
-            <w:tcW w:w="979" w:type="dxa"/>
-            <w:vAlign w:val="center"/>
-          </w:tcPr>
-          <w:p>
-            <w:pPr>
-              <w:pStyle w:val="tablecopy"/>
-              <w:jc w:val="center"/>
-              <w:spacing w:before="20" w:after="20"/>
-            </w:pPr>
-            <w:r>
-              <w:t xml:space="preserve">+0.250000</w:t>
-            </w:r>
-          </w:p>
-        </w:tc>
-        <w:tc>
-          <w:tcPr>
-            <w:tcW w:w="979" w:type="dxa"/>
-            <w:vAlign w:val="center"/>
-          </w:tcPr>
-          <w:p>
-            <w:pPr>
-              <w:pStyle w:val="tablecopy"/>
-              <w:jc w:val="center"/>
-              <w:spacing w:before="20" w:after="20"/>
-            </w:pPr>
-            <w:r>
-              <w:t xml:space="preserve">9.7 × 10⁻¹²</w:t>
+              <w:t xml:space="preserve">GPT-Neo-125M</w:t>
+            </w:r>
+          </w:p>
+        </w:tc>
+        <w:tc>
+          <w:tcPr>
+            <w:tcW w:w="979" w:type="dxa"/>
+            <w:vAlign w:val="center"/>
+          </w:tcPr>
+          <w:p>
+            <w:pPr>
+              <w:pStyle w:val="tablecopy"/>
+              <w:jc w:val="center"/>
+              <w:spacing w:before="20" w:after="20"/>
+            </w:pPr>
+            <w:r>
+              <w:t xml:space="preserve">LayerNorm</w:t>
+            </w:r>
+          </w:p>
+        </w:tc>
+        <w:tc>
+          <w:tcPr>
+            <w:tcW w:w="979" w:type="dxa"/>
+            <w:vAlign w:val="center"/>
+          </w:tcPr>
+          <w:p>
+            <w:pPr>
+              <w:pStyle w:val="tablecopy"/>
+              <w:jc w:val="center"/>
+              <w:spacing w:before="20" w:after="20"/>
+            </w:pPr>
+            <w:r>
+              <w:t xml:space="preserve">2 (2)</w:t>
+            </w:r>
+          </w:p>
+        </w:tc>
+        <w:tc>
+          <w:tcPr>
+            <w:tcW w:w="979" w:type="dxa"/>
+            <w:vAlign w:val="center"/>
+          </w:tcPr>
+          <w:p>
+            <w:pPr>
+              <w:pStyle w:val="tablecopy"/>
+              <w:jc w:val="center"/>
+              <w:spacing w:before="20" w:after="20"/>
+            </w:pPr>
+            <w:r>
+              <w:t xml:space="preserve">9.7 × 10⁻¹⁶</w:t>
+            </w:r>
+          </w:p>
+        </w:tc>
+        <w:tc>
+          <w:tcPr>
+            <w:tcW w:w="979" w:type="dxa"/>
+            <w:vAlign w:val="center"/>
+          </w:tcPr>
+          <w:p>
+            <w:pPr>
+              <w:pStyle w:val="tablecopy"/>
+              <w:jc w:val="center"/>
+              <w:spacing w:before="20" w:after="20"/>
+            </w:pPr>
+            <w:r>
+              <w:t xml:space="preserve">32.31</w:t>
             </w:r>
           </w:p>
         </w:tc>
@@ -1794,20 +1113,37 @@
     </w:tbl>
     <w:p>
       <w:pPr>
+        <w:pStyle w:val="Heading2"/>
+      </w:pPr>
+      <w:r>
+        <w:t xml:space="preserve">Curvature and the working subspace</w:t>
+      </w:r>
+    </w:p>
+    <w:p>
+      <w:pPr>
         <w:pStyle w:val="BodyText"/>
         <w:jc w:val="both"/>
       </w:pPr>
       <w:r>
-        <w:t xml:space="preserve">Rung 3 is load-bearing: the categorical simplex under the full Fisher–Rao metric is isometric to the positive orthant of a radius-2 sphere and therefore has constant </w:t>
-      </w:r>
-      <w:r>
-        <w:rPr>
-          <w:i/>
-        </w:rPr>
-        <w:t xml:space="preserve">K = +1/4</w:t>
-      </w:r>
-      <w:r>
-        <w:t xml:space="preserve">. It is the same metric family as the object under study.</w:t>
+        <w:t xml:space="preserve">On the retained </w:t>
+      </w:r>
+      <w:r>
+        <w:rPr>
+          <w:i/>
+        </w:rPr>
+        <w:t xml:space="preserve">k</w:t>
+      </w:r>
+      <w:r>
+        <w:t xml:space="preserve">-dimensional subspace, Christoffel symbols and the Riemann tensor are formed by nested reverse-mode differentiation of (1), and the sectional curvature of the plane spanned by </w:t>
+      </w:r>
+      <w:r>
+        <w:rPr>
+          <w:i/>
+        </w:rPr>
+        <w:t xml:space="preserve">u, v</w:t>
+      </w:r>
+      <w:r>
+        <w:t xml:space="preserve"> follows in the standard way [16]. All differentiation is reverse-mode automatic differentiation in double precision [17].</w:t>
       </w:r>
     </w:p>
     <w:p>
@@ -1816,69 +1152,70 @@
         <w:jc w:val="both"/>
       </w:pPr>
       <w:r>
-        <w:t xml:space="preserve">Rung 7 validates the assembly of (1) specifically, which no other rung does. With a synthetic linear model </w:t>
-      </w:r>
-      <w:r>
-        <w:rPr>
-          <w:i/>
-        </w:rPr>
-        <w:t xml:space="preserve">p(h) = softmax(U h)</w:t>
-      </w:r>
-      <w:r>
-        <w:t xml:space="preserve"> and </w:t>
-      </w:r>
-      <w:r>
-        <w:rPr>
-          <w:i/>
-        </w:rPr>
-        <w:t xml:space="preserve">d = N − 1</w:t>
-      </w:r>
-      <w:r>
-        <w:t xml:space="preserve">, the map </w:t>
-      </w:r>
-      <w:r>
-        <w:rPr>
-          <w:i/>
-        </w:rPr>
-        <w:t xml:space="preserve">h → p</w:t>
-      </w:r>
-      <w:r>
-        <w:t xml:space="preserve"> is a diffeomorphism onto the simplex interior, so the pullback metric is the simplex metric in different coordinates and the curvature must be exactly +1/4 for every valid </w:t>
-      </w:r>
-      <w:r>
-        <w:rPr>
-          <w:i/>
-        </w:rPr>
-        <w:t xml:space="preserve">U</w:t>
-      </w:r>
-      <w:r>
-        <w:t xml:space="preserve">. Three further checks accompany it: reparameterisation invariance under </w:t>
-      </w:r>
-      <w:r>
-        <w:rPr>
-          <w:i/>
-        </w:rPr>
-        <w:t xml:space="preserve">U → UM</w:t>
-      </w:r>
-      <w:r>
-        <w:t xml:space="preserve">, to which curvature must be blind (worst error 1.9 × 10⁻¹¹); scalar curvature </w:t>
-      </w:r>
-      <w:r>
-        <w:rPr>
-          <w:i/>
-        </w:rPr>
-        <w:t xml:space="preserve">R = k(k−1)/4</w:t>
-      </w:r>
-      <w:r>
-        <w:t xml:space="preserve"> recovered through the pullback (4.9 × 10⁻¹²); and a deliberately broken assembly, with the outer-product term of (1) dropped, which must fail and does, at 0.263. A test that cannot fail carries no information.</w:t>
-      </w:r>
-    </w:p>
-    <w:p>
-      <w:pPr>
-        <w:pStyle w:val="Heading2"/>
-      </w:pPr>
-      <w:r>
-        <w:t xml:space="preserve">The Hessian identity and an independent implementation</w:t>
+        <w:t xml:space="preserve">The cost of the Riemann tensor grows by a factor of about 2.7 per unit increase in </w:t>
+      </w:r>
+      <w:r>
+        <w:rPr>
+          <w:i/>
+        </w:rPr>
+        <w:t xml:space="preserve">k</w:t>
+      </w:r>
+      <w:r>
+        <w:t xml:space="preserve">, which places a hard ceiling at </w:t>
+      </w:r>
+      <w:r>
+        <w:rPr>
+          <w:i/>
+        </w:rPr>
+        <w:t xml:space="preserve">k ≤ 8</w:t>
+      </w:r>
+      <w:r>
+        <w:t xml:space="preserve"> on the hardware used. All curvature results below are computed at </w:t>
+      </w:r>
+      <w:r>
+        <w:rPr>
+          <w:i/>
+        </w:rPr>
+        <w:t xml:space="preserve">k</w:t>
+      </w:r>
+      <w:r>
+        <w:t xml:space="preserve"> = 4, 5 and 6, with </w:t>
+      </w:r>
+      <w:r>
+        <w:rPr>
+          <w:i/>
+        </w:rPr>
+        <w:t xml:space="preserve">k</w:t>
+      </w:r>
+      <w:r>
+        <w:t xml:space="preserve"> = 5 as the default, and the retained subspace holds a median 96 % of the quotiented metric's trace at </w:t>
+      </w:r>
+      <w:r>
+        <w:rPr>
+          <w:i/>
+        </w:rPr>
+        <w:t xml:space="preserve">k</w:t>
+      </w:r>
+      <w:r>
+        <w:t xml:space="preserve"> = 5 (mean 91 %, measured over 60 states). The reported curvature is accordingly that of a </w:t>
+      </w:r>
+      <w:r>
+        <w:rPr>
+          <w:i/>
+        </w:rPr>
+        <w:t xml:space="preserve">k</w:t>
+      </w:r>
+      <w:r>
+        <w:t xml:space="preserve">-dimensional slice under the induced metric, and the stability of the central result across the accessible range of </w:t>
+      </w:r>
+      <w:r>
+        <w:rPr>
+          <w:i/>
+        </w:rPr>
+        <w:t xml:space="preserve">k</w:t>
+      </w:r>
+      <w:r>
+        <w:t xml:space="preserve"> is reported explicitly in Section V.B.</w:t>
       </w:r>
     </w:p>
     <w:p>
@@ -1887,25 +1224,34 @@
         <w:jc w:val="both"/>
       </w:pPr>
       <w:r>
-        <w:t xml:space="preserve">Equation (2) was verified on a real model through a separate code path. Sweeping </w:t>
-      </w:r>
-      <w:r>
-        <w:rPr>
-          <w:i/>
-        </w:rPr>
-        <w:t xml:space="preserve">ε</w:t>
-      </w:r>
-      <w:r>
-        <w:t xml:space="preserve"> produces the expected plateau at relative error 8.7 × 10⁻⁶, confirming that the assembled </w:t>
-      </w:r>
-      <w:r>
-        <w:rPr>
-          <w:i/>
-        </w:rPr>
-        <w:t xml:space="preserve">G(h)</w:t>
-      </w:r>
-      <w:r>
-        <w:t xml:space="preserve"> is the Hessian of the model's own divergence rather than an unrelated quadratic form.</w:t>
+        <w:t xml:space="preserve">In absolute terms the cost is modest at the working dimension and rises steeply beyond it: a full sectional-curvature evaluation takes about 2.6 s per state at </w:t>
+      </w:r>
+      <w:r>
+        <w:rPr>
+          <w:i/>
+        </w:rPr>
+        <w:t xml:space="preserve">k</w:t>
+      </w:r>
+      <w:r>
+        <w:t xml:space="preserve"> = 5 and about 46 s at </w:t>
+      </w:r>
+      <w:r>
+        <w:rPr>
+          <w:i/>
+        </w:rPr>
+        <w:t xml:space="preserve">k</w:t>
+      </w:r>
+      <w:r>
+        <w:t xml:space="preserve"> = 8, which is why the sweep is reported at </w:t>
+      </w:r>
+      <w:r>
+        <w:rPr>
+          <w:i/>
+        </w:rPr>
+        <w:t xml:space="preserve">k</w:t>
+      </w:r>
+      <w:r>
+        <w:t xml:space="preserve"> = 4 to 6. The metric itself, being closed-form, is negligible by comparison; the expense is entirely in the second derivatives. This matters for the recommendation in Section VI, since it is precisely the expensive quantity that turns out to carry the signal.</w:t>
       </w:r>
     </w:p>
     <w:p>
@@ -1914,6 +1260,885 @@
         <w:jc w:val="both"/>
       </w:pPr>
       <w:r>
+        <w:t xml:space="preserve">Measurements are taken on GPT-2 [18], Pythia-70M and Pythia-160M [19], LLaMA-160M and SmolLM2-135M, spanning both normalisation schemes, tied and untied embeddings, depths from 6 to 30 layers and widths from 512 to 768. Text is drawn from WikiText-2 [20] and from hand-written probe sentences; the sense-disambiguation probe of Section V.F follows the design of the word-in-context task [21].</w:t>
+      </w:r>
+    </w:p>
+    <w:p>
+      <w:pPr>
+        <w:pStyle w:val="Heading1"/>
+      </w:pPr>
+      <w:r>
+        <w:t xml:space="preserve">Validation</w:t>
+      </w:r>
+    </w:p>
+    <w:p>
+      <w:pPr>
+        <w:pStyle w:val="BodyText"/>
+        <w:jc w:val="both"/>
+      </w:pPr>
+      <w:r>
+        <w:t xml:space="preserve">Intrinsic curvature is expensive, silent when wrong, and plausible either way. Validation therefore precedes results and is reported in full.</w:t>
+      </w:r>
+    </w:p>
+    <w:p>
+      <w:pPr>
+        <w:pStyle w:val="Heading2"/>
+      </w:pPr>
+      <w:r>
+        <w:t xml:space="preserve">The ladder</w:t>
+      </w:r>
+    </w:p>
+    <w:p>
+      <w:pPr>
+        <w:pStyle w:val="BodyText"/>
+        <w:jc w:val="both"/>
+      </w:pPr>
+      <w:r>
+        <w:t xml:space="preserve">Seven manifolds with analytically known curvature are run through the same code path used for the transformer. Table II reports the outcome.</w:t>
+      </w:r>
+    </w:p>
+    <w:p>
+      <w:pPr>
+        <w:pStyle w:val="tablehead"/>
+        <w:jc w:val="center"/>
+      </w:pPr>
+      <w:r>
+        <w:t xml:space="preserve">VALIDATION LADDER</w:t>
+      </w:r>
+    </w:p>
+    <w:tbl>
+      <w:tblPr>
+        <w:tblW w:w="4896" w:type="dxa"/>
+        <w:tblBorders>
+          <w:top w:val="single" w:sz="6" w:space="0" w:color="000000"/>
+          <w:left w:val="single" w:sz="6" w:space="0" w:color="000000"/>
+          <w:bottom w:val="single" w:sz="6" w:space="0" w:color="000000"/>
+          <w:right w:val="single" w:sz="6" w:space="0" w:color="000000"/>
+          <w:insideH w:val="single" w:sz="6" w:space="0" w:color="000000"/>
+          <w:insideV w:val="single" w:sz="6" w:space="0" w:color="000000"/>
+        </w:tblBorders>
+        <w:tblLayout w:type="fixed"/>
+      </w:tblPr>
+      <w:tblGrid>
+        <w:gridCol w:w="979"/>
+        <w:gridCol w:w="979"/>
+        <w:gridCol w:w="979"/>
+        <w:gridCol w:w="979"/>
+        <w:gridCol w:w="979"/>
+      </w:tblGrid>
+      <w:tr>
+        <w:trPr>
+          <w:cantSplit/>
+          <w:tblHeader/>
+        </w:trPr>
+        <w:tc>
+          <w:tcPr>
+            <w:tcW w:w="979" w:type="dxa"/>
+            <w:vAlign w:val="center"/>
+          </w:tcPr>
+          <w:p>
+            <w:pPr>
+              <w:pStyle w:val="tablecolhead"/>
+              <w:jc w:val="center"/>
+              <w:spacing w:before="20" w:after="20"/>
+            </w:pPr>
+            <w:r>
+              <w:t xml:space="preserve">rung</w:t>
+            </w:r>
+          </w:p>
+        </w:tc>
+        <w:tc>
+          <w:tcPr>
+            <w:tcW w:w="979" w:type="dxa"/>
+            <w:vAlign w:val="center"/>
+          </w:tcPr>
+          <w:p>
+            <w:pPr>
+              <w:pStyle w:val="tablecolhead"/>
+              <w:jc w:val="center"/>
+              <w:spacing w:before="20" w:after="20"/>
+            </w:pPr>
+            <w:r>
+              <w:t xml:space="preserve">manifold</w:t>
+            </w:r>
+          </w:p>
+        </w:tc>
+        <w:tc>
+          <w:tcPr>
+            <w:tcW w:w="979" w:type="dxa"/>
+            <w:vAlign w:val="center"/>
+          </w:tcPr>
+          <w:p>
+            <w:pPr>
+              <w:pStyle w:val="tablecolhead"/>
+              <w:jc w:val="center"/>
+              <w:spacing w:before="20" w:after="20"/>
+            </w:pPr>
+            <w:r>
+              <w:t xml:space="preserve">expected</w:t>
+            </w:r>
+          </w:p>
+        </w:tc>
+        <w:tc>
+          <w:tcPr>
+            <w:tcW w:w="979" w:type="dxa"/>
+            <w:vAlign w:val="center"/>
+          </w:tcPr>
+          <w:p>
+            <w:pPr>
+              <w:pStyle w:val="tablecolhead"/>
+              <w:jc w:val="center"/>
+              <w:spacing w:before="20" w:after="20"/>
+            </w:pPr>
+            <w:r>
+              <w:t xml:space="preserve">measured</w:t>
+            </w:r>
+          </w:p>
+        </w:tc>
+        <w:tc>
+          <w:tcPr>
+            <w:tcW w:w="979" w:type="dxa"/>
+            <w:vAlign w:val="center"/>
+          </w:tcPr>
+          <w:p>
+            <w:pPr>
+              <w:pStyle w:val="tablecolhead"/>
+              <w:jc w:val="center"/>
+              <w:spacing w:before="20" w:after="20"/>
+            </w:pPr>
+            <w:r>
+              <w:t xml:space="preserve">worst error</w:t>
+            </w:r>
+          </w:p>
+        </w:tc>
+      </w:tr>
+      <w:tr>
+        <w:trPr>
+          <w:cantSplit/>
+        </w:trPr>
+        <w:tc>
+          <w:tcPr>
+            <w:tcW w:w="979" w:type="dxa"/>
+            <w:vAlign w:val="center"/>
+          </w:tcPr>
+          <w:p>
+            <w:pPr>
+              <w:pStyle w:val="tablecopy"/>
+              <w:jc w:val="left"/>
+              <w:spacing w:before="20" w:after="20"/>
+            </w:pPr>
+            <w:r>
+              <w:t xml:space="preserve">1</w:t>
+            </w:r>
+          </w:p>
+        </w:tc>
+        <w:tc>
+          <w:tcPr>
+            <w:tcW w:w="979" w:type="dxa"/>
+            <w:vAlign w:val="center"/>
+          </w:tcPr>
+          <w:p>
+            <w:pPr>
+              <w:pStyle w:val="tablecopy"/>
+              <w:jc w:val="center"/>
+              <w:spacing w:before="20" w:after="20"/>
+            </w:pPr>
+            <w:r>
+              <w:t xml:space="preserve">Sphere, radius 2</w:t>
+            </w:r>
+          </w:p>
+        </w:tc>
+        <w:tc>
+          <w:tcPr>
+            <w:tcW w:w="979" w:type="dxa"/>
+            <w:vAlign w:val="center"/>
+          </w:tcPr>
+          <w:p>
+            <w:pPr>
+              <w:pStyle w:val="tablecopy"/>
+              <w:jc w:val="center"/>
+              <w:spacing w:before="20" w:after="20"/>
+            </w:pPr>
+            <w:r>
+              <w:t xml:space="preserve">K = +1/4</w:t>
+            </w:r>
+          </w:p>
+        </w:tc>
+        <w:tc>
+          <w:tcPr>
+            <w:tcW w:w="979" w:type="dxa"/>
+            <w:vAlign w:val="center"/>
+          </w:tcPr>
+          <w:p>
+            <w:pPr>
+              <w:pStyle w:val="tablecopy"/>
+              <w:jc w:val="center"/>
+              <w:spacing w:before="20" w:after="20"/>
+            </w:pPr>
+            <w:r>
+              <w:t xml:space="preserve">+0.250000</w:t>
+            </w:r>
+          </w:p>
+        </w:tc>
+        <w:tc>
+          <w:tcPr>
+            <w:tcW w:w="979" w:type="dxa"/>
+            <w:vAlign w:val="center"/>
+          </w:tcPr>
+          <w:p>
+            <w:pPr>
+              <w:pStyle w:val="tablecopy"/>
+              <w:jc w:val="center"/>
+              <w:spacing w:before="20" w:after="20"/>
+            </w:pPr>
+            <w:r>
+              <w:t xml:space="preserve">1.8 × 10⁻¹⁵</w:t>
+            </w:r>
+          </w:p>
+        </w:tc>
+      </w:tr>
+      <w:tr>
+        <w:trPr>
+          <w:cantSplit/>
+        </w:trPr>
+        <w:tc>
+          <w:tcPr>
+            <w:tcW w:w="979" w:type="dxa"/>
+            <w:vAlign w:val="center"/>
+          </w:tcPr>
+          <w:p>
+            <w:pPr>
+              <w:pStyle w:val="tablecopy"/>
+              <w:jc w:val="left"/>
+              <w:spacing w:before="20" w:after="20"/>
+            </w:pPr>
+            <w:r>
+              <w:t xml:space="preserve">2</w:t>
+            </w:r>
+          </w:p>
+        </w:tc>
+        <w:tc>
+          <w:tcPr>
+            <w:tcW w:w="979" w:type="dxa"/>
+            <w:vAlign w:val="center"/>
+          </w:tcPr>
+          <w:p>
+            <w:pPr>
+              <w:pStyle w:val="tablecopy"/>
+              <w:jc w:val="center"/>
+              <w:spacing w:before="20" w:after="20"/>
+            </w:pPr>
+            <w:r>
+              <w:t xml:space="preserve">Poincaré half-plane</w:t>
+            </w:r>
+          </w:p>
+        </w:tc>
+        <w:tc>
+          <w:tcPr>
+            <w:tcW w:w="979" w:type="dxa"/>
+            <w:vAlign w:val="center"/>
+          </w:tcPr>
+          <w:p>
+            <w:pPr>
+              <w:pStyle w:val="tablecopy"/>
+              <w:jc w:val="center"/>
+              <w:spacing w:before="20" w:after="20"/>
+            </w:pPr>
+            <w:r>
+              <w:t xml:space="preserve">K = −1</w:t>
+            </w:r>
+          </w:p>
+        </w:tc>
+        <w:tc>
+          <w:tcPr>
+            <w:tcW w:w="979" w:type="dxa"/>
+            <w:vAlign w:val="center"/>
+          </w:tcPr>
+          <w:p>
+            <w:pPr>
+              <w:pStyle w:val="tablecopy"/>
+              <w:jc w:val="center"/>
+              <w:spacing w:before="20" w:after="20"/>
+            </w:pPr>
+            <w:r>
+              <w:t xml:space="preserve">−1.000000</w:t>
+            </w:r>
+          </w:p>
+        </w:tc>
+        <w:tc>
+          <w:tcPr>
+            <w:tcW w:w="979" w:type="dxa"/>
+            <w:vAlign w:val="center"/>
+          </w:tcPr>
+          <w:p>
+            <w:pPr>
+              <w:pStyle w:val="tablecopy"/>
+              <w:jc w:val="center"/>
+              <w:spacing w:before="20" w:after="20"/>
+            </w:pPr>
+            <w:r>
+              <w:t xml:space="preserve">1.0 × 10⁻¹³</w:t>
+            </w:r>
+          </w:p>
+        </w:tc>
+      </w:tr>
+      <w:tr>
+        <w:trPr>
+          <w:cantSplit/>
+        </w:trPr>
+        <w:tc>
+          <w:tcPr>
+            <w:tcW w:w="979" w:type="dxa"/>
+            <w:vAlign w:val="center"/>
+          </w:tcPr>
+          <w:p>
+            <w:pPr>
+              <w:pStyle w:val="tablecopy"/>
+              <w:jc w:val="left"/>
+              <w:spacing w:before="20" w:after="20"/>
+            </w:pPr>
+            <w:r>
+              <w:t xml:space="preserve">3</w:t>
+            </w:r>
+          </w:p>
+        </w:tc>
+        <w:tc>
+          <w:tcPr>
+            <w:tcW w:w="979" w:type="dxa"/>
+            <w:vAlign w:val="center"/>
+          </w:tcPr>
+          <w:p>
+            <w:pPr>
+              <w:pStyle w:val="tablecopy"/>
+              <w:jc w:val="center"/>
+              <w:spacing w:before="20" w:after="20"/>
+            </w:pPr>
+            <w:r>
+              <w:t xml:space="preserve">Categorical simplex</w:t>
+            </w:r>
+          </w:p>
+        </w:tc>
+        <w:tc>
+          <w:tcPr>
+            <w:tcW w:w="979" w:type="dxa"/>
+            <w:vAlign w:val="center"/>
+          </w:tcPr>
+          <w:p>
+            <w:pPr>
+              <w:pStyle w:val="tablecopy"/>
+              <w:jc w:val="center"/>
+              <w:spacing w:before="20" w:after="20"/>
+            </w:pPr>
+            <w:r>
+              <w:t xml:space="preserve">K = +1/4</w:t>
+            </w:r>
+          </w:p>
+        </w:tc>
+        <w:tc>
+          <w:tcPr>
+            <w:tcW w:w="979" w:type="dxa"/>
+            <w:vAlign w:val="center"/>
+          </w:tcPr>
+          <w:p>
+            <w:pPr>
+              <w:pStyle w:val="tablecopy"/>
+              <w:jc w:val="center"/>
+              <w:spacing w:before="20" w:after="20"/>
+            </w:pPr>
+            <w:r>
+              <w:t xml:space="preserve">+0.250000</w:t>
+            </w:r>
+          </w:p>
+        </w:tc>
+        <w:tc>
+          <w:tcPr>
+            <w:tcW w:w="979" w:type="dxa"/>
+            <w:vAlign w:val="center"/>
+          </w:tcPr>
+          <w:p>
+            <w:pPr>
+              <w:pStyle w:val="tablecopy"/>
+              <w:jc w:val="center"/>
+              <w:spacing w:before="20" w:after="20"/>
+            </w:pPr>
+            <w:r>
+              <w:t xml:space="preserve">6.6 × 10⁻¹⁰</w:t>
+            </w:r>
+          </w:p>
+        </w:tc>
+      </w:tr>
+      <w:tr>
+        <w:trPr>
+          <w:cantSplit/>
+        </w:trPr>
+        <w:tc>
+          <w:tcPr>
+            <w:tcW w:w="979" w:type="dxa"/>
+            <w:vAlign w:val="center"/>
+          </w:tcPr>
+          <w:p>
+            <w:pPr>
+              <w:pStyle w:val="tablecopy"/>
+              <w:jc w:val="left"/>
+              <w:spacing w:before="20" w:after="20"/>
+            </w:pPr>
+            <w:r>
+              <w:t xml:space="preserve">4</w:t>
+            </w:r>
+          </w:p>
+        </w:tc>
+        <w:tc>
+          <w:tcPr>
+            <w:tcW w:w="979" w:type="dxa"/>
+            <w:vAlign w:val="center"/>
+          </w:tcPr>
+          <w:p>
+            <w:pPr>
+              <w:pStyle w:val="tablecopy"/>
+              <w:jc w:val="center"/>
+              <w:spacing w:before="20" w:after="20"/>
+            </w:pPr>
+            <w:r>
+              <w:t xml:space="preserve">Gamma family</w:t>
+            </w:r>
+          </w:p>
+        </w:tc>
+        <w:tc>
+          <w:tcPr>
+            <w:tcW w:w="979" w:type="dxa"/>
+            <w:vAlign w:val="center"/>
+          </w:tcPr>
+          <w:p>
+            <w:pPr>
+              <w:pStyle w:val="tablecopy"/>
+              <w:jc w:val="center"/>
+              <w:spacing w:before="20" w:after="20"/>
+            </w:pPr>
+            <w:r>
+              <w:t xml:space="preserve">negative</w:t>
+            </w:r>
+          </w:p>
+        </w:tc>
+        <w:tc>
+          <w:tcPr>
+            <w:tcW w:w="979" w:type="dxa"/>
+            <w:vAlign w:val="center"/>
+          </w:tcPr>
+          <w:p>
+            <w:pPr>
+              <w:pStyle w:val="tablecopy"/>
+              <w:jc w:val="center"/>
+              <w:spacing w:before="20" w:after="20"/>
+            </w:pPr>
+            <w:r>
+              <w:t xml:space="preserve">−0.463903</w:t>
+            </w:r>
+          </w:p>
+        </w:tc>
+        <w:tc>
+          <w:tcPr>
+            <w:tcW w:w="979" w:type="dxa"/>
+            <w:vAlign w:val="center"/>
+          </w:tcPr>
+          <w:p>
+            <w:pPr>
+              <w:pStyle w:val="tablecopy"/>
+              <w:jc w:val="center"/>
+              <w:spacing w:before="20" w:after="20"/>
+            </w:pPr>
+            <w:r>
+              <w:t xml:space="preserve">2.3 × 10⁻¹³ *</w:t>
+            </w:r>
+          </w:p>
+        </w:tc>
+      </w:tr>
+      <w:tr>
+        <w:trPr>
+          <w:cantSplit/>
+        </w:trPr>
+        <w:tc>
+          <w:tcPr>
+            <w:tcW w:w="979" w:type="dxa"/>
+            <w:vAlign w:val="center"/>
+          </w:tcPr>
+          <w:p>
+            <w:pPr>
+              <w:pStyle w:val="tablecopy"/>
+              <w:jc w:val="left"/>
+              <w:spacing w:before="20" w:after="20"/>
+            </w:pPr>
+            <w:r>
+              <w:t xml:space="preserve">5</w:t>
+            </w:r>
+          </w:p>
+        </w:tc>
+        <w:tc>
+          <w:tcPr>
+            <w:tcW w:w="979" w:type="dxa"/>
+            <w:vAlign w:val="center"/>
+          </w:tcPr>
+          <w:p>
+            <w:pPr>
+              <w:pStyle w:val="tablecopy"/>
+              <w:jc w:val="center"/>
+              <w:spacing w:before="20" w:after="20"/>
+            </w:pPr>
+            <w:r>
+              <w:t xml:space="preserve">Beta family</w:t>
+            </w:r>
+          </w:p>
+        </w:tc>
+        <w:tc>
+          <w:tcPr>
+            <w:tcW w:w="979" w:type="dxa"/>
+            <w:vAlign w:val="center"/>
+          </w:tcPr>
+          <w:p>
+            <w:pPr>
+              <w:pStyle w:val="tablecopy"/>
+              <w:jc w:val="center"/>
+              <w:spacing w:before="20" w:after="20"/>
+            </w:pPr>
+            <w:r>
+              <w:t xml:space="preserve">negative</w:t>
+            </w:r>
+          </w:p>
+        </w:tc>
+        <w:tc>
+          <w:tcPr>
+            <w:tcW w:w="979" w:type="dxa"/>
+            <w:vAlign w:val="center"/>
+          </w:tcPr>
+          <w:p>
+            <w:pPr>
+              <w:pStyle w:val="tablecopy"/>
+              <w:jc w:val="center"/>
+              <w:spacing w:before="20" w:after="20"/>
+            </w:pPr>
+            <w:r>
+              <w:t xml:space="preserve">−0.456795</w:t>
+            </w:r>
+          </w:p>
+        </w:tc>
+        <w:tc>
+          <w:tcPr>
+            <w:tcW w:w="979" w:type="dxa"/>
+            <w:vAlign w:val="center"/>
+          </w:tcPr>
+          <w:p>
+            <w:pPr>
+              <w:pStyle w:val="tablecopy"/>
+              <w:jc w:val="center"/>
+              <w:spacing w:before="20" w:after="20"/>
+            </w:pPr>
+            <w:r>
+              <w:t xml:space="preserve">4.9 × 10⁻¹⁴ *</w:t>
+            </w:r>
+          </w:p>
+        </w:tc>
+      </w:tr>
+      <w:tr>
+        <w:trPr>
+          <w:cantSplit/>
+        </w:trPr>
+        <w:tc>
+          <w:tcPr>
+            <w:tcW w:w="979" w:type="dxa"/>
+            <w:vAlign w:val="center"/>
+          </w:tcPr>
+          <w:p>
+            <w:pPr>
+              <w:pStyle w:val="tablecopy"/>
+              <w:jc w:val="left"/>
+              <w:spacing w:before="20" w:after="20"/>
+            </w:pPr>
+            <w:r>
+              <w:t xml:space="preserve">6</w:t>
+            </w:r>
+          </w:p>
+        </w:tc>
+        <w:tc>
+          <w:tcPr>
+            <w:tcW w:w="979" w:type="dxa"/>
+            <w:vAlign w:val="center"/>
+          </w:tcPr>
+          <w:p>
+            <w:pPr>
+              <w:pStyle w:val="tablecopy"/>
+              <w:jc w:val="center"/>
+              <w:spacing w:before="20" w:after="20"/>
+            </w:pPr>
+            <w:r>
+              <w:t xml:space="preserve">Univariate Gaussian</w:t>
+            </w:r>
+          </w:p>
+        </w:tc>
+        <w:tc>
+          <w:tcPr>
+            <w:tcW w:w="979" w:type="dxa"/>
+            <w:vAlign w:val="center"/>
+          </w:tcPr>
+          <w:p>
+            <w:pPr>
+              <w:pStyle w:val="tablecopy"/>
+              <w:jc w:val="center"/>
+              <w:spacing w:before="20" w:after="20"/>
+            </w:pPr>
+            <w:r>
+              <w:t xml:space="preserve">K = −1/2</w:t>
+            </w:r>
+          </w:p>
+        </w:tc>
+        <w:tc>
+          <w:tcPr>
+            <w:tcW w:w="979" w:type="dxa"/>
+            <w:vAlign w:val="center"/>
+          </w:tcPr>
+          <w:p>
+            <w:pPr>
+              <w:pStyle w:val="tablecopy"/>
+              <w:jc w:val="center"/>
+              <w:spacing w:before="20" w:after="20"/>
+            </w:pPr>
+            <w:r>
+              <w:t xml:space="preserve">−0.500000</w:t>
+            </w:r>
+          </w:p>
+        </w:tc>
+        <w:tc>
+          <w:tcPr>
+            <w:tcW w:w="979" w:type="dxa"/>
+            <w:vAlign w:val="center"/>
+          </w:tcPr>
+          <w:p>
+            <w:pPr>
+              <w:pStyle w:val="tablecopy"/>
+              <w:jc w:val="center"/>
+              <w:spacing w:before="20" w:after="20"/>
+            </w:pPr>
+            <w:r>
+              <w:t xml:space="preserve">2.6 × 10⁻¹⁵</w:t>
+            </w:r>
+          </w:p>
+        </w:tc>
+      </w:tr>
+      <w:tr>
+        <w:trPr>
+          <w:cantSplit/>
+        </w:trPr>
+        <w:tc>
+          <w:tcPr>
+            <w:tcW w:w="979" w:type="dxa"/>
+            <w:vAlign w:val="center"/>
+          </w:tcPr>
+          <w:p>
+            <w:pPr>
+              <w:pStyle w:val="tablecopy"/>
+              <w:jc w:val="left"/>
+              <w:spacing w:before="20" w:after="20"/>
+            </w:pPr>
+            <w:r>
+              <w:t xml:space="preserve">7</w:t>
+            </w:r>
+          </w:p>
+        </w:tc>
+        <w:tc>
+          <w:tcPr>
+            <w:tcW w:w="979" w:type="dxa"/>
+            <w:vAlign w:val="center"/>
+          </w:tcPr>
+          <w:p>
+            <w:pPr>
+              <w:pStyle w:val="tablecopy"/>
+              <w:jc w:val="center"/>
+              <w:spacing w:before="20" w:after="20"/>
+            </w:pPr>
+            <w:r>
+              <w:t xml:space="preserve">Synthetic pullback</w:t>
+            </w:r>
+          </w:p>
+        </w:tc>
+        <w:tc>
+          <w:tcPr>
+            <w:tcW w:w="979" w:type="dxa"/>
+            <w:vAlign w:val="center"/>
+          </w:tcPr>
+          <w:p>
+            <w:pPr>
+              <w:pStyle w:val="tablecopy"/>
+              <w:jc w:val="center"/>
+              <w:spacing w:before="20" w:after="20"/>
+            </w:pPr>
+            <w:r>
+              <w:t xml:space="preserve">K = +1/4</w:t>
+            </w:r>
+          </w:p>
+        </w:tc>
+        <w:tc>
+          <w:tcPr>
+            <w:tcW w:w="979" w:type="dxa"/>
+            <w:vAlign w:val="center"/>
+          </w:tcPr>
+          <w:p>
+            <w:pPr>
+              <w:pStyle w:val="tablecopy"/>
+              <w:jc w:val="center"/>
+              <w:spacing w:before="20" w:after="20"/>
+            </w:pPr>
+            <w:r>
+              <w:t xml:space="preserve">+0.250000</w:t>
+            </w:r>
+          </w:p>
+        </w:tc>
+        <w:tc>
+          <w:tcPr>
+            <w:tcW w:w="979" w:type="dxa"/>
+            <w:vAlign w:val="center"/>
+          </w:tcPr>
+          <w:p>
+            <w:pPr>
+              <w:pStyle w:val="tablecopy"/>
+              <w:jc w:val="center"/>
+              <w:spacing w:before="20" w:after="20"/>
+            </w:pPr>
+            <w:r>
+              <w:t xml:space="preserve">9.7 × 10⁻¹²</w:t>
+            </w:r>
+          </w:p>
+        </w:tc>
+      </w:tr>
+    </w:tbl>
+    <w:p>
+      <w:pPr>
+        <w:pStyle w:val="BodyText"/>
+        <w:jc w:val="both"/>
+      </w:pPr>
+      <w:r>
+        <w:t xml:space="preserve">Errors are worst-case over twelve random base points and random 2-planes per rung. Rungs 4 and 5 have no closed-form constant, so the starred entries are worst-case disagreement with the independent library of Section III.B rather than with an analytic value; the claim tested for those two families is that the curvature is everywhere negative, and it is.</w:t>
+      </w:r>
+    </w:p>
+    <w:p>
+      <w:pPr>
+        <w:pStyle w:val="BodyText"/>
+        <w:jc w:val="both"/>
+      </w:pPr>
+      <w:r>
+        <w:t xml:space="preserve">Rung 3 is load-bearing: the categorical simplex under the full Fisher–Rao metric is isometric to the positive orthant of a radius-2 sphere and so has constant </w:t>
+      </w:r>
+      <w:r>
+        <w:rPr>
+          <w:i/>
+        </w:rPr>
+        <w:t xml:space="preserve">K = +1/4</w:t>
+      </w:r>
+      <w:r>
+        <w:t xml:space="preserve">. It is the same metric family as the object under study.</w:t>
+      </w:r>
+    </w:p>
+    <w:p>
+      <w:pPr>
+        <w:pStyle w:val="BodyText"/>
+        <w:jc w:val="both"/>
+      </w:pPr>
+      <w:r>
+        <w:t xml:space="preserve">Rung 7 validates the assembly of (1) specifically, which no other rung does. With a synthetic linear model </w:t>
+      </w:r>
+      <w:r>
+        <w:rPr>
+          <w:i/>
+        </w:rPr>
+        <w:t xml:space="preserve">p(h) = softmax(U h)</w:t>
+      </w:r>
+      <w:r>
+        <w:t xml:space="preserve"> and </w:t>
+      </w:r>
+      <w:r>
+        <w:rPr>
+          <w:i/>
+        </w:rPr>
+        <w:t xml:space="preserve">d = N − 1</w:t>
+      </w:r>
+      <w:r>
+        <w:t xml:space="preserve">, the map </w:t>
+      </w:r>
+      <w:r>
+        <w:rPr>
+          <w:i/>
+        </w:rPr>
+        <w:t xml:space="preserve">h → p</w:t>
+      </w:r>
+      <w:r>
+        <w:t xml:space="preserve"> is a diffeomorphism onto the simplex interior, so the pullback metric is the simplex metric in different coordinates and the curvature must be exactly +1/4 for every valid </w:t>
+      </w:r>
+      <w:r>
+        <w:rPr>
+          <w:i/>
+        </w:rPr>
+        <w:t xml:space="preserve">U</w:t>
+      </w:r>
+      <w:r>
+        <w:t xml:space="preserve">. Three further checks accompany it: reparameterisation invariance under </w:t>
+      </w:r>
+      <w:r>
+        <w:rPr>
+          <w:i/>
+        </w:rPr>
+        <w:t xml:space="preserve">U → UM</w:t>
+      </w:r>
+      <w:r>
+        <w:t xml:space="preserve">, to which curvature must be blind (worst error 1.9 × 10⁻¹¹); scalar curvature </w:t>
+      </w:r>
+      <w:r>
+        <w:rPr>
+          <w:i/>
+        </w:rPr>
+        <w:t xml:space="preserve">R = k(k−1)/4</w:t>
+      </w:r>
+      <w:r>
+        <w:t xml:space="preserve"> recovered through the pullback (4.9 × 10⁻¹²); and a deliberately broken assembly, with the outer-product term of (1) dropped, which must fail and does, at 0.263. A test that cannot fail carries no information.</w:t>
+      </w:r>
+    </w:p>
+    <w:p>
+      <w:pPr>
+        <w:pStyle w:val="Heading2"/>
+      </w:pPr>
+      <w:r>
+        <w:t xml:space="preserve">The Hessian identity and an independent implementation</w:t>
+      </w:r>
+    </w:p>
+    <w:p>
+      <w:pPr>
+        <w:pStyle w:val="BodyText"/>
+        <w:jc w:val="both"/>
+      </w:pPr>
+      <w:r>
+        <w:t xml:space="preserve">Equation (2) was verified on a real model through a separate code path. Sweeping </w:t>
+      </w:r>
+      <w:r>
+        <w:rPr>
+          <w:i/>
+        </w:rPr>
+        <w:t xml:space="preserve">ε</w:t>
+      </w:r>
+      <w:r>
+        <w:t xml:space="preserve"> produces the expected plateau at relative error 8.7 × 10⁻⁶, confirming that the assembled </w:t>
+      </w:r>
+      <w:r>
+        <w:rPr>
+          <w:i/>
+        </w:rPr>
+        <w:t xml:space="preserve">G(h)</w:t>
+      </w:r>
+      <w:r>
+        <w:t xml:space="preserve"> is the Hessian of the model's own divergence rather than an unrelated quadratic form.</w:t>
+      </w:r>
+    </w:p>
+    <w:p>
+      <w:pPr>
+        <w:pStyle w:val="BodyText"/>
+        <w:jc w:val="both"/>
+      </w:pPr>
+      <w:r>
         <w:t xml:space="preserve">Rungs 2 to 6 were additionally re-run against the </w:t>
       </w:r>
       <w:r>
@@ -1923,7 +2148,7 @@
         <w:t xml:space="preserve">information_geometry</w:t>
       </w:r>
       <w:r>
-        <w:t xml:space="preserve"> module of an independently implemented, peer-reviewed library [22] on identical inputs. Three families agree at machine precision across eight comparisons: univariate normal to 1.1 × 10⁻¹⁶, gamma to 2.5 × 10⁻¹⁴ and beta to 3.2 × 10⁻¹⁴, the last two being exactly the rungs added for this cross-check. On the two families where the libraries differ, the diagnostic applied was to compare the </w:t>
+        <w:t xml:space="preserve"> module of an independently implemented, peer-reviewed library [22] on identical inputs. Three families agree at machine precision across eight comparisons: univariate normal to 2.2 × 10⁻¹⁶, gamma to 2.3 × 10⁻¹³ and beta to 4.9 × 10⁻¹⁴ at worst, the last two being exactly the rungs added for this cross-check. On the two families where the libraries differ, the diagnostic applied was to compare the </w:t>
       </w:r>
       <w:r>
         <w:rPr>
@@ -2099,7 +2324,7 @@
         <w:drawing>
           <wp:inline distT="0" distB="0" distL="0" distR="0">
             <wp:extent cx="3108960" cy="2139445"/>
-            <wp:docPr id="8085" name="fig1_curvature.png"/>
+            <wp:docPr id="8047" name="fig1_curvature.png"/>
             <a:graphic xmlns:a="http://schemas.openxmlformats.org/drawingml/2006/main">
               <a:graphicData uri="http://schemas.openxmlformats.org/drawingml/2006/picture">
                 <pic:pic xmlns:pic="http://schemas.openxmlformats.org/drawingml/2006/picture">
@@ -2191,7 +2416,7 @@
         <w:drawing>
           <wp:inline distT="0" distB="0" distL="0" distR="0">
             <wp:extent cx="3108960" cy="3902418"/>
-            <wp:docPr id="6467" name="fig2_split.png"/>
+            <wp:docPr id="8637" name="fig2_split.png"/>
             <a:graphic xmlns:a="http://schemas.openxmlformats.org/drawingml/2006/main">
               <a:graphicData uri="http://schemas.openxmlformats.org/drawingml/2006/picture">
                 <pic:pic xmlns:pic="http://schemas.openxmlformats.org/drawingml/2006/picture">
@@ -3795,7 +4020,7 @@
         <w:jc w:val="both"/>
       </w:pPr>
       <w:r>
-        <w:t xml:space="preserve">The learned assignment does nearly all of the work through the middle of the network, where under 3 % of the curvature survives its destruction, and least at the two ends. That pattern matches what the two ends are doing: at layer 1 the context has barely been integrated, so there is less learned assignment to destroy, while by layer 30 the prediction is close to committed and concentration alone fixes much of the geometry. The direction of the effect is unanimous or near-unanimous at every layer, so the depth dependence is one of magnitude rather than of sign.</w:t>
+        <w:t xml:space="preserve">The learned assignment does nearly all of the work through the first two thirds of the network: under 3 % of the curvature survives its destruction at every layer up to 15, and at layers 20 and 25 the scrambled value is driven negative outright. It does least at the two ends. That pattern matches what the two ends are doing: at layer 1 the context has barely been integrated, so there is less learned assignment to destroy, while by layer 30 the prediction is close to committed and concentration alone fixes much of the geometry. The direction of the effect is unanimous or near-unanimous at every layer, so the depth dependence is one of magnitude rather than of sign.</w:t>
       </w:r>
     </w:p>
     <w:p>
@@ -4386,7 +4611,7 @@
         <w:jc w:val="both"/>
       </w:pPr>
       <w:r>
-        <w:t xml:space="preserve">This is the most informative single comparison in the study. It shows that the learned token-to-direction assignment does not simply contribute curvature on top of whatever concentration provides; it </w:t>
+        <w:t xml:space="preserve">This is the most informative single comparison in the study. The learned assignment does not simply contribute curvature on top of whatever concentration provides; it </w:t>
       </w:r>
       <w:r>
         <w:rPr>
@@ -4395,7 +4620,7 @@
         <w:t xml:space="preserve">holds the manifold at the ambient simplex value irrespective of how concentrated the prediction is</w:t>
       </w:r>
       <w:r>
-        <w:t xml:space="preserve">. Concentration alone produces a geometry that varies wildly with the entropy of the prediction. The trained assignment removes that dependence. The effect is also strongest exactly where it should be if this reading is correct — in the low-entropy bands, where 35 of 38 and 36 of 37 states move in the same direction — because a concentrated </w:t>
+        <w:t xml:space="preserve">. Concentration alone produces a geometry that varies wildly with predictive entropy, and the trained assignment removes that dependence. The effect is strongest where it should be if this reading is correct — in the low-entropy bands, 35 of 38 and 36 of 37 — because a concentrated </w:t>
       </w:r>
       <w:r>
         <w:rPr>
@@ -4421,7 +4646,7 @@
         <w:jc w:val="both"/>
       </w:pPr>
       <w:r>
-        <w:t xml:space="preserve">If the intrinsic curvature and the published proxies were reading the same underlying property, they would correlate. Computed at the same 360 states, they do not: the largest absolute rank correlation between any two different instrument families is 0.248, and the pairs involving intrinsic curvature fall at or below 0.144. By contrast the two intrinsic quantities computed here, sectional </w:t>
+        <w:t xml:space="preserve">If the intrinsic curvature and the published proxies were reading the same underlying property, they would correlate. Computed at 360 sampled states, pairwise complete, they do not: the largest absolute rank correlation between any two different instrument families is 0.248, and the pairs involving intrinsic curvature fall at or below 0.144. By contrast the two intrinsic quantities computed here, sectional </w:t>
       </w:r>
       <w:r>
         <w:rPr>
@@ -4925,7 +5150,7 @@
         <w:jc w:val="both"/>
       </w:pPr>
       <w:r>
-        <w:t xml:space="preserve">The Fisher–Rao geodesic distance separates a sense change from a matched context change by a factor of 2.03 at 30 of 32 pairs, and does so considerably more reliably than the unembedding metric used in the comparison literature, which reaches 1.71× at 23 of 32. On this particular probe a plain Euclidean distance performs comparably to Fisher–Rao. The probe therefore establishes that the metric is behaviourally meaningful, and the experiment that would separate it from Euclidean distance — perturbation along high-curvature directions at the disambiguation layer, testing whether the resolved sense flips — is identified as the natural next step.</w:t>
+        <w:t xml:space="preserve">The Fisher–Rao geodesic distance separates a sense change from a matched context change by a factor of 2.03 at 30 of 32 pairs, and considerably more reliably than the unembedding metric used in the comparison literature, which reaches 1.71× at 23 of 32. On this probe a plain Euclidean distance performs comparably to Fisher–Rao. The probe therefore establishes that the metric is behaviourally meaningful; separating it from Euclidean distance requires the causal experiment named in Section VI.</w:t>
       </w:r>
     </w:p>
     <w:p>
@@ -4954,7 +5179,7 @@
         <w:drawing>
           <wp:inline distT="0" distB="0" distL="0" distR="0">
             <wp:extent cx="3108960" cy="3223925"/>
-            <wp:docPr id="2724" name="fig3_threshold.png"/>
+            <wp:docPr id="3370" name="fig3_threshold.png"/>
             <a:graphic xmlns:a="http://schemas.openxmlformats.org/drawingml/2006/main">
               <a:graphicData uri="http://schemas.openxmlformats.org/drawingml/2006/picture">
                 <pic:pic xmlns:pic="http://schemas.openxmlformats.org/drawingml/2006/picture">
@@ -5094,7 +5319,7 @@
         <w:t xml:space="preserve">Future work follows directly from the separation.</w:t>
       </w:r>
       <w:r>
-        <w:t xml:space="preserve"> Three experiments are indicated. The first is the causal one: perturbing a state along its high-curvature directions at the layer where a sense is resolved, and testing whether the resolved sense flips. That would connect the geometric measurement to behaviour in the strongest available way, and Section V.F identifies it as the experiment this probe does not yet perform. The second is to apply the matched-entropy control of Section IV to an ambient nearest-neighbour intrinsic-dimension estimate, which would settle whether the published depth profile shares the character established here for the metric's spectrum. The third is scale: the models used here are 70M to 160M parameters, and repeating the measurement at 1B and above would test whether the simplex value and the separation both persist. A fourth and cheaper line is suggested by the minority of states carrying a negatively curved plane — 10.7 % of the sample — which have twice the effective dimension of the rest at indistinguishable predictive entropy. That is the one place where absolute curvature, rather than its response to a control, appears to carry model-specific information.</w:t>
+        <w:t xml:space="preserve"> The decisive experiment is causal: perturbing a state along its high-curvature directions at the layer where a sense is resolved, and testing whether the resolved sense flips. A second line is suggested by the minority of states carrying a negatively curved plane — 10.7 % of the sample — which have twice the effective dimension of the rest at indistinguishable predictive entropy. That is the one place where absolute curvature, rather than its response to a control, appears to carry model-specific information.</w:t>
       </w:r>
     </w:p>
     <w:p>
@@ -5150,7 +5375,7 @@
         <w:t xml:space="preserve">The `k` ≤ 8 ceiling.</w:t>
       </w:r>
       <w:r>
-        <w:t xml:space="preserve"> Riemann-derived quantities are computed on a slice of dimension 4 to 6 holding about 88 % of the metric's trace. The central result is stable across that range, but the slice remains a slice.</w:t>
+        <w:t xml:space="preserve"> Riemann-derived quantities are computed on a slice of dimension 4 to 6, holding a median 92 % to 97 % of the metric's trace. The central result is stable across that range, but the slice remains a slice.</w:t>
       </w:r>
     </w:p>
     <w:p>

</xml_diff>